<commit_message>
refactor: streamline state initialization and improve component styles
</commit_message>
<xml_diff>
--- a/public/templates/minutes-of-meeting.docx
+++ b/public/templates/minutes-of-meeting.docx
@@ -52,7 +52,7 @@
                     <a:blip r:embed="rId8">
                       <a:extLst>
                         <a:ext uri="{28A0092B-C50C-407E-A947-70E740481C1C}">
-                          <a14:useLocalDpi xmlns:a14="http://schemas.microsoft.com/office/drawing/2010/main" xmlns:wps="http://schemas.microsoft.com/office/word/2010/wordprocessingShape" xmlns:wpi="http://schemas.microsoft.com/office/word/2010/wordprocessingInk" xmlns:wpg="http://schemas.microsoft.com/office/word/2010/wordprocessingGroup" xmlns:w16se="http://schemas.microsoft.com/office/word/2015/wordml/symex" xmlns:w16sdtfl="http://schemas.microsoft.com/office/word/2024/wordml/sdtformatlock" xmlns:w16sdtdh="http://schemas.microsoft.com/office/word/2020/wordml/sdtdatahash" xmlns:w16du="http://schemas.microsoft.com/office/word/2023/wordml/word16du" xmlns:w16="http://schemas.microsoft.com/office/word/2018/wordml" xmlns:w16cid="http://schemas.microsoft.com/office/word/2016/wordml/cid" xmlns:w16cex="http://schemas.microsoft.com/office/word/2018/wordml/cex" xmlns:w15="http://schemas.microsoft.com/office/word/2012/wordml" xmlns:w14="http://schemas.microsoft.com/office/word/2010/wordml" xmlns:w="http://schemas.openxmlformats.org/wordprocessingml/2006/main" xmlns:w10="urn:schemas-microsoft-com:office:word" xmlns:wp14="http://schemas.microsoft.com/office/word/2010/wordprocessingDrawing" xmlns:v="urn:schemas-microsoft-com:vml" xmlns:oel="http://schemas.microsoft.com/office/2019/extlst" xmlns:o="urn:schemas-microsoft-com:office:office" xmlns:am3d="http://schemas.microsoft.com/office/drawing/2017/model3d" xmlns:aink="http://schemas.microsoft.com/office/drawing/2016/ink" xmlns:mc="http://schemas.openxmlformats.org/markup-compatibility/2006" xmlns:cx8="http://schemas.microsoft.com/office/drawing/2016/5/14/chartex" xmlns:cx7="http://schemas.microsoft.com/office/drawing/2016/5/13/chartex" xmlns:cx6="http://schemas.microsoft.com/office/drawing/2016/5/12/chartex" xmlns:cx5="http://schemas.microsoft.com/office/drawing/2016/5/11/chartex" xmlns:cx4="http://schemas.microsoft.com/office/drawing/2016/5/10/chartex" xmlns:cx3="http://schemas.microsoft.com/office/drawing/2016/5/9/chartex" xmlns:cx2="http://schemas.microsoft.com/office/drawing/2015/10/21/chartex" xmlns:cx1="http://schemas.microsoft.com/office/drawing/2015/9/8/chartex" xmlns:cx="http://schemas.microsoft.com/office/drawing/2014/chartex" xmlns:wpc="http://schemas.microsoft.com/office/word/2010/wordprocessingCanvas" xmlns="" val="0"/>
+                          <a14:useLocalDpi xmlns="" xmlns:wpc="http://schemas.microsoft.com/office/word/2010/wordprocessingCanvas" xmlns:cx="http://schemas.microsoft.com/office/drawing/2014/chartex" xmlns:cx1="http://schemas.microsoft.com/office/drawing/2015/9/8/chartex" xmlns:cx2="http://schemas.microsoft.com/office/drawing/2015/10/21/chartex" xmlns:cx3="http://schemas.microsoft.com/office/drawing/2016/5/9/chartex" xmlns:cx4="http://schemas.microsoft.com/office/drawing/2016/5/10/chartex" xmlns:cx5="http://schemas.microsoft.com/office/drawing/2016/5/11/chartex" xmlns:cx6="http://schemas.microsoft.com/office/drawing/2016/5/12/chartex" xmlns:cx7="http://schemas.microsoft.com/office/drawing/2016/5/13/chartex" xmlns:cx8="http://schemas.microsoft.com/office/drawing/2016/5/14/chartex" xmlns:mc="http://schemas.openxmlformats.org/markup-compatibility/2006" xmlns:aink="http://schemas.microsoft.com/office/drawing/2016/ink" xmlns:am3d="http://schemas.microsoft.com/office/drawing/2017/model3d" xmlns:o="urn:schemas-microsoft-com:office:office" xmlns:oel="http://schemas.microsoft.com/office/2019/extlst" xmlns:v="urn:schemas-microsoft-com:vml" xmlns:wp14="http://schemas.microsoft.com/office/word/2010/wordprocessingDrawing" xmlns:w10="urn:schemas-microsoft-com:office:word" xmlns:w="http://schemas.openxmlformats.org/wordprocessingml/2006/main" xmlns:w14="http://schemas.microsoft.com/office/word/2010/wordml" xmlns:w15="http://schemas.microsoft.com/office/word/2012/wordml" xmlns:w16cex="http://schemas.microsoft.com/office/word/2018/wordml/cex" xmlns:w16cid="http://schemas.microsoft.com/office/word/2016/wordml/cid" xmlns:w16="http://schemas.microsoft.com/office/word/2018/wordml" xmlns:w16du="http://schemas.microsoft.com/office/word/2023/wordml/word16du" xmlns:w16sdtdh="http://schemas.microsoft.com/office/word/2020/wordml/sdtdatahash" xmlns:w16sdtfl="http://schemas.microsoft.com/office/word/2024/wordml/sdtformatlock" xmlns:w16se="http://schemas.microsoft.com/office/word/2015/wordml/symex" xmlns:wpg="http://schemas.microsoft.com/office/word/2010/wordprocessingGroup" xmlns:wpi="http://schemas.microsoft.com/office/word/2010/wordprocessingInk" xmlns:wps="http://schemas.microsoft.com/office/word/2010/wordprocessingShape" xmlns:a14="http://schemas.microsoft.com/office/drawing/2010/main" val="0"/>
                         </a:ext>
                       </a:extLst>
                     </a:blip>
@@ -118,7 +118,7 @@
                     <a:blip r:embed="rId9" cstate="print">
                       <a:extLst>
                         <a:ext uri="{28A0092B-C50C-407E-A947-70E740481C1C}">
-                          <a14:useLocalDpi xmlns:a14="http://schemas.microsoft.com/office/drawing/2010/main" xmlns:wps="http://schemas.microsoft.com/office/word/2010/wordprocessingShape" xmlns:wpi="http://schemas.microsoft.com/office/word/2010/wordprocessingInk" xmlns:wpg="http://schemas.microsoft.com/office/word/2010/wordprocessingGroup" xmlns:w16se="http://schemas.microsoft.com/office/word/2015/wordml/symex" xmlns:w16sdtfl="http://schemas.microsoft.com/office/word/2024/wordml/sdtformatlock" xmlns:w16sdtdh="http://schemas.microsoft.com/office/word/2020/wordml/sdtdatahash" xmlns:w16du="http://schemas.microsoft.com/office/word/2023/wordml/word16du" xmlns:w16="http://schemas.microsoft.com/office/word/2018/wordml" xmlns:w16cid="http://schemas.microsoft.com/office/word/2016/wordml/cid" xmlns:w16cex="http://schemas.microsoft.com/office/word/2018/wordml/cex" xmlns:w15="http://schemas.microsoft.com/office/word/2012/wordml" xmlns:w14="http://schemas.microsoft.com/office/word/2010/wordml" xmlns:w="http://schemas.openxmlformats.org/wordprocessingml/2006/main" xmlns:w10="urn:schemas-microsoft-com:office:word" xmlns:wp14="http://schemas.microsoft.com/office/word/2010/wordprocessingDrawing" xmlns:v="urn:schemas-microsoft-com:vml" xmlns:oel="http://schemas.microsoft.com/office/2019/extlst" xmlns:o="urn:schemas-microsoft-com:office:office" xmlns:am3d="http://schemas.microsoft.com/office/drawing/2017/model3d" xmlns:aink="http://schemas.microsoft.com/office/drawing/2016/ink" xmlns:mc="http://schemas.openxmlformats.org/markup-compatibility/2006" xmlns:cx8="http://schemas.microsoft.com/office/drawing/2016/5/14/chartex" xmlns:cx7="http://schemas.microsoft.com/office/drawing/2016/5/13/chartex" xmlns:cx6="http://schemas.microsoft.com/office/drawing/2016/5/12/chartex" xmlns:cx5="http://schemas.microsoft.com/office/drawing/2016/5/11/chartex" xmlns:cx4="http://schemas.microsoft.com/office/drawing/2016/5/10/chartex" xmlns:cx3="http://schemas.microsoft.com/office/drawing/2016/5/9/chartex" xmlns:cx2="http://schemas.microsoft.com/office/drawing/2015/10/21/chartex" xmlns:cx1="http://schemas.microsoft.com/office/drawing/2015/9/8/chartex" xmlns:cx="http://schemas.microsoft.com/office/drawing/2014/chartex" xmlns:wpc="http://schemas.microsoft.com/office/word/2010/wordprocessingCanvas" xmlns="" val="0"/>
+                          <a14:useLocalDpi xmlns="" xmlns:wpc="http://schemas.microsoft.com/office/word/2010/wordprocessingCanvas" xmlns:cx="http://schemas.microsoft.com/office/drawing/2014/chartex" xmlns:cx1="http://schemas.microsoft.com/office/drawing/2015/9/8/chartex" xmlns:cx2="http://schemas.microsoft.com/office/drawing/2015/10/21/chartex" xmlns:cx3="http://schemas.microsoft.com/office/drawing/2016/5/9/chartex" xmlns:cx4="http://schemas.microsoft.com/office/drawing/2016/5/10/chartex" xmlns:cx5="http://schemas.microsoft.com/office/drawing/2016/5/11/chartex" xmlns:cx6="http://schemas.microsoft.com/office/drawing/2016/5/12/chartex" xmlns:cx7="http://schemas.microsoft.com/office/drawing/2016/5/13/chartex" xmlns:cx8="http://schemas.microsoft.com/office/drawing/2016/5/14/chartex" xmlns:mc="http://schemas.openxmlformats.org/markup-compatibility/2006" xmlns:aink="http://schemas.microsoft.com/office/drawing/2016/ink" xmlns:am3d="http://schemas.microsoft.com/office/drawing/2017/model3d" xmlns:o="urn:schemas-microsoft-com:office:office" xmlns:oel="http://schemas.microsoft.com/office/2019/extlst" xmlns:v="urn:schemas-microsoft-com:vml" xmlns:wp14="http://schemas.microsoft.com/office/word/2010/wordprocessingDrawing" xmlns:w10="urn:schemas-microsoft-com:office:word" xmlns:w="http://schemas.openxmlformats.org/wordprocessingml/2006/main" xmlns:w14="http://schemas.microsoft.com/office/word/2010/wordml" xmlns:w15="http://schemas.microsoft.com/office/word/2012/wordml" xmlns:w16cex="http://schemas.microsoft.com/office/word/2018/wordml/cex" xmlns:w16cid="http://schemas.microsoft.com/office/word/2016/wordml/cid" xmlns:w16="http://schemas.microsoft.com/office/word/2018/wordml" xmlns:w16du="http://schemas.microsoft.com/office/word/2023/wordml/word16du" xmlns:w16sdtdh="http://schemas.microsoft.com/office/word/2020/wordml/sdtdatahash" xmlns:w16sdtfl="http://schemas.microsoft.com/office/word/2024/wordml/sdtformatlock" xmlns:w16se="http://schemas.microsoft.com/office/word/2015/wordml/symex" xmlns:wpg="http://schemas.microsoft.com/office/word/2010/wordprocessingGroup" xmlns:wpi="http://schemas.microsoft.com/office/word/2010/wordprocessingInk" xmlns:wps="http://schemas.microsoft.com/office/word/2010/wordprocessingShape" xmlns:a14="http://schemas.microsoft.com/office/drawing/2010/main" val="0"/>
                         </a:ext>
                       </a:extLst>
                     </a:blip>
@@ -162,7 +162,7 @@
           </v:shapetype>
           <v:shape id="Text Box 3" o:spid="_x0000_s1026" type="#_x0000_t202" style="position:absolute;margin-left:77.15pt;margin-top:-.55pt;width:412.2pt;height:55pt;z-index:251662336;visibility:visible;mso-position-horizontal-relative:text;mso-position-vertical-relative:text" o:gfxdata="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" strokecolor="white" strokeweight=".26467mm">
             <v:path arrowok="t"/>
-            <v:textbox>
+            <v:textbox style="mso-next-textbox:#Text Box 3">
               <w:txbxContent>
                 <w:p>
                   <w:pPr>
@@ -319,12 +319,7 @@
       </w:r>
       <w:r>
         <w:rPr>
-          <w:rFonts w:ascii="Arial" w:hAnsi="Arial" w:cs="Arial"/>
-          <w:b/>
-          <w:noProof/>
-          <w:color w:val="000000" w:themeColor="text1"/>
           <w:sz w:val="16"/>
-          <w:lang w:val="en-US"/>
         </w:rPr>
       </w:r>
       <w:r>
@@ -332,7 +327,7 @@
           <w:sz w:val="16"/>
         </w:rPr>
         <w:pict>
-          <v:shape id="_x0000_s1030" type="#_x0000_t32" style="width:561.6pt;height:.05pt;mso-position-horizontal-relative:char;mso-position-vertical-relative:line" o:connectortype="straight">
+          <v:shape id="_x0000_s1031" type="#_x0000_t32" style="width:561.6pt;height:.05pt;mso-position-horizontal-relative:char;mso-position-vertical-relative:line" o:connectortype="straight">
             <w10:wrap type="none"/>
             <w10:anchorlock/>
           </v:shape>
@@ -432,12 +427,7 @@
       </w:pPr>
       <w:r>
         <w:rPr>
-          <w:rFonts w:ascii="Arial" w:hAnsi="Arial" w:cs="Arial"/>
-          <w:b/>
-          <w:noProof/>
-          <w:color w:val="000000" w:themeColor="text1"/>
           <w:sz w:val="16"/>
-          <w:lang w:val="en-US"/>
         </w:rPr>
       </w:r>
       <w:r>
@@ -445,7 +435,7 @@
           <w:sz w:val="16"/>
         </w:rPr>
         <w:pict>
-          <v:shape id="_x0000_s1031" type="#_x0000_t32" style="width:561.6pt;height:.05pt;mso-position-horizontal-relative:char;mso-position-vertical-relative:line" o:connectortype="straight">
+          <v:shape id="_x0000_s1030" type="#_x0000_t32" style="width:561.6pt;height:.05pt;mso-position-horizontal-relative:char;mso-position-vertical-relative:line" o:connectortype="straight">
             <w10:wrap type="none"/>
             <w10:anchorlock/>
           </v:shape>
@@ -477,7 +467,7 @@
           <w:szCs w:val="24"/>
           <w:lang w:val="en-US"/>
         </w:rPr>
-        <w:t xml:space="preserve">: {d.date} </w:t>
+        <w:t>: {d.date</w:t>
       </w:r>
       <w:r>
         <w:rPr>
@@ -488,7 +478,7 @@
           <w:szCs w:val="24"/>
           <w:lang w:val="en-US"/>
         </w:rPr>
-        <w:tab/>
+        <w:t>:</w:t>
       </w:r>
       <w:r>
         <w:rPr>
@@ -499,7 +489,7 @@
           <w:szCs w:val="24"/>
           <w:lang w:val="en-US"/>
         </w:rPr>
-        <w:tab/>
+        <w:t>upperC</w:t>
       </w:r>
       <w:r>
         <w:rPr>
@@ -510,6 +500,50 @@
           <w:szCs w:val="24"/>
           <w:lang w:val="en-US"/>
         </w:rPr>
+        <w:t>ase()</w:t>
+      </w:r>
+      <w:r>
+        <w:rPr>
+          <w:rFonts w:ascii="Times New Roman" w:hAnsi="Times New Roman"/>
+          <w:b/>
+          <w:color w:val="000000" w:themeColor="text1"/>
+          <w:sz w:val="24"/>
+          <w:szCs w:val="24"/>
+          <w:lang w:val="en-US"/>
+        </w:rPr>
+        <w:t xml:space="preserve">} </w:t>
+      </w:r>
+      <w:r>
+        <w:rPr>
+          <w:rFonts w:ascii="Times New Roman" w:hAnsi="Times New Roman"/>
+          <w:b/>
+          <w:color w:val="000000" w:themeColor="text1"/>
+          <w:sz w:val="24"/>
+          <w:szCs w:val="24"/>
+          <w:lang w:val="en-US"/>
+        </w:rPr>
+        <w:tab/>
+      </w:r>
+      <w:r>
+        <w:rPr>
+          <w:rFonts w:ascii="Times New Roman" w:hAnsi="Times New Roman"/>
+          <w:b/>
+          <w:color w:val="000000" w:themeColor="text1"/>
+          <w:sz w:val="24"/>
+          <w:szCs w:val="24"/>
+          <w:lang w:val="en-US"/>
+        </w:rPr>
+        <w:tab/>
+      </w:r>
+      <w:r>
+        <w:rPr>
+          <w:rFonts w:ascii="Times New Roman" w:hAnsi="Times New Roman"/>
+          <w:b/>
+          <w:color w:val="000000" w:themeColor="text1"/>
+          <w:sz w:val="24"/>
+          <w:szCs w:val="24"/>
+          <w:lang w:val="en-US"/>
+        </w:rPr>
         <w:t>TIME: {d.time}</w:t>
       </w:r>
     </w:p>
@@ -521,12 +555,7 @@
       </w:pPr>
       <w:r>
         <w:rPr>
-          <w:rFonts w:ascii="Arial" w:hAnsi="Arial" w:cs="Arial"/>
-          <w:b/>
-          <w:noProof/>
-          <w:color w:val="000000" w:themeColor="text1"/>
           <w:sz w:val="16"/>
-          <w:lang w:val="en-US"/>
         </w:rPr>
       </w:r>
       <w:r>
@@ -534,7 +563,7 @@
           <w:sz w:val="16"/>
         </w:rPr>
         <w:pict>
-          <v:shape id="_x0000_s1032" type="#_x0000_t32" style="width:561.6pt;height:.05pt;mso-position-horizontal-relative:char;mso-position-vertical-relative:line" o:connectortype="straight">
+          <v:shape id="_x0000_s1029" type="#_x0000_t32" style="width:561.6pt;height:.05pt;mso-position-horizontal-relative:char;mso-position-vertical-relative:line" o:connectortype="straight">
             <w10:wrap type="none"/>
             <w10:anchorlock/>
           </v:shape>
@@ -1506,7 +1535,7 @@
             <w:pPr>
               <w:suppressAutoHyphens/>
               <w:autoSpaceDN w:val="0"/>
-              <w:spacing w:after="200" w:line="360" w:lineRule="auto"/>
+              <w:spacing w:after="200" w:line="276" w:lineRule="auto"/>
               <w:jc w:val="both"/>
               <w:textAlignment w:val="baseline"/>
               <w:rPr>
@@ -1540,7 +1569,7 @@
             <w:pPr>
               <w:suppressAutoHyphens/>
               <w:autoSpaceDN w:val="0"/>
-              <w:spacing w:after="200" w:line="360" w:lineRule="auto"/>
+              <w:spacing w:after="200" w:line="276" w:lineRule="auto"/>
               <w:jc w:val="both"/>
               <w:textAlignment w:val="baseline"/>
               <w:rPr>
@@ -1573,7 +1602,7 @@
             <w:pPr>
               <w:suppressAutoHyphens/>
               <w:autoSpaceDN w:val="0"/>
-              <w:spacing w:after="200" w:line="360" w:lineRule="auto"/>
+              <w:spacing w:after="200" w:line="276" w:lineRule="auto"/>
               <w:jc w:val="both"/>
               <w:textAlignment w:val="baseline"/>
               <w:rPr>
@@ -1608,9 +1637,8 @@
             <w:pPr>
               <w:suppressAutoHyphens/>
               <w:autoSpaceDN w:val="0"/>
-              <w:spacing w:after="0" w:line="360" w:lineRule="auto"/>
+              <w:spacing w:after="0" w:line="276" w:lineRule="auto"/>
               <w:ind w:right="317"/>
-              <w:jc w:val="both"/>
               <w:textAlignment w:val="baseline"/>
               <w:rPr>
                 <w:rFonts w:ascii="Times New Roman" w:eastAsia="SimSun" w:hAnsi="Times New Roman"/>
@@ -1688,9 +1716,8 @@
             <w:pPr>
               <w:suppressAutoHyphens/>
               <w:autoSpaceDN w:val="0"/>
-              <w:spacing w:after="0" w:line="360" w:lineRule="auto"/>
+              <w:spacing w:after="0" w:line="276" w:lineRule="auto"/>
               <w:ind w:right="317"/>
-              <w:jc w:val="both"/>
               <w:textAlignment w:val="baseline"/>
               <w:rPr>
                 <w:rFonts w:ascii="Times New Roman" w:hAnsi="Times New Roman"/>
@@ -1717,9 +1744,8 @@
             <w:pPr>
               <w:suppressAutoHyphens/>
               <w:autoSpaceDN w:val="0"/>
-              <w:spacing w:after="0" w:line="360" w:lineRule="auto"/>
+              <w:spacing w:after="0" w:line="276" w:lineRule="auto"/>
               <w:ind w:right="317"/>
-              <w:jc w:val="both"/>
               <w:textAlignment w:val="baseline"/>
               <w:rPr>
                 <w:rFonts w:ascii="Times New Roman" w:hAnsi="Times New Roman"/>
@@ -1751,9 +1777,8 @@
             <w:pPr>
               <w:suppressAutoHyphens/>
               <w:autoSpaceDN w:val="0"/>
-              <w:spacing w:after="0" w:line="360" w:lineRule="auto"/>
+              <w:spacing w:after="0" w:line="276" w:lineRule="auto"/>
               <w:ind w:right="317"/>
-              <w:jc w:val="both"/>
               <w:textAlignment w:val="baseline"/>
               <w:rPr>
                 <w:rFonts w:ascii="Times New Roman" w:hAnsi="Times New Roman"/>
@@ -1855,9 +1880,8 @@
             <w:pPr>
               <w:suppressAutoHyphens/>
               <w:autoSpaceDN w:val="0"/>
-              <w:spacing w:after="0" w:line="360" w:lineRule="auto"/>
+              <w:spacing w:after="0" w:line="276" w:lineRule="auto"/>
               <w:ind w:right="317"/>
-              <w:jc w:val="both"/>
               <w:textAlignment w:val="baseline"/>
               <w:rPr>
                 <w:rFonts w:ascii="Times New Roman" w:eastAsia="SimSun" w:hAnsi="Times New Roman"/>
@@ -1923,7 +1947,7 @@
             <w:pPr>
               <w:suppressAutoHyphens/>
               <w:autoSpaceDN w:val="0"/>
-              <w:spacing w:after="0" w:line="360" w:lineRule="auto"/>
+              <w:spacing w:after="0" w:line="276" w:lineRule="auto"/>
               <w:ind w:right="317"/>
               <w:jc w:val="both"/>
               <w:textAlignment w:val="baseline"/>
@@ -2112,9 +2136,9 @@
               <w:tblLook w:val="04A0"/>
             </w:tblPr>
             <w:tblGrid>
-              <w:gridCol w:w="1075"/>
-              <w:gridCol w:w="1890"/>
-              <w:gridCol w:w="1886"/>
+              <w:gridCol w:w="985"/>
+              <w:gridCol w:w="2160"/>
+              <w:gridCol w:w="1706"/>
               <w:gridCol w:w="1618"/>
               <w:gridCol w:w="1716"/>
               <w:gridCol w:w="1518"/>
@@ -2123,12 +2147,14 @@
             <w:tr>
               <w:tc>
                 <w:tcPr>
-                  <w:tcW w:w="1075" w:type="dxa"/>
+                  <w:tcW w:w="985" w:type="dxa"/>
                 </w:tcPr>
                 <w:bookmarkEnd w:id="14"/>
                 <w:bookmarkEnd w:id="15"/>
                 <w:p>
                   <w:pPr>
+                    <w:spacing w:line="276" w:lineRule="auto"/>
+                    <w:jc w:val="center"/>
                     <w:rPr>
                       <w:rFonts w:ascii="Times New Roman" w:eastAsia="Times New Roman" w:hAnsi="Times New Roman"/>
                       <w:b/>
@@ -2150,10 +2176,11 @@
               </w:tc>
               <w:tc>
                 <w:tcPr>
-                  <w:tcW w:w="1890" w:type="dxa"/>
+                  <w:tcW w:w="2160" w:type="dxa"/>
                 </w:tcPr>
                 <w:p>
                   <w:pPr>
+                    <w:spacing w:line="276" w:lineRule="auto"/>
                     <w:rPr>
                       <w:rFonts w:ascii="Times New Roman" w:eastAsia="Times New Roman" w:hAnsi="Times New Roman"/>
                       <w:b/>
@@ -2178,10 +2205,11 @@
               </w:tc>
               <w:tc>
                 <w:tcPr>
-                  <w:tcW w:w="1886" w:type="dxa"/>
+                  <w:tcW w:w="1706" w:type="dxa"/>
                 </w:tcPr>
                 <w:p>
                   <w:pPr>
+                    <w:spacing w:line="276" w:lineRule="auto"/>
                     <w:rPr>
                       <w:rFonts w:ascii="Times New Roman" w:eastAsia="Times New Roman" w:hAnsi="Times New Roman"/>
                       <w:b/>
@@ -2210,6 +2238,7 @@
                 </w:tcPr>
                 <w:p>
                   <w:pPr>
+                    <w:spacing w:line="276" w:lineRule="auto"/>
                     <w:rPr>
                       <w:rFonts w:ascii="Times New Roman" w:eastAsia="Times New Roman" w:hAnsi="Times New Roman"/>
                       <w:b/>
@@ -2238,6 +2267,7 @@
                 </w:tcPr>
                 <w:p>
                   <w:pPr>
+                    <w:spacing w:line="276" w:lineRule="auto"/>
                     <w:rPr>
                       <w:rFonts w:ascii="Times New Roman" w:eastAsia="Times New Roman" w:hAnsi="Times New Roman"/>
                       <w:b/>
@@ -2266,6 +2296,7 @@
                 </w:tcPr>
                 <w:p>
                   <w:pPr>
+                    <w:spacing w:line="276" w:lineRule="auto"/>
                     <w:rPr>
                       <w:rFonts w:ascii="Times New Roman" w:eastAsia="Times New Roman" w:hAnsi="Times New Roman"/>
                       <w:b/>
@@ -2294,6 +2325,7 @@
                 </w:tcPr>
                 <w:p>
                   <w:pPr>
+                    <w:spacing w:line="276" w:lineRule="auto"/>
                     <w:rPr>
                       <w:rFonts w:ascii="Times New Roman" w:eastAsia="Times New Roman" w:hAnsi="Times New Roman"/>
                       <w:b/>
@@ -2322,15 +2354,15 @@
             <w:tr>
               <w:tc>
                 <w:tcPr>
-                  <w:tcW w:w="1075" w:type="dxa"/>
+                  <w:tcW w:w="985" w:type="dxa"/>
                 </w:tcPr>
                 <w:p>
                   <w:pPr>
                     <w:suppressAutoHyphens/>
                     <w:autoSpaceDN w:val="0"/>
-                    <w:spacing w:after="0" w:line="360" w:lineRule="auto"/>
-                    <w:ind w:right="317"/>
-                    <w:jc w:val="both"/>
+                    <w:spacing w:after="0" w:line="276" w:lineRule="auto"/>
+                    <w:ind w:right="317"/>
+                    <w:jc w:val="center"/>
                     <w:textAlignment w:val="baseline"/>
                     <w:rPr>
                       <w:rFonts w:ascii="Times New Roman" w:hAnsi="Times New Roman"/>
@@ -2375,7 +2407,7 @@
                       <w:szCs w:val="24"/>
                       <w:lang w:val="en-US"/>
                     </w:rPr>
-                    <w:t>a</w:t>
+                    <w:t>approvedAppli</w:t>
                   </w:r>
                   <w:r>
                     <w:rPr>
@@ -2387,7 +2419,7 @@
                       <w:lang w:val="en-US"/>
                     </w:rPr>
                     <w:lastRenderedPageBreak/>
-                    <w:t>pprovedApplications</w:t>
+                    <w:t>cations</w:t>
                   </w:r>
                   <w:r>
                     <w:rPr>
@@ -2461,15 +2493,14 @@
               </w:tc>
               <w:tc>
                 <w:tcPr>
-                  <w:tcW w:w="1890" w:type="dxa"/>
+                  <w:tcW w:w="2160" w:type="dxa"/>
                 </w:tcPr>
                 <w:p>
                   <w:pPr>
                     <w:suppressAutoHyphens/>
                     <w:autoSpaceDN w:val="0"/>
-                    <w:spacing w:after="0" w:line="360" w:lineRule="auto"/>
-                    <w:ind w:right="317"/>
-                    <w:jc w:val="both"/>
+                    <w:spacing w:after="0" w:line="276" w:lineRule="auto"/>
+                    <w:ind w:right="317"/>
                     <w:textAlignment w:val="baseline"/>
                     <w:rPr>
                       <w:rFonts w:ascii="Times New Roman" w:hAnsi="Times New Roman"/>
@@ -2534,28 +2565,15 @@
                       <w:szCs w:val="24"/>
                       <w:lang w:val="en-US"/>
                     </w:rPr>
-                    <w:t>].o</w:t>
-                  </w:r>
-                  <w:r>
-                    <w:rPr>
-                      <w:rFonts w:ascii="Times New Roman" w:hAnsi="Times New Roman"/>
-                      <w:bCs/>
-                      <w:color w:val="000000" w:themeColor="text1"/>
-                      <w:sz w:val="24"/>
-                      <w:szCs w:val="24"/>
-                      <w:lang w:val="en-US"/>
-                    </w:rPr>
-                    <w:lastRenderedPageBreak/>
-                    <w:t>wners}</w:t>
-                  </w:r>
-                </w:p>
-                <w:p>
-                  <w:pPr>
-                    <w:suppressAutoHyphens/>
-                    <w:autoSpaceDN w:val="0"/>
-                    <w:spacing w:after="0" w:line="360" w:lineRule="auto"/>
-                    <w:ind w:right="317"/>
-                    <w:jc w:val="both"/>
+                    <w:t>].owners}</w:t>
+                  </w:r>
+                </w:p>
+                <w:p>
+                  <w:pPr>
+                    <w:suppressAutoHyphens/>
+                    <w:autoSpaceDN w:val="0"/>
+                    <w:spacing w:after="0" w:line="276" w:lineRule="auto"/>
+                    <w:ind w:right="317"/>
                     <w:textAlignment w:val="baseline"/>
                   </w:pPr>
                   <w:r>
@@ -2573,35 +2591,33 @@
               </w:tc>
               <w:tc>
                 <w:tcPr>
-                  <w:tcW w:w="1886" w:type="dxa"/>
+                  <w:tcW w:w="1706" w:type="dxa"/>
                 </w:tcPr>
                 <w:p>
                   <w:pPr>
                     <w:suppressAutoHyphens/>
                     <w:autoSpaceDN w:val="0"/>
-                    <w:spacing w:after="0" w:line="360" w:lineRule="auto"/>
-                    <w:ind w:right="317"/>
-                    <w:jc w:val="both"/>
-                    <w:textAlignment w:val="baseline"/>
-                    <w:rPr>
-                      <w:rFonts w:ascii="Times New Roman" w:hAnsi="Times New Roman"/>
-                      <w:bCs/>
-                      <w:color w:val="000000" w:themeColor="text1"/>
-                      <w:sz w:val="24"/>
-                      <w:szCs w:val="24"/>
-                      <w:lang w:val="en-US"/>
-                    </w:rPr>
-                  </w:pPr>
-                  <w:r>
-                    <w:rPr>
-                      <w:rFonts w:ascii="Times New Roman" w:hAnsi="Times New Roman"/>
-                      <w:bCs/>
-                      <w:color w:val="000000" w:themeColor="text1"/>
-                      <w:sz w:val="24"/>
-                      <w:szCs w:val="24"/>
-                      <w:lang w:val="en-US"/>
-                    </w:rPr>
-                    <w:lastRenderedPageBreak/>
+                    <w:spacing w:after="0" w:line="276" w:lineRule="auto"/>
+                    <w:ind w:right="317"/>
+                    <w:textAlignment w:val="baseline"/>
+                    <w:rPr>
+                      <w:rFonts w:ascii="Times New Roman" w:hAnsi="Times New Roman"/>
+                      <w:bCs/>
+                      <w:color w:val="000000" w:themeColor="text1"/>
+                      <w:sz w:val="24"/>
+                      <w:szCs w:val="24"/>
+                      <w:lang w:val="en-US"/>
+                    </w:rPr>
+                  </w:pPr>
+                  <w:r>
+                    <w:rPr>
+                      <w:rFonts w:ascii="Times New Roman" w:hAnsi="Times New Roman"/>
+                      <w:bCs/>
+                      <w:color w:val="000000" w:themeColor="text1"/>
+                      <w:sz w:val="24"/>
+                      <w:szCs w:val="24"/>
+                      <w:lang w:val="en-US"/>
+                    </w:rPr>
                     <w:t>{</w:t>
                   </w:r>
                   <w:r>
@@ -2646,19 +2662,7 @@
                       <w:szCs w:val="24"/>
                       <w:lang w:val="en-US"/>
                     </w:rPr>
-                    <w:t>].t</w:t>
-                  </w:r>
-                  <w:r>
-                    <w:rPr>
-                      <w:rFonts w:ascii="Times New Roman" w:hAnsi="Times New Roman"/>
-                      <w:bCs/>
-                      <w:color w:val="000000" w:themeColor="text1"/>
-                      <w:sz w:val="24"/>
-                      <w:szCs w:val="24"/>
-                      <w:lang w:val="en-US"/>
-                    </w:rPr>
-                    <w:lastRenderedPageBreak/>
-                    <w:t>enure}</w:t>
+                    <w:t>].tenure}</w:t>
                   </w:r>
                 </w:p>
               </w:tc>
@@ -2670,29 +2674,27 @@
                   <w:pPr>
                     <w:suppressAutoHyphens/>
                     <w:autoSpaceDN w:val="0"/>
-                    <w:spacing w:after="0" w:line="360" w:lineRule="auto"/>
-                    <w:ind w:right="317"/>
-                    <w:jc w:val="both"/>
-                    <w:textAlignment w:val="baseline"/>
-                    <w:rPr>
-                      <w:rFonts w:ascii="Times New Roman" w:hAnsi="Times New Roman"/>
-                      <w:bCs/>
-                      <w:color w:val="000000" w:themeColor="text1"/>
-                      <w:sz w:val="24"/>
-                      <w:szCs w:val="24"/>
-                      <w:lang w:val="en-US"/>
-                    </w:rPr>
-                  </w:pPr>
-                  <w:r>
-                    <w:rPr>
-                      <w:rFonts w:ascii="Times New Roman" w:hAnsi="Times New Roman"/>
-                      <w:bCs/>
-                      <w:color w:val="000000" w:themeColor="text1"/>
-                      <w:sz w:val="24"/>
-                      <w:szCs w:val="24"/>
-                      <w:lang w:val="en-US"/>
-                    </w:rPr>
-                    <w:lastRenderedPageBreak/>
+                    <w:spacing w:after="0" w:line="276" w:lineRule="auto"/>
+                    <w:ind w:right="317"/>
+                    <w:textAlignment w:val="baseline"/>
+                    <w:rPr>
+                      <w:rFonts w:ascii="Times New Roman" w:hAnsi="Times New Roman"/>
+                      <w:bCs/>
+                      <w:color w:val="000000" w:themeColor="text1"/>
+                      <w:sz w:val="24"/>
+                      <w:szCs w:val="24"/>
+                      <w:lang w:val="en-US"/>
+                    </w:rPr>
+                  </w:pPr>
+                  <w:r>
+                    <w:rPr>
+                      <w:rFonts w:ascii="Times New Roman" w:hAnsi="Times New Roman"/>
+                      <w:bCs/>
+                      <w:color w:val="000000" w:themeColor="text1"/>
+                      <w:sz w:val="24"/>
+                      <w:szCs w:val="24"/>
+                      <w:lang w:val="en-US"/>
+                    </w:rPr>
                     <w:t>{</w:t>
                   </w:r>
                   <w:r>
@@ -2715,19 +2717,7 @@
                       <w:szCs w:val="24"/>
                       <w:lang w:val="en-US"/>
                     </w:rPr>
-                    <w:t>approvedApplicati</w:t>
-                  </w:r>
-                  <w:r>
-                    <w:rPr>
-                      <w:rFonts w:ascii="Times New Roman" w:hAnsi="Times New Roman"/>
-                      <w:bCs/>
-                      <w:color w:val="000000" w:themeColor="text1"/>
-                      <w:sz w:val="24"/>
-                      <w:szCs w:val="24"/>
-                      <w:lang w:val="en-US"/>
-                    </w:rPr>
-                    <w:lastRenderedPageBreak/>
-                    <w:t>ons</w:t>
+                    <w:t>approvedApplications</w:t>
                   </w:r>
                   <w:r>
                     <w:rPr>
@@ -2756,9 +2746,8 @@
                   <w:pPr>
                     <w:suppressAutoHyphens/>
                     <w:autoSpaceDN w:val="0"/>
-                    <w:spacing w:after="0" w:line="360" w:lineRule="auto"/>
-                    <w:ind w:right="317"/>
-                    <w:jc w:val="both"/>
+                    <w:spacing w:after="0" w:line="276" w:lineRule="auto"/>
+                    <w:ind w:right="317"/>
                     <w:textAlignment w:val="baseline"/>
                     <w:rPr>
                       <w:rFonts w:ascii="Times New Roman" w:hAnsi="Times New Roman"/>
@@ -2771,6 +2760,23 @@
                   </w:pPr>
                   <w:bookmarkStart w:id="19" w:name="OLE_LINK61"/>
                   <w:bookmarkStart w:id="20" w:name="OLE_LINK62"/>
+                </w:p>
+                <w:p>
+                  <w:pPr>
+                    <w:suppressAutoHyphens/>
+                    <w:autoSpaceDN w:val="0"/>
+                    <w:spacing w:after="0" w:line="276" w:lineRule="auto"/>
+                    <w:ind w:right="317"/>
+                    <w:textAlignment w:val="baseline"/>
+                    <w:rPr>
+                      <w:rFonts w:ascii="Times New Roman" w:hAnsi="Times New Roman"/>
+                      <w:bCs/>
+                      <w:color w:val="000000" w:themeColor="text1"/>
+                      <w:sz w:val="24"/>
+                      <w:szCs w:val="24"/>
+                      <w:lang w:val="en-US"/>
+                    </w:rPr>
+                  </w:pPr>
                   <w:r>
                     <w:rPr>
                       <w:rFonts w:ascii="Times New Roman" w:hAnsi="Times New Roman"/>
@@ -2791,7 +2797,19 @@
                       <w:szCs w:val="24"/>
                       <w:lang w:val="en-US"/>
                     </w:rPr>
-                    <w:t>d.agendas[i].</w:t>
+                    <w:t>d.agendas</w:t>
+                  </w:r>
+                  <w:r>
+                    <w:rPr>
+                      <w:rFonts w:ascii="Times New Roman" w:hAnsi="Times New Roman"/>
+                      <w:bCs/>
+                      <w:color w:val="000000" w:themeColor="text1"/>
+                      <w:sz w:val="24"/>
+                      <w:szCs w:val="24"/>
+                      <w:lang w:val="en-US"/>
+                    </w:rPr>
+                    <w:lastRenderedPageBreak/>
+                    <w:t>[i].</w:t>
                   </w:r>
                   <w:r>
                     <w:rPr>
@@ -2838,9 +2856,8 @@
                   <w:pPr>
                     <w:suppressAutoHyphens/>
                     <w:autoSpaceDN w:val="0"/>
-                    <w:spacing w:after="0" w:line="360" w:lineRule="auto"/>
-                    <w:ind w:right="317"/>
-                    <w:jc w:val="both"/>
+                    <w:spacing w:after="0" w:line="276" w:lineRule="auto"/>
+                    <w:ind w:right="317"/>
                     <w:textAlignment w:val="baseline"/>
                     <w:rPr>
                       <w:rFonts w:ascii="Times New Roman" w:hAnsi="Times New Roman"/>
@@ -2885,19 +2902,7 @@
                       <w:szCs w:val="24"/>
                       <w:lang w:val="en-US"/>
                     </w:rPr>
-                    <w:t>approvedApplication</w:t>
-                  </w:r>
-                  <w:r>
-                    <w:rPr>
-                      <w:rFonts w:ascii="Times New Roman" w:hAnsi="Times New Roman"/>
-                      <w:bCs/>
-                      <w:color w:val="000000" w:themeColor="text1"/>
-                      <w:sz w:val="24"/>
-                      <w:szCs w:val="24"/>
-                      <w:lang w:val="en-US"/>
-                    </w:rPr>
-                    <w:lastRenderedPageBreak/>
-                    <w:t>s</w:t>
+                    <w:t>approvedApplications</w:t>
                   </w:r>
                   <w:r>
                     <w:rPr>
@@ -2928,9 +2933,25 @@
                   <w:pPr>
                     <w:suppressAutoHyphens/>
                     <w:autoSpaceDN w:val="0"/>
-                    <w:spacing w:after="0" w:line="360" w:lineRule="auto"/>
-                    <w:ind w:right="317"/>
-                    <w:jc w:val="both"/>
+                    <w:spacing w:after="0" w:line="276" w:lineRule="auto"/>
+                    <w:ind w:right="317"/>
+                    <w:textAlignment w:val="baseline"/>
+                    <w:rPr>
+                      <w:rFonts w:ascii="Times New Roman" w:hAnsi="Times New Roman"/>
+                      <w:bCs/>
+                      <w:color w:val="000000" w:themeColor="text1"/>
+                      <w:sz w:val="24"/>
+                      <w:szCs w:val="24"/>
+                      <w:lang w:val="en-US"/>
+                    </w:rPr>
+                  </w:pPr>
+                </w:p>
+                <w:p>
+                  <w:pPr>
+                    <w:suppressAutoHyphens/>
+                    <w:autoSpaceDN w:val="0"/>
+                    <w:spacing w:after="0" w:line="276" w:lineRule="auto"/>
+                    <w:ind w:right="317"/>
                     <w:textAlignment w:val="baseline"/>
                     <w:rPr>
                       <w:rFonts w:ascii="Times New Roman" w:hAnsi="Times New Roman"/>
@@ -2972,7 +2993,19 @@
                       <w:szCs w:val="24"/>
                       <w:lang w:val="en-US"/>
                     </w:rPr>
-                    <w:t>approvedApplications</w:t>
+                    <w:t>approved</w:t>
+                  </w:r>
+                  <w:r>
+                    <w:rPr>
+                      <w:rFonts w:ascii="Times New Roman" w:hAnsi="Times New Roman"/>
+                      <w:bCs/>
+                      <w:color w:val="000000" w:themeColor="text1"/>
+                      <w:sz w:val="24"/>
+                      <w:szCs w:val="24"/>
+                      <w:lang w:val="en-US"/>
+                    </w:rPr>
+                    <w:lastRenderedPageBreak/>
+                    <w:t>Applications</w:t>
                   </w:r>
                   <w:r>
                     <w:rPr>
@@ -3006,9 +3039,8 @@
                   <w:pPr>
                     <w:suppressAutoHyphens/>
                     <w:autoSpaceDN w:val="0"/>
-                    <w:spacing w:after="0" w:line="360" w:lineRule="auto"/>
-                    <w:ind w:right="317"/>
-                    <w:jc w:val="both"/>
+                    <w:spacing w:after="0" w:line="276" w:lineRule="auto"/>
+                    <w:ind w:right="317"/>
                     <w:textAlignment w:val="baseline"/>
                     <w:rPr>
                       <w:rFonts w:ascii="Times New Roman" w:hAnsi="Times New Roman"/>
@@ -3053,19 +3085,7 @@
                       <w:szCs w:val="24"/>
                       <w:lang w:val="en-US"/>
                     </w:rPr>
-                    <w:t>approvedAppli</w:t>
-                  </w:r>
-                  <w:r>
-                    <w:rPr>
-                      <w:rFonts w:ascii="Times New Roman" w:hAnsi="Times New Roman"/>
-                      <w:bCs/>
-                      <w:color w:val="000000" w:themeColor="text1"/>
-                      <w:sz w:val="24"/>
-                      <w:szCs w:val="24"/>
-                      <w:lang w:val="en-US"/>
-                    </w:rPr>
-                    <w:lastRenderedPageBreak/>
-                    <w:t>cations</w:t>
+                    <w:t>approvedApplications</w:t>
                   </w:r>
                   <w:r>
                     <w:rPr>
@@ -3101,13 +3121,11 @@
                   <w:pPr>
                     <w:suppressAutoHyphens/>
                     <w:autoSpaceDN w:val="0"/>
-                    <w:spacing w:after="0" w:line="360" w:lineRule="auto"/>
-                    <w:ind w:right="317"/>
-                    <w:jc w:val="both"/>
-                    <w:textAlignment w:val="baseline"/>
-                    <w:rPr>
-                      <w:rFonts w:ascii="Times New Roman" w:hAnsi="Times New Roman"/>
-                      <w:b/>
+                    <w:spacing w:after="0" w:line="276" w:lineRule="auto"/>
+                    <w:ind w:right="317"/>
+                    <w:textAlignment w:val="baseline"/>
+                    <w:rPr>
+                      <w:rFonts w:ascii="Times New Roman" w:hAnsi="Times New Roman"/>
                       <w:bCs/>
                       <w:color w:val="000000" w:themeColor="text1"/>
                       <w:sz w:val="24"/>
@@ -3127,120 +3145,117 @@
                       <w:szCs w:val="24"/>
                       <w:lang w:val="en-US"/>
                     </w:rPr>
+                    <w:t>{</w:t>
+                  </w:r>
+                  <w:r>
+                    <w:rPr>
+                      <w:rFonts w:ascii="Times New Roman" w:hAnsi="Times New Roman"/>
+                      <w:b/>
+                      <w:bCs/>
+                      <w:color w:val="000000" w:themeColor="text1"/>
+                      <w:sz w:val="24"/>
+                      <w:szCs w:val="24"/>
+                      <w:lang w:val="en-US"/>
+                    </w:rPr>
+                    <w:t>d.agendas[i].</w:t>
+                  </w:r>
+                  <w:r>
+                    <w:rPr>
+                      <w:rFonts w:ascii="Times New Roman" w:hAnsi="Times New Roman"/>
+                      <w:b/>
+                      <w:bCs/>
+                      <w:color w:val="000000" w:themeColor="text1"/>
+                      <w:sz w:val="24"/>
+                      <w:szCs w:val="24"/>
+                      <w:lang w:val="en-US"/>
+                    </w:rPr>
+                    <w:t>approvedApplications</w:t>
+                  </w:r>
+                  <w:r>
+                    <w:rPr>
+                      <w:rFonts w:ascii="Times New Roman" w:hAnsi="Times New Roman"/>
+                      <w:b/>
+                      <w:bCs/>
+                      <w:color w:val="000000" w:themeColor="text1"/>
+                      <w:sz w:val="24"/>
+                      <w:szCs w:val="24"/>
+                      <w:lang w:val="en-US"/>
+                    </w:rPr>
+                    <w:t>[i</w:t>
+                  </w:r>
+                  <w:r>
+                    <w:rPr>
+                      <w:rFonts w:ascii="Times New Roman" w:hAnsi="Times New Roman"/>
+                      <w:b/>
+                      <w:bCs/>
+                      <w:color w:val="000000" w:themeColor="text1"/>
+                      <w:sz w:val="24"/>
+                      <w:szCs w:val="24"/>
+                      <w:lang w:val="en-US"/>
+                    </w:rPr>
+                    <w:t>].decision}</w:t>
+                  </w:r>
+                </w:p>
+                <w:p>
+                  <w:pPr>
+                    <w:suppressAutoHyphens/>
+                    <w:autoSpaceDN w:val="0"/>
+                    <w:spacing w:after="0" w:line="276" w:lineRule="auto"/>
+                    <w:ind w:right="317"/>
+                    <w:textAlignment w:val="baseline"/>
+                    <w:rPr>
+                      <w:rFonts w:ascii="Times New Roman" w:hAnsi="Times New Roman"/>
+                      <w:bCs/>
+                      <w:color w:val="000000" w:themeColor="text1"/>
+                      <w:sz w:val="24"/>
+                      <w:szCs w:val="24"/>
+                      <w:lang w:val="en-US"/>
+                    </w:rPr>
+                  </w:pPr>
+                  <w:r>
+                    <w:rPr>
+                      <w:rFonts w:ascii="Times New Roman" w:hAnsi="Times New Roman"/>
+                      <w:bCs/>
+                      <w:color w:val="000000" w:themeColor="text1"/>
+                      <w:sz w:val="24"/>
+                      <w:szCs w:val="24"/>
+                      <w:lang w:val="en-US"/>
+                    </w:rPr>
+                    <w:t>{</w:t>
+                  </w:r>
+                  <w:r>
+                    <w:rPr>
+                      <w:rFonts w:ascii="Times New Roman" w:hAnsi="Times New Roman"/>
+                      <w:bCs/>
+                      <w:color w:val="000000" w:themeColor="text1"/>
+                      <w:sz w:val="24"/>
+                      <w:szCs w:val="24"/>
+                      <w:lang w:val="en-US"/>
+                    </w:rPr>
+                    <w:t>d.agendas[i].</w:t>
+                  </w:r>
+                  <w:r>
+                    <w:rPr>
+                      <w:rFonts w:ascii="Times New Roman" w:hAnsi="Times New Roman"/>
+                      <w:bCs/>
+                      <w:color w:val="000000" w:themeColor="text1"/>
+                      <w:sz w:val="24"/>
+                      <w:szCs w:val="24"/>
+                      <w:lang w:val="en-US"/>
+                    </w:rPr>
+                    <w:t>approve</w:t>
+                  </w:r>
+                  <w:r>
+                    <w:rPr>
+                      <w:rFonts w:ascii="Times New Roman" w:hAnsi="Times New Roman"/>
+                      <w:bCs/>
+                      <w:color w:val="000000" w:themeColor="text1"/>
+                      <w:sz w:val="24"/>
+                      <w:szCs w:val="24"/>
+                      <w:lang w:val="en-US"/>
+                    </w:rPr>
                     <w:lastRenderedPageBreak/>
-                    <w:t>{</w:t>
-                  </w:r>
-                  <w:r>
-                    <w:rPr>
-                      <w:rFonts w:ascii="Times New Roman" w:hAnsi="Times New Roman"/>
-                      <w:b/>
-                      <w:bCs/>
-                      <w:color w:val="000000" w:themeColor="text1"/>
-                      <w:sz w:val="24"/>
-                      <w:szCs w:val="24"/>
-                      <w:lang w:val="en-US"/>
-                    </w:rPr>
-                    <w:t>d.agendas[i].</w:t>
-                  </w:r>
-                  <w:r>
-                    <w:rPr>
-                      <w:rFonts w:ascii="Times New Roman" w:hAnsi="Times New Roman"/>
-                      <w:b/>
-                      <w:bCs/>
-                      <w:color w:val="000000" w:themeColor="text1"/>
-                      <w:sz w:val="24"/>
-                      <w:szCs w:val="24"/>
-                      <w:lang w:val="en-US"/>
-                    </w:rPr>
-                    <w:t>approvedApplic</w:t>
-                  </w:r>
-                  <w:r>
-                    <w:rPr>
-                      <w:rFonts w:ascii="Times New Roman" w:hAnsi="Times New Roman"/>
-                      <w:b/>
-                      <w:bCs/>
-                      <w:color w:val="000000" w:themeColor="text1"/>
-                      <w:sz w:val="24"/>
-                      <w:szCs w:val="24"/>
-                      <w:lang w:val="en-US"/>
-                    </w:rPr>
-                    <w:lastRenderedPageBreak/>
-                    <w:t>ations</w:t>
-                  </w:r>
-                  <w:r>
-                    <w:rPr>
-                      <w:rFonts w:ascii="Times New Roman" w:hAnsi="Times New Roman"/>
-                      <w:b/>
-                      <w:bCs/>
-                      <w:color w:val="000000" w:themeColor="text1"/>
-                      <w:sz w:val="24"/>
-                      <w:szCs w:val="24"/>
-                      <w:lang w:val="en-US"/>
-                    </w:rPr>
-                    <w:t>[i</w:t>
-                  </w:r>
-                  <w:r>
-                    <w:rPr>
-                      <w:rFonts w:ascii="Times New Roman" w:hAnsi="Times New Roman"/>
-                      <w:b/>
-                      <w:bCs/>
-                      <w:color w:val="000000" w:themeColor="text1"/>
-                      <w:sz w:val="24"/>
-                      <w:szCs w:val="24"/>
-                      <w:lang w:val="en-US"/>
-                    </w:rPr>
-                    <w:t>].decision}</w:t>
-                  </w:r>
-                </w:p>
-                <w:p>
-                  <w:pPr>
-                    <w:suppressAutoHyphens/>
-                    <w:autoSpaceDN w:val="0"/>
-                    <w:spacing w:after="0" w:line="360" w:lineRule="auto"/>
-                    <w:ind w:right="317"/>
-                    <w:jc w:val="both"/>
-                    <w:textAlignment w:val="baseline"/>
-                    <w:rPr>
-                      <w:rFonts w:ascii="Times New Roman" w:hAnsi="Times New Roman"/>
-                      <w:bCs/>
-                      <w:color w:val="000000" w:themeColor="text1"/>
-                      <w:sz w:val="24"/>
-                      <w:szCs w:val="24"/>
-                      <w:lang w:val="en-US"/>
-                    </w:rPr>
-                  </w:pPr>
-                  <w:r>
-                    <w:rPr>
-                      <w:rFonts w:ascii="Times New Roman" w:hAnsi="Times New Roman"/>
-                      <w:bCs/>
-                      <w:color w:val="000000" w:themeColor="text1"/>
-                      <w:sz w:val="24"/>
-                      <w:szCs w:val="24"/>
-                      <w:lang w:val="en-US"/>
-                    </w:rPr>
-                    <w:t>{</w:t>
-                  </w:r>
-                  <w:r>
-                    <w:rPr>
-                      <w:rFonts w:ascii="Times New Roman" w:hAnsi="Times New Roman"/>
-                      <w:bCs/>
-                      <w:color w:val="000000" w:themeColor="text1"/>
-                      <w:sz w:val="24"/>
-                      <w:szCs w:val="24"/>
-                      <w:lang w:val="en-US"/>
-                    </w:rPr>
-                    <w:t>d.agendas[i].</w:t>
-                  </w:r>
-                  <w:r>
-                    <w:rPr>
-                      <w:rFonts w:ascii="Times New Roman" w:hAnsi="Times New Roman"/>
-                      <w:bCs/>
-                      <w:color w:val="000000" w:themeColor="text1"/>
-                      <w:sz w:val="24"/>
-                      <w:szCs w:val="24"/>
-                      <w:lang w:val="en-US"/>
-                    </w:rPr>
-                    <w:t>approvedApplications</w:t>
+                    <w:t>dApplications</w:t>
                   </w:r>
                   <w:r>
                     <w:rPr>
@@ -3272,15 +3287,15 @@
             <w:tr>
               <w:tc>
                 <w:tcPr>
-                  <w:tcW w:w="1075" w:type="dxa"/>
+                  <w:tcW w:w="985" w:type="dxa"/>
                 </w:tcPr>
                 <w:p>
                   <w:pPr>
                     <w:suppressAutoHyphens/>
                     <w:autoSpaceDN w:val="0"/>
-                    <w:spacing w:after="0" w:line="360" w:lineRule="auto"/>
-                    <w:ind w:right="317"/>
-                    <w:jc w:val="both"/>
+                    <w:spacing w:after="0" w:line="276" w:lineRule="auto"/>
+                    <w:ind w:right="317"/>
+                    <w:jc w:val="center"/>
                     <w:textAlignment w:val="baseline"/>
                     <w:rPr>
                       <w:rFonts w:ascii="Times New Roman" w:hAnsi="Times New Roman"/>
@@ -3366,13 +3381,13 @@
               </w:tc>
               <w:tc>
                 <w:tcPr>
-                  <w:tcW w:w="1890" w:type="dxa"/>
+                  <w:tcW w:w="2160" w:type="dxa"/>
                 </w:tcPr>
                 <w:p>
                   <w:pPr>
                     <w:suppressAutoHyphens/>
                     <w:autoSpaceDN w:val="0"/>
-                    <w:spacing w:after="0" w:line="360" w:lineRule="auto"/>
+                    <w:spacing w:after="0" w:line="276" w:lineRule="auto"/>
                     <w:ind w:right="317"/>
                     <w:jc w:val="both"/>
                     <w:textAlignment w:val="baseline"/>
@@ -3390,13 +3405,13 @@
               </w:tc>
               <w:tc>
                 <w:tcPr>
-                  <w:tcW w:w="1886" w:type="dxa"/>
+                  <w:tcW w:w="1706" w:type="dxa"/>
                 </w:tcPr>
                 <w:p>
                   <w:pPr>
                     <w:suppressAutoHyphens/>
                     <w:autoSpaceDN w:val="0"/>
-                    <w:spacing w:after="0" w:line="360" w:lineRule="auto"/>
+                    <w:spacing w:after="0" w:line="276" w:lineRule="auto"/>
                     <w:ind w:right="317"/>
                     <w:jc w:val="both"/>
                     <w:textAlignment w:val="baseline"/>
@@ -3420,7 +3435,7 @@
                   <w:pPr>
                     <w:suppressAutoHyphens/>
                     <w:autoSpaceDN w:val="0"/>
-                    <w:spacing w:after="0" w:line="360" w:lineRule="auto"/>
+                    <w:spacing w:after="0" w:line="276" w:lineRule="auto"/>
                     <w:ind w:right="317"/>
                     <w:jc w:val="both"/>
                     <w:textAlignment w:val="baseline"/>
@@ -3444,7 +3459,7 @@
                   <w:pPr>
                     <w:suppressAutoHyphens/>
                     <w:autoSpaceDN w:val="0"/>
-                    <w:spacing w:after="0" w:line="360" w:lineRule="auto"/>
+                    <w:spacing w:after="0" w:line="276" w:lineRule="auto"/>
                     <w:ind w:right="317"/>
                     <w:jc w:val="both"/>
                     <w:textAlignment w:val="baseline"/>
@@ -3468,7 +3483,7 @@
                   <w:pPr>
                     <w:suppressAutoHyphens/>
                     <w:autoSpaceDN w:val="0"/>
-                    <w:spacing w:after="0" w:line="360" w:lineRule="auto"/>
+                    <w:spacing w:after="0" w:line="276" w:lineRule="auto"/>
                     <w:ind w:right="317"/>
                     <w:jc w:val="both"/>
                     <w:textAlignment w:val="baseline"/>
@@ -3492,7 +3507,7 @@
                   <w:pPr>
                     <w:suppressAutoHyphens/>
                     <w:autoSpaceDN w:val="0"/>
-                    <w:spacing w:after="0" w:line="360" w:lineRule="auto"/>
+                    <w:spacing w:after="0" w:line="276" w:lineRule="auto"/>
                     <w:ind w:right="317"/>
                     <w:jc w:val="both"/>
                     <w:textAlignment w:val="baseline"/>
@@ -3521,7 +3536,7 @@
                   <w:pPr>
                     <w:suppressAutoHyphens/>
                     <w:autoSpaceDN w:val="0"/>
-                    <w:spacing w:after="0" w:line="360" w:lineRule="auto"/>
+                    <w:spacing w:after="0" w:line="276" w:lineRule="auto"/>
                     <w:ind w:right="317"/>
                     <w:jc w:val="center"/>
                     <w:textAlignment w:val="baseline"/>
@@ -3632,15 +3647,15 @@
             <w:tr>
               <w:tc>
                 <w:tcPr>
-                  <w:tcW w:w="1075" w:type="dxa"/>
+                  <w:tcW w:w="985" w:type="dxa"/>
                 </w:tcPr>
                 <w:p>
                   <w:pPr>
                     <w:suppressAutoHyphens/>
                     <w:autoSpaceDN w:val="0"/>
-                    <w:spacing w:after="0" w:line="360" w:lineRule="auto"/>
-                    <w:ind w:right="317"/>
-                    <w:jc w:val="both"/>
+                    <w:spacing w:after="0" w:line="276" w:lineRule="auto"/>
+                    <w:ind w:right="317"/>
+                    <w:jc w:val="center"/>
                     <w:textAlignment w:val="baseline"/>
                     <w:rPr>
                       <w:rFonts w:ascii="Times New Roman" w:hAnsi="Times New Roman"/>
@@ -3671,18 +3686,7 @@
                       <w:szCs w:val="24"/>
                       <w:lang w:val="en-US"/>
                     </w:rPr>
-                    <w:t>d.agendas[i].</w:t>
-                  </w:r>
-                  <w:r>
-                    <w:rPr>
-                      <w:rFonts w:ascii="Times New Roman" w:hAnsi="Times New Roman"/>
-                      <w:bCs/>
-                      <w:color w:val="000000" w:themeColor="text1"/>
-                      <w:sz w:val="24"/>
-                      <w:szCs w:val="24"/>
-                      <w:lang w:val="en-US"/>
-                    </w:rPr>
-                    <w:t>deferredApplications</w:t>
+                    <w:t>d.agendas[i].deferredApplications</w:t>
                   </w:r>
                   <w:r>
                     <w:rPr>
@@ -3704,30 +3708,7 @@
                       <w:szCs w:val="24"/>
                       <w:lang w:val="en-US"/>
                     </w:rPr>
-                    <w:t>d.agendas[i].</w:t>
-                  </w:r>
-                  <w:r>
-                    <w:rPr>
-                      <w:rFonts w:ascii="Times New Roman" w:hAnsi="Times New Roman"/>
-                      <w:bCs/>
-                      <w:color w:val="000000" w:themeColor="text1"/>
-                      <w:sz w:val="24"/>
-                      <w:szCs w:val="24"/>
-                      <w:lang w:val="en-US"/>
-                    </w:rPr>
-                    <w:t>deferred</w:t>
-                  </w:r>
-                  <w:r>
-                    <w:rPr>
-                      <w:rFonts w:ascii="Times New Roman" w:hAnsi="Times New Roman"/>
-                      <w:bCs/>
-                      <w:color w:val="000000" w:themeColor="text1"/>
-                      <w:sz w:val="24"/>
-                      <w:szCs w:val="24"/>
-                      <w:lang w:val="en-US"/>
-                    </w:rPr>
-                    <w:lastRenderedPageBreak/>
-                    <w:t>Applications</w:t>
+                    <w:t>d.agendas[i].deferredApplications</w:t>
                   </w:r>
                   <w:r>
                     <w:rPr>
@@ -3744,35 +3725,33 @@
               </w:tc>
               <w:tc>
                 <w:tcPr>
-                  <w:tcW w:w="1890" w:type="dxa"/>
+                  <w:tcW w:w="2160" w:type="dxa"/>
                 </w:tcPr>
                 <w:p>
                   <w:pPr>
                     <w:suppressAutoHyphens/>
                     <w:autoSpaceDN w:val="0"/>
-                    <w:spacing w:after="0" w:line="360" w:lineRule="auto"/>
-                    <w:ind w:right="317"/>
-                    <w:jc w:val="both"/>
-                    <w:textAlignment w:val="baseline"/>
-                    <w:rPr>
-                      <w:rFonts w:ascii="Times New Roman" w:hAnsi="Times New Roman"/>
-                      <w:bCs/>
-                      <w:color w:val="000000" w:themeColor="text1"/>
-                      <w:sz w:val="24"/>
-                      <w:szCs w:val="24"/>
-                      <w:lang w:val="en-US"/>
-                    </w:rPr>
-                  </w:pPr>
-                  <w:r>
-                    <w:rPr>
-                      <w:rFonts w:ascii="Times New Roman" w:hAnsi="Times New Roman"/>
-                      <w:bCs/>
-                      <w:color w:val="000000" w:themeColor="text1"/>
-                      <w:sz w:val="24"/>
-                      <w:szCs w:val="24"/>
-                      <w:lang w:val="en-US"/>
-                    </w:rPr>
-                    <w:lastRenderedPageBreak/>
+                    <w:spacing w:after="0" w:line="276" w:lineRule="auto"/>
+                    <w:ind w:right="317"/>
+                    <w:textAlignment w:val="baseline"/>
+                    <w:rPr>
+                      <w:rFonts w:ascii="Times New Roman" w:hAnsi="Times New Roman"/>
+                      <w:bCs/>
+                      <w:color w:val="000000" w:themeColor="text1"/>
+                      <w:sz w:val="24"/>
+                      <w:szCs w:val="24"/>
+                      <w:lang w:val="en-US"/>
+                    </w:rPr>
+                  </w:pPr>
+                  <w:r>
+                    <w:rPr>
+                      <w:rFonts w:ascii="Times New Roman" w:hAnsi="Times New Roman"/>
+                      <w:bCs/>
+                      <w:color w:val="000000" w:themeColor="text1"/>
+                      <w:sz w:val="24"/>
+                      <w:szCs w:val="24"/>
+                      <w:lang w:val="en-US"/>
+                    </w:rPr>
                     <w:t>{</w:t>
                   </w:r>
                   <w:r>
@@ -3784,18 +3763,7 @@
                       <w:szCs w:val="24"/>
                       <w:lang w:val="en-US"/>
                     </w:rPr>
-                    <w:t>d.agendas[i].</w:t>
-                  </w:r>
-                  <w:r>
-                    <w:rPr>
-                      <w:rFonts w:ascii="Times New Roman" w:hAnsi="Times New Roman"/>
-                      <w:bCs/>
-                      <w:color w:val="000000" w:themeColor="text1"/>
-                      <w:sz w:val="24"/>
-                      <w:szCs w:val="24"/>
-                      <w:lang w:val="en-US"/>
-                    </w:rPr>
-                    <w:t>deferredApplications</w:t>
+                    <w:t>d.agendas[i].deferredApplications</w:t>
                   </w:r>
                   <w:r>
                     <w:rPr>
@@ -3813,9 +3781,8 @@
                   <w:pPr>
                     <w:suppressAutoHyphens/>
                     <w:autoSpaceDN w:val="0"/>
-                    <w:spacing w:after="0" w:line="360" w:lineRule="auto"/>
-                    <w:ind w:right="317"/>
-                    <w:jc w:val="both"/>
+                    <w:spacing w:after="0" w:line="276" w:lineRule="auto"/>
+                    <w:ind w:right="317"/>
                     <w:textAlignment w:val="baseline"/>
                     <w:rPr>
                       <w:rFonts w:ascii="Times New Roman" w:hAnsi="Times New Roman"/>
@@ -3863,15 +3830,14 @@
               </w:tc>
               <w:tc>
                 <w:tcPr>
-                  <w:tcW w:w="1886" w:type="dxa"/>
+                  <w:tcW w:w="1706" w:type="dxa"/>
                 </w:tcPr>
                 <w:p>
                   <w:pPr>
                     <w:suppressAutoHyphens/>
                     <w:autoSpaceDN w:val="0"/>
-                    <w:spacing w:after="0" w:line="360" w:lineRule="auto"/>
-                    <w:ind w:right="317"/>
-                    <w:jc w:val="both"/>
+                    <w:spacing w:after="0" w:line="276" w:lineRule="auto"/>
+                    <w:ind w:right="317"/>
                     <w:textAlignment w:val="baseline"/>
                     <w:rPr>
                       <w:rFonts w:ascii="Times New Roman" w:hAnsi="Times New Roman"/>
@@ -3902,18 +3868,7 @@
                       <w:szCs w:val="24"/>
                       <w:lang w:val="en-US"/>
                     </w:rPr>
-                    <w:t>d.agendas[i].</w:t>
-                  </w:r>
-                  <w:r>
-                    <w:rPr>
-                      <w:rFonts w:ascii="Times New Roman" w:hAnsi="Times New Roman"/>
-                      <w:bCs/>
-                      <w:color w:val="000000" w:themeColor="text1"/>
-                      <w:sz w:val="24"/>
-                      <w:szCs w:val="24"/>
-                      <w:lang w:val="en-US"/>
-                    </w:rPr>
-                    <w:t>deferredApplications</w:t>
+                    <w:t>d.agendas[i].deferredApplications</w:t>
                   </w:r>
                   <w:r>
                     <w:rPr>
@@ -3936,9 +3891,8 @@
                   <w:pPr>
                     <w:suppressAutoHyphens/>
                     <w:autoSpaceDN w:val="0"/>
-                    <w:spacing w:after="0" w:line="360" w:lineRule="auto"/>
-                    <w:ind w:right="317"/>
-                    <w:jc w:val="both"/>
+                    <w:spacing w:after="0" w:line="276" w:lineRule="auto"/>
+                    <w:ind w:right="317"/>
                     <w:textAlignment w:val="baseline"/>
                     <w:rPr>
                       <w:rFonts w:ascii="Times New Roman" w:hAnsi="Times New Roman"/>
@@ -3969,18 +3923,7 @@
                       <w:szCs w:val="24"/>
                       <w:lang w:val="en-US"/>
                     </w:rPr>
-                    <w:t>d.agendas[i].</w:t>
-                  </w:r>
-                  <w:r>
-                    <w:rPr>
-                      <w:rFonts w:ascii="Times New Roman" w:hAnsi="Times New Roman"/>
-                      <w:bCs/>
-                      <w:color w:val="000000" w:themeColor="text1"/>
-                      <w:sz w:val="24"/>
-                      <w:szCs w:val="24"/>
-                      <w:lang w:val="en-US"/>
-                    </w:rPr>
-                    <w:t>deferredApplications</w:t>
+                    <w:t>d.agendas[i].deferredApplications</w:t>
                   </w:r>
                   <w:r>
                     <w:rPr>
@@ -3998,9 +3941,25 @@
                   <w:pPr>
                     <w:suppressAutoHyphens/>
                     <w:autoSpaceDN w:val="0"/>
-                    <w:spacing w:after="0" w:line="360" w:lineRule="auto"/>
-                    <w:ind w:right="317"/>
-                    <w:jc w:val="both"/>
+                    <w:spacing w:after="0" w:line="276" w:lineRule="auto"/>
+                    <w:ind w:right="317"/>
+                    <w:textAlignment w:val="baseline"/>
+                    <w:rPr>
+                      <w:rFonts w:ascii="Times New Roman" w:hAnsi="Times New Roman"/>
+                      <w:bCs/>
+                      <w:color w:val="000000" w:themeColor="text1"/>
+                      <w:sz w:val="24"/>
+                      <w:szCs w:val="24"/>
+                      <w:lang w:val="en-US"/>
+                    </w:rPr>
+                  </w:pPr>
+                </w:p>
+                <w:p>
+                  <w:pPr>
+                    <w:suppressAutoHyphens/>
+                    <w:autoSpaceDN w:val="0"/>
+                    <w:spacing w:after="0" w:line="276" w:lineRule="auto"/>
+                    <w:ind w:right="317"/>
                     <w:textAlignment w:val="baseline"/>
                     <w:rPr>
                       <w:rFonts w:ascii="Times New Roman" w:hAnsi="Times New Roman"/>
@@ -4031,18 +3990,7 @@
                       <w:szCs w:val="24"/>
                       <w:lang w:val="en-US"/>
                     </w:rPr>
-                    <w:t>d.agendas[i].</w:t>
-                  </w:r>
-                  <w:r>
-                    <w:rPr>
-                      <w:rFonts w:ascii="Times New Roman" w:hAnsi="Times New Roman"/>
-                      <w:bCs/>
-                      <w:color w:val="000000" w:themeColor="text1"/>
-                      <w:sz w:val="24"/>
-                      <w:szCs w:val="24"/>
-                      <w:lang w:val="en-US"/>
-                    </w:rPr>
-                    <w:t>deferredApplications</w:t>
+                    <w:t>d.agendas[i].deferredApplications</w:t>
                   </w:r>
                   <w:r>
                     <w:rPr>
@@ -4065,9 +4013,8 @@
                   <w:pPr>
                     <w:suppressAutoHyphens/>
                     <w:autoSpaceDN w:val="0"/>
-                    <w:spacing w:after="0" w:line="360" w:lineRule="auto"/>
-                    <w:ind w:right="317"/>
-                    <w:jc w:val="both"/>
+                    <w:spacing w:after="0" w:line="276" w:lineRule="auto"/>
+                    <w:ind w:right="317"/>
                     <w:textAlignment w:val="baseline"/>
                     <w:rPr>
                       <w:rFonts w:ascii="Times New Roman" w:hAnsi="Times New Roman"/>
@@ -4098,18 +4045,7 @@
                       <w:szCs w:val="24"/>
                       <w:lang w:val="en-US"/>
                     </w:rPr>
-                    <w:t>d.agendas[i].</w:t>
-                  </w:r>
-                  <w:r>
-                    <w:rPr>
-                      <w:rFonts w:ascii="Times New Roman" w:hAnsi="Times New Roman"/>
-                      <w:bCs/>
-                      <w:color w:val="000000" w:themeColor="text1"/>
-                      <w:sz w:val="24"/>
-                      <w:szCs w:val="24"/>
-                      <w:lang w:val="en-US"/>
-                    </w:rPr>
-                    <w:t>deferredApplications</w:t>
+                    <w:t>d.agendas[i].deferredApplications</w:t>
                   </w:r>
                   <w:r>
                     <w:rPr>
@@ -4127,9 +4063,25 @@
                   <w:pPr>
                     <w:suppressAutoHyphens/>
                     <w:autoSpaceDN w:val="0"/>
-                    <w:spacing w:after="0" w:line="360" w:lineRule="auto"/>
-                    <w:ind w:right="317"/>
-                    <w:jc w:val="both"/>
+                    <w:spacing w:after="0" w:line="276" w:lineRule="auto"/>
+                    <w:ind w:right="317"/>
+                    <w:textAlignment w:val="baseline"/>
+                    <w:rPr>
+                      <w:rFonts w:ascii="Times New Roman" w:hAnsi="Times New Roman"/>
+                      <w:bCs/>
+                      <w:color w:val="000000" w:themeColor="text1"/>
+                      <w:sz w:val="24"/>
+                      <w:szCs w:val="24"/>
+                      <w:lang w:val="en-US"/>
+                    </w:rPr>
+                  </w:pPr>
+                </w:p>
+                <w:p>
+                  <w:pPr>
+                    <w:suppressAutoHyphens/>
+                    <w:autoSpaceDN w:val="0"/>
+                    <w:spacing w:after="0" w:line="276" w:lineRule="auto"/>
+                    <w:ind w:right="317"/>
                     <w:textAlignment w:val="baseline"/>
                     <w:rPr>
                       <w:rFonts w:ascii="Times New Roman" w:hAnsi="Times New Roman"/>
@@ -4160,18 +4112,7 @@
                       <w:szCs w:val="24"/>
                       <w:lang w:val="en-US"/>
                     </w:rPr>
-                    <w:t>d.agendas[i].</w:t>
-                  </w:r>
-                  <w:r>
-                    <w:rPr>
-                      <w:rFonts w:ascii="Times New Roman" w:hAnsi="Times New Roman"/>
-                      <w:bCs/>
-                      <w:color w:val="000000" w:themeColor="text1"/>
-                      <w:sz w:val="24"/>
-                      <w:szCs w:val="24"/>
-                      <w:lang w:val="en-US"/>
-                    </w:rPr>
-                    <w:t>deferredApplications</w:t>
+                    <w:t>d.agendas[i].deferredApplications</w:t>
                   </w:r>
                   <w:r>
                     <w:rPr>
@@ -4194,9 +4135,8 @@
                   <w:pPr>
                     <w:suppressAutoHyphens/>
                     <w:autoSpaceDN w:val="0"/>
-                    <w:spacing w:after="0" w:line="360" w:lineRule="auto"/>
-                    <w:ind w:right="317"/>
-                    <w:jc w:val="both"/>
+                    <w:spacing w:after="0" w:line="276" w:lineRule="auto"/>
+                    <w:ind w:right="317"/>
                     <w:textAlignment w:val="baseline"/>
                     <w:rPr>
                       <w:rFonts w:ascii="Times New Roman" w:hAnsi="Times New Roman"/>
@@ -4261,10 +4201,19 @@
                   <w:pPr>
                     <w:suppressAutoHyphens/>
                     <w:autoSpaceDN w:val="0"/>
-                    <w:spacing w:after="0" w:line="360" w:lineRule="auto"/>
-                    <w:ind w:right="317"/>
-                    <w:jc w:val="both"/>
-                    <w:textAlignment w:val="baseline"/>
+                    <w:spacing w:after="0" w:line="276" w:lineRule="auto"/>
+                    <w:ind w:right="317"/>
+                    <w:textAlignment w:val="baseline"/>
+                    <w:rPr>
+                      <w:rFonts w:ascii="Times New Roman" w:hAnsi="Times New Roman"/>
+                      <w:bCs/>
+                      <w:color w:val="000000" w:themeColor="text1"/>
+                      <w:sz w:val="24"/>
+                      <w:szCs w:val="24"/>
+                      <w:lang w:val="en-US"/>
+                    </w:rPr>
+                  </w:pPr>
+                  <w:r>
                     <w:rPr>
                       <w:rFonts w:ascii="Times New Roman" w:hAnsi="Times New Roman"/>
                       <w:b/>
@@ -4274,51 +4223,15 @@
                       <w:szCs w:val="24"/>
                       <w:lang w:val="en-US"/>
                     </w:rPr>
-                  </w:pPr>
-                  <w:r>
-                    <w:rPr>
-                      <w:rFonts w:ascii="Times New Roman" w:hAnsi="Times New Roman"/>
-                      <w:b/>
-                      <w:bCs/>
-                      <w:color w:val="000000" w:themeColor="text1"/>
-                      <w:sz w:val="24"/>
-                      <w:szCs w:val="24"/>
-                      <w:lang w:val="en-US"/>
-                    </w:rPr>
-                    <w:t>{d.agendas[i].</w:t>
-                  </w:r>
-                  <w:r>
-                    <w:rPr>
-                      <w:rFonts w:ascii="Times New Roman" w:hAnsi="Times New Roman"/>
-                      <w:b/>
-                      <w:bCs/>
-                      <w:color w:val="000000" w:themeColor="text1"/>
-                      <w:sz w:val="24"/>
-                      <w:szCs w:val="24"/>
-                      <w:lang w:val="en-US"/>
-                    </w:rPr>
-                    <w:t>deferredApplications</w:t>
-                  </w:r>
-                  <w:r>
-                    <w:rPr>
-                      <w:rFonts w:ascii="Times New Roman" w:hAnsi="Times New Roman"/>
-                      <w:b/>
-                      <w:bCs/>
-                      <w:color w:val="000000" w:themeColor="text1"/>
-                      <w:sz w:val="24"/>
-                      <w:szCs w:val="24"/>
-                      <w:lang w:val="en-US"/>
-                    </w:rPr>
-                    <w:t>[i].decision}</w:t>
-                  </w:r>
-                </w:p>
-                <w:p>
-                  <w:pPr>
-                    <w:suppressAutoHyphens/>
-                    <w:autoSpaceDN w:val="0"/>
-                    <w:spacing w:after="0" w:line="360" w:lineRule="auto"/>
-                    <w:ind w:right="317"/>
-                    <w:jc w:val="both"/>
+                    <w:t>{d.agendas[i].deferredApplications[i].decision}</w:t>
+                  </w:r>
+                </w:p>
+                <w:p>
+                  <w:pPr>
+                    <w:suppressAutoHyphens/>
+                    <w:autoSpaceDN w:val="0"/>
+                    <w:spacing w:after="0" w:line="276" w:lineRule="auto"/>
+                    <w:ind w:right="317"/>
                     <w:textAlignment w:val="baseline"/>
                     <w:rPr>
                       <w:rFonts w:ascii="Times New Roman" w:hAnsi="Times New Roman"/>
@@ -4349,29 +4262,7 @@
                       <w:szCs w:val="24"/>
                       <w:lang w:val="en-US"/>
                     </w:rPr>
-                    <w:t>d.agendas[i].</w:t>
-                  </w:r>
-                  <w:r>
-                    <w:rPr>
-                      <w:rFonts w:ascii="Times New Roman" w:hAnsi="Times New Roman"/>
-                      <w:bCs/>
-                      <w:color w:val="000000" w:themeColor="text1"/>
-                      <w:sz w:val="24"/>
-                      <w:szCs w:val="24"/>
-                      <w:lang w:val="en-US"/>
-                    </w:rPr>
-                    <w:t>deferredApplications</w:t>
-                  </w:r>
-                  <w:r>
-                    <w:rPr>
-                      <w:rFonts w:ascii="Times New Roman" w:hAnsi="Times New Roman"/>
-                      <w:bCs/>
-                      <w:color w:val="000000" w:themeColor="text1"/>
-                      <w:sz w:val="24"/>
-                      <w:szCs w:val="24"/>
-                      <w:lang w:val="en-US"/>
-                    </w:rPr>
-                    <w:t>[i</w:t>
+                    <w:t>d.agendas[i].deferredApplications[i</w:t>
                   </w:r>
                   <w:r>
                     <w:rPr>
@@ -4390,25 +4281,47 @@
             <w:tr>
               <w:tc>
                 <w:tcPr>
-                  <w:tcW w:w="1075" w:type="dxa"/>
+                  <w:tcW w:w="985" w:type="dxa"/>
                 </w:tcPr>
                 <w:p>
                   <w:pPr>
                     <w:suppressAutoHyphens/>
                     <w:autoSpaceDN w:val="0"/>
-                    <w:spacing w:after="0" w:line="360" w:lineRule="auto"/>
-                    <w:ind w:right="317"/>
-                    <w:jc w:val="both"/>
-                    <w:textAlignment w:val="baseline"/>
-                    <w:rPr>
-                      <w:rFonts w:ascii="Times New Roman" w:hAnsi="Times New Roman"/>
-                      <w:bCs/>
-                      <w:color w:val="000000" w:themeColor="text1"/>
-                      <w:sz w:val="24"/>
-                      <w:szCs w:val="24"/>
-                      <w:lang w:val="en-US"/>
-                    </w:rPr>
-                  </w:pPr>
+                    <w:spacing w:after="0" w:line="276" w:lineRule="auto"/>
+                    <w:ind w:right="317"/>
+                    <w:jc w:val="center"/>
+                    <w:textAlignment w:val="baseline"/>
+                    <w:rPr>
+                      <w:rFonts w:ascii="Times New Roman" w:hAnsi="Times New Roman"/>
+                      <w:bCs/>
+                      <w:color w:val="000000" w:themeColor="text1"/>
+                      <w:sz w:val="24"/>
+                      <w:szCs w:val="24"/>
+                      <w:lang w:val="en-US"/>
+                    </w:rPr>
+                  </w:pPr>
+                  <w:r>
+                    <w:rPr>
+                      <w:rFonts w:ascii="Times New Roman" w:hAnsi="Times New Roman"/>
+                      <w:bCs/>
+                      <w:color w:val="000000" w:themeColor="text1"/>
+                      <w:sz w:val="24"/>
+                      <w:szCs w:val="24"/>
+                      <w:lang w:val="en-US"/>
+                    </w:rPr>
+                    <w:t>{</w:t>
+                  </w:r>
+                  <w:r>
+                    <w:rPr>
+                      <w:rFonts w:ascii="Times New Roman" w:hAnsi="Times New Roman"/>
+                      <w:bCs/>
+                      <w:color w:val="000000" w:themeColor="text1"/>
+                      <w:sz w:val="24"/>
+                      <w:szCs w:val="24"/>
+                      <w:lang w:val="en-US"/>
+                    </w:rPr>
+                    <w:t>d.agen</w:t>
+                  </w:r>
                   <w:r>
                     <w:rPr>
                       <w:rFonts w:ascii="Times New Roman" w:hAnsi="Times New Roman"/>
@@ -4419,29 +4332,7 @@
                       <w:lang w:val="en-US"/>
                     </w:rPr>
                     <w:lastRenderedPageBreak/>
-                    <w:t>{</w:t>
-                  </w:r>
-                  <w:r>
-                    <w:rPr>
-                      <w:rFonts w:ascii="Times New Roman" w:hAnsi="Times New Roman"/>
-                      <w:bCs/>
-                      <w:color w:val="000000" w:themeColor="text1"/>
-                      <w:sz w:val="24"/>
-                      <w:szCs w:val="24"/>
-                      <w:lang w:val="en-US"/>
-                    </w:rPr>
-                    <w:t>d.agendas[i].</w:t>
-                  </w:r>
-                  <w:r>
-                    <w:rPr>
-                      <w:rFonts w:ascii="Times New Roman" w:hAnsi="Times New Roman"/>
-                      <w:bCs/>
-                      <w:color w:val="000000" w:themeColor="text1"/>
-                      <w:sz w:val="24"/>
-                      <w:szCs w:val="24"/>
-                      <w:lang w:val="en-US"/>
-                    </w:rPr>
-                    <w:t>deferredApplications</w:t>
+                    <w:t>das[i].deferredApplications</w:t>
                   </w:r>
                   <w:r>
                     <w:rPr>
@@ -4458,15 +4349,14 @@
               </w:tc>
               <w:tc>
                 <w:tcPr>
-                  <w:tcW w:w="1890" w:type="dxa"/>
+                  <w:tcW w:w="2160" w:type="dxa"/>
                 </w:tcPr>
                 <w:p>
                   <w:pPr>
                     <w:suppressAutoHyphens/>
                     <w:autoSpaceDN w:val="0"/>
-                    <w:spacing w:after="0" w:line="360" w:lineRule="auto"/>
-                    <w:ind w:right="317"/>
-                    <w:jc w:val="both"/>
+                    <w:spacing w:after="0" w:line="276" w:lineRule="auto"/>
+                    <w:ind w:right="317"/>
                     <w:textAlignment w:val="baseline"/>
                     <w:rPr>
                       <w:rFonts w:ascii="Times New Roman" w:hAnsi="Times New Roman"/>
@@ -4482,15 +4372,14 @@
               </w:tc>
               <w:tc>
                 <w:tcPr>
-                  <w:tcW w:w="1886" w:type="dxa"/>
+                  <w:tcW w:w="1706" w:type="dxa"/>
                 </w:tcPr>
                 <w:p>
                   <w:pPr>
                     <w:suppressAutoHyphens/>
                     <w:autoSpaceDN w:val="0"/>
-                    <w:spacing w:after="0" w:line="360" w:lineRule="auto"/>
-                    <w:ind w:right="317"/>
-                    <w:jc w:val="both"/>
+                    <w:spacing w:after="0" w:line="276" w:lineRule="auto"/>
+                    <w:ind w:right="317"/>
                     <w:textAlignment w:val="baseline"/>
                     <w:rPr>
                       <w:rFonts w:ascii="Times New Roman" w:hAnsi="Times New Roman"/>
@@ -4512,9 +4401,8 @@
                   <w:pPr>
                     <w:suppressAutoHyphens/>
                     <w:autoSpaceDN w:val="0"/>
-                    <w:spacing w:after="0" w:line="360" w:lineRule="auto"/>
-                    <w:ind w:right="317"/>
-                    <w:jc w:val="both"/>
+                    <w:spacing w:after="0" w:line="276" w:lineRule="auto"/>
+                    <w:ind w:right="317"/>
                     <w:textAlignment w:val="baseline"/>
                     <w:rPr>
                       <w:rFonts w:ascii="Times New Roman" w:hAnsi="Times New Roman"/>
@@ -4536,9 +4424,8 @@
                   <w:pPr>
                     <w:suppressAutoHyphens/>
                     <w:autoSpaceDN w:val="0"/>
-                    <w:spacing w:after="0" w:line="360" w:lineRule="auto"/>
-                    <w:ind w:right="317"/>
-                    <w:jc w:val="both"/>
+                    <w:spacing w:after="0" w:line="276" w:lineRule="auto"/>
+                    <w:ind w:right="317"/>
                     <w:textAlignment w:val="baseline"/>
                     <w:rPr>
                       <w:rFonts w:ascii="Times New Roman" w:hAnsi="Times New Roman"/>
@@ -4560,9 +4447,8 @@
                   <w:pPr>
                     <w:suppressAutoHyphens/>
                     <w:autoSpaceDN w:val="0"/>
-                    <w:spacing w:after="0" w:line="360" w:lineRule="auto"/>
-                    <w:ind w:right="317"/>
-                    <w:jc w:val="both"/>
+                    <w:spacing w:after="0" w:line="276" w:lineRule="auto"/>
+                    <w:ind w:right="317"/>
                     <w:textAlignment w:val="baseline"/>
                     <w:rPr>
                       <w:rFonts w:ascii="Times New Roman" w:hAnsi="Times New Roman"/>
@@ -4584,9 +4470,8 @@
                   <w:pPr>
                     <w:suppressAutoHyphens/>
                     <w:autoSpaceDN w:val="0"/>
-                    <w:spacing w:after="0" w:line="360" w:lineRule="auto"/>
-                    <w:ind w:right="317"/>
-                    <w:jc w:val="both"/>
+                    <w:spacing w:after="0" w:line="276" w:lineRule="auto"/>
+                    <w:ind w:right="317"/>
                     <w:textAlignment w:val="baseline"/>
                     <w:rPr>
                       <w:rFonts w:ascii="Times New Roman" w:hAnsi="Times New Roman"/>
@@ -4611,7 +4496,7 @@
                   <w:pPr>
                     <w:suppressAutoHyphens/>
                     <w:autoSpaceDN w:val="0"/>
-                    <w:spacing w:after="0" w:line="360" w:lineRule="auto"/>
+                    <w:spacing w:after="0" w:line="276" w:lineRule="auto"/>
                     <w:ind w:right="317"/>
                     <w:jc w:val="center"/>
                     <w:textAlignment w:val="baseline"/>
@@ -4633,6 +4518,7 @@
                       <w:szCs w:val="24"/>
                       <w:lang w:val="en-US"/>
                     </w:rPr>
+                    <w:lastRenderedPageBreak/>
                     <w:t>DEFERRED</w:t>
                   </w:r>
                   <w:r>
@@ -4722,15 +4608,15 @@
             <w:tr>
               <w:tc>
                 <w:tcPr>
-                  <w:tcW w:w="1075" w:type="dxa"/>
+                  <w:tcW w:w="985" w:type="dxa"/>
                 </w:tcPr>
                 <w:p>
                   <w:pPr>
                     <w:suppressAutoHyphens/>
                     <w:autoSpaceDN w:val="0"/>
-                    <w:spacing w:after="0" w:line="360" w:lineRule="auto"/>
-                    <w:ind w:right="317"/>
-                    <w:jc w:val="both"/>
+                    <w:spacing w:after="0" w:line="276" w:lineRule="auto"/>
+                    <w:ind w:right="317"/>
+                    <w:jc w:val="center"/>
                     <w:textAlignment w:val="baseline"/>
                     <w:rPr>
                       <w:rFonts w:ascii="Times New Roman" w:hAnsi="Times New Roman"/>
@@ -4761,18 +4647,7 @@
                       <w:szCs w:val="24"/>
                       <w:lang w:val="en-US"/>
                     </w:rPr>
-                    <w:t>d.agendas[i].</w:t>
-                  </w:r>
-                  <w:r>
-                    <w:rPr>
-                      <w:rFonts w:ascii="Times New Roman" w:hAnsi="Times New Roman"/>
-                      <w:bCs/>
-                      <w:color w:val="000000" w:themeColor="text1"/>
-                      <w:sz w:val="24"/>
-                      <w:szCs w:val="24"/>
-                      <w:lang w:val="en-US"/>
-                    </w:rPr>
-                    <w:t>rejectedApplications</w:t>
+                    <w:t>d.agendas[i].rejectedApplications</w:t>
                   </w:r>
                   <w:r>
                     <w:rPr>
@@ -4794,18 +4669,7 @@
                       <w:szCs w:val="24"/>
                       <w:lang w:val="en-US"/>
                     </w:rPr>
-                    <w:t>d.agendas[i].</w:t>
-                  </w:r>
-                  <w:r>
-                    <w:rPr>
-                      <w:rFonts w:ascii="Times New Roman" w:hAnsi="Times New Roman"/>
-                      <w:bCs/>
-                      <w:color w:val="000000" w:themeColor="text1"/>
-                      <w:sz w:val="24"/>
-                      <w:szCs w:val="24"/>
-                      <w:lang w:val="en-US"/>
-                    </w:rPr>
-                    <w:t>rejectedApplications</w:t>
+                    <w:t>d.agendas[i].rejectedApplications</w:t>
                   </w:r>
                   <w:r>
                     <w:rPr>
@@ -4822,15 +4686,14 @@
               </w:tc>
               <w:tc>
                 <w:tcPr>
-                  <w:tcW w:w="1890" w:type="dxa"/>
+                  <w:tcW w:w="2160" w:type="dxa"/>
                 </w:tcPr>
                 <w:p>
                   <w:pPr>
                     <w:suppressAutoHyphens/>
                     <w:autoSpaceDN w:val="0"/>
-                    <w:spacing w:after="0" w:line="360" w:lineRule="auto"/>
-                    <w:ind w:right="317"/>
-                    <w:jc w:val="both"/>
+                    <w:spacing w:after="0" w:line="276" w:lineRule="auto"/>
+                    <w:ind w:right="317"/>
                     <w:textAlignment w:val="baseline"/>
                     <w:rPr>
                       <w:rFonts w:ascii="Times New Roman" w:hAnsi="Times New Roman"/>
@@ -4861,18 +4724,7 @@
                       <w:szCs w:val="24"/>
                       <w:lang w:val="en-US"/>
                     </w:rPr>
-                    <w:t>d.agendas[i].</w:t>
-                  </w:r>
-                  <w:r>
-                    <w:rPr>
-                      <w:rFonts w:ascii="Times New Roman" w:hAnsi="Times New Roman"/>
-                      <w:bCs/>
-                      <w:color w:val="000000" w:themeColor="text1"/>
-                      <w:sz w:val="24"/>
-                      <w:szCs w:val="24"/>
-                      <w:lang w:val="en-US"/>
-                    </w:rPr>
-                    <w:t>rejectedApplications</w:t>
+                    <w:t>d.agendas[i].rejectedApplications</w:t>
                   </w:r>
                   <w:r>
                     <w:rPr>
@@ -4890,9 +4742,8 @@
                   <w:pPr>
                     <w:suppressAutoHyphens/>
                     <w:autoSpaceDN w:val="0"/>
-                    <w:spacing w:after="0" w:line="360" w:lineRule="auto"/>
-                    <w:ind w:right="317"/>
-                    <w:jc w:val="both"/>
+                    <w:spacing w:after="0" w:line="276" w:lineRule="auto"/>
+                    <w:ind w:right="317"/>
                     <w:textAlignment w:val="baseline"/>
                     <w:rPr>
                       <w:rFonts w:ascii="Times New Roman" w:hAnsi="Times New Roman"/>
@@ -4940,15 +4791,14 @@
               </w:tc>
               <w:tc>
                 <w:tcPr>
-                  <w:tcW w:w="1886" w:type="dxa"/>
+                  <w:tcW w:w="1706" w:type="dxa"/>
                 </w:tcPr>
                 <w:p>
                   <w:pPr>
                     <w:suppressAutoHyphens/>
                     <w:autoSpaceDN w:val="0"/>
-                    <w:spacing w:after="0" w:line="360" w:lineRule="auto"/>
-                    <w:ind w:right="317"/>
-                    <w:jc w:val="both"/>
+                    <w:spacing w:after="0" w:line="276" w:lineRule="auto"/>
+                    <w:ind w:right="317"/>
                     <w:textAlignment w:val="baseline"/>
                     <w:rPr>
                       <w:rFonts w:ascii="Times New Roman" w:hAnsi="Times New Roman"/>
@@ -4979,18 +4829,7 @@
                       <w:szCs w:val="24"/>
                       <w:lang w:val="en-US"/>
                     </w:rPr>
-                    <w:t>d.agendas[i].</w:t>
-                  </w:r>
-                  <w:r>
-                    <w:rPr>
-                      <w:rFonts w:ascii="Times New Roman" w:hAnsi="Times New Roman"/>
-                      <w:bCs/>
-                      <w:color w:val="000000" w:themeColor="text1"/>
-                      <w:sz w:val="24"/>
-                      <w:szCs w:val="24"/>
-                      <w:lang w:val="en-US"/>
-                    </w:rPr>
-                    <w:t>rejectedApplications</w:t>
+                    <w:t>d.agendas[i].rejectedApplications</w:t>
                   </w:r>
                   <w:r>
                     <w:rPr>
@@ -5013,9 +4852,8 @@
                   <w:pPr>
                     <w:suppressAutoHyphens/>
                     <w:autoSpaceDN w:val="0"/>
-                    <w:spacing w:after="0" w:line="360" w:lineRule="auto"/>
-                    <w:ind w:right="317"/>
-                    <w:jc w:val="both"/>
+                    <w:spacing w:after="0" w:line="276" w:lineRule="auto"/>
+                    <w:ind w:right="317"/>
                     <w:textAlignment w:val="baseline"/>
                     <w:rPr>
                       <w:rFonts w:ascii="Times New Roman" w:hAnsi="Times New Roman"/>
@@ -5046,18 +4884,7 @@
                       <w:szCs w:val="24"/>
                       <w:lang w:val="en-US"/>
                     </w:rPr>
-                    <w:t>d.agendas[i].</w:t>
-                  </w:r>
-                  <w:r>
-                    <w:rPr>
-                      <w:rFonts w:ascii="Times New Roman" w:hAnsi="Times New Roman"/>
-                      <w:bCs/>
-                      <w:color w:val="000000" w:themeColor="text1"/>
-                      <w:sz w:val="24"/>
-                      <w:szCs w:val="24"/>
-                      <w:lang w:val="en-US"/>
-                    </w:rPr>
-                    <w:t>rejectedApplications</w:t>
+                    <w:t>d.agendas[i].rejectedApplications</w:t>
                   </w:r>
                   <w:r>
                     <w:rPr>
@@ -5075,9 +4902,25 @@
                   <w:pPr>
                     <w:suppressAutoHyphens/>
                     <w:autoSpaceDN w:val="0"/>
-                    <w:spacing w:after="0" w:line="360" w:lineRule="auto"/>
-                    <w:ind w:right="317"/>
-                    <w:jc w:val="both"/>
+                    <w:spacing w:after="0" w:line="276" w:lineRule="auto"/>
+                    <w:ind w:right="317"/>
+                    <w:textAlignment w:val="baseline"/>
+                    <w:rPr>
+                      <w:rFonts w:ascii="Times New Roman" w:hAnsi="Times New Roman"/>
+                      <w:bCs/>
+                      <w:color w:val="000000" w:themeColor="text1"/>
+                      <w:sz w:val="24"/>
+                      <w:szCs w:val="24"/>
+                      <w:lang w:val="en-US"/>
+                    </w:rPr>
+                  </w:pPr>
+                </w:p>
+                <w:p>
+                  <w:pPr>
+                    <w:suppressAutoHyphens/>
+                    <w:autoSpaceDN w:val="0"/>
+                    <w:spacing w:after="0" w:line="276" w:lineRule="auto"/>
+                    <w:ind w:right="317"/>
                     <w:textAlignment w:val="baseline"/>
                     <w:rPr>
                       <w:rFonts w:ascii="Times New Roman" w:hAnsi="Times New Roman"/>
@@ -5108,18 +4951,7 @@
                       <w:szCs w:val="24"/>
                       <w:lang w:val="en-US"/>
                     </w:rPr>
-                    <w:t>d.agendas[i].</w:t>
-                  </w:r>
-                  <w:r>
-                    <w:rPr>
-                      <w:rFonts w:ascii="Times New Roman" w:hAnsi="Times New Roman"/>
-                      <w:bCs/>
-                      <w:color w:val="000000" w:themeColor="text1"/>
-                      <w:sz w:val="24"/>
-                      <w:szCs w:val="24"/>
-                      <w:lang w:val="en-US"/>
-                    </w:rPr>
-                    <w:t>rejectedApplications</w:t>
+                    <w:t>d.agendas[i].rejectedApplications</w:t>
                   </w:r>
                   <w:r>
                     <w:rPr>
@@ -5142,9 +4974,8 @@
                   <w:pPr>
                     <w:suppressAutoHyphens/>
                     <w:autoSpaceDN w:val="0"/>
-                    <w:spacing w:after="0" w:line="360" w:lineRule="auto"/>
-                    <w:ind w:right="317"/>
-                    <w:jc w:val="both"/>
+                    <w:spacing w:after="0" w:line="276" w:lineRule="auto"/>
+                    <w:ind w:right="317"/>
                     <w:textAlignment w:val="baseline"/>
                     <w:rPr>
                       <w:rFonts w:ascii="Times New Roman" w:hAnsi="Times New Roman"/>
@@ -5175,18 +5006,7 @@
                       <w:szCs w:val="24"/>
                       <w:lang w:val="en-US"/>
                     </w:rPr>
-                    <w:t>d.agendas[i].</w:t>
-                  </w:r>
-                  <w:r>
-                    <w:rPr>
-                      <w:rFonts w:ascii="Times New Roman" w:hAnsi="Times New Roman"/>
-                      <w:bCs/>
-                      <w:color w:val="000000" w:themeColor="text1"/>
-                      <w:sz w:val="24"/>
-                      <w:szCs w:val="24"/>
-                      <w:lang w:val="en-US"/>
-                    </w:rPr>
-                    <w:t>rejectedApplications</w:t>
+                    <w:t>d.agendas[i].rejectedApplications</w:t>
                   </w:r>
                   <w:r>
                     <w:rPr>
@@ -5204,9 +5024,25 @@
                   <w:pPr>
                     <w:suppressAutoHyphens/>
                     <w:autoSpaceDN w:val="0"/>
-                    <w:spacing w:after="0" w:line="360" w:lineRule="auto"/>
-                    <w:ind w:right="317"/>
-                    <w:jc w:val="both"/>
+                    <w:spacing w:after="0" w:line="276" w:lineRule="auto"/>
+                    <w:ind w:right="317"/>
+                    <w:textAlignment w:val="baseline"/>
+                    <w:rPr>
+                      <w:rFonts w:ascii="Times New Roman" w:hAnsi="Times New Roman"/>
+                      <w:bCs/>
+                      <w:color w:val="000000" w:themeColor="text1"/>
+                      <w:sz w:val="24"/>
+                      <w:szCs w:val="24"/>
+                      <w:lang w:val="en-US"/>
+                    </w:rPr>
+                  </w:pPr>
+                </w:p>
+                <w:p>
+                  <w:pPr>
+                    <w:suppressAutoHyphens/>
+                    <w:autoSpaceDN w:val="0"/>
+                    <w:spacing w:after="0" w:line="276" w:lineRule="auto"/>
+                    <w:ind w:right="317"/>
                     <w:textAlignment w:val="baseline"/>
                     <w:rPr>
                       <w:rFonts w:ascii="Times New Roman" w:hAnsi="Times New Roman"/>
@@ -5237,18 +5073,7 @@
                       <w:szCs w:val="24"/>
                       <w:lang w:val="en-US"/>
                     </w:rPr>
-                    <w:t>d.agendas[i].</w:t>
-                  </w:r>
-                  <w:r>
-                    <w:rPr>
-                      <w:rFonts w:ascii="Times New Roman" w:hAnsi="Times New Roman"/>
-                      <w:bCs/>
-                      <w:color w:val="000000" w:themeColor="text1"/>
-                      <w:sz w:val="24"/>
-                      <w:szCs w:val="24"/>
-                      <w:lang w:val="en-US"/>
-                    </w:rPr>
-                    <w:t>rejectedApplications</w:t>
+                    <w:t>d.agendas[i].rejectedApplications</w:t>
                   </w:r>
                   <w:r>
                     <w:rPr>
@@ -5271,9 +5096,8 @@
                   <w:pPr>
                     <w:suppressAutoHyphens/>
                     <w:autoSpaceDN w:val="0"/>
-                    <w:spacing w:after="0" w:line="360" w:lineRule="auto"/>
-                    <w:ind w:right="317"/>
-                    <w:jc w:val="both"/>
+                    <w:spacing w:after="0" w:line="276" w:lineRule="auto"/>
+                    <w:ind w:right="317"/>
                     <w:textAlignment w:val="baseline"/>
                     <w:rPr>
                       <w:rFonts w:ascii="Times New Roman" w:hAnsi="Times New Roman"/>
@@ -5304,18 +5128,7 @@
                       <w:szCs w:val="24"/>
                       <w:lang w:val="en-US"/>
                     </w:rPr>
-                    <w:t>d.agendas[i].</w:t>
-                  </w:r>
-                  <w:r>
-                    <w:rPr>
-                      <w:rFonts w:ascii="Times New Roman" w:hAnsi="Times New Roman"/>
-                      <w:bCs/>
-                      <w:color w:val="000000" w:themeColor="text1"/>
-                      <w:sz w:val="24"/>
-                      <w:szCs w:val="24"/>
-                      <w:lang w:val="en-US"/>
-                    </w:rPr>
-                    <w:t>rejectedApplications</w:t>
+                    <w:t>d.agendas[i].rejectedApplications</w:t>
                   </w:r>
                   <w:r>
                     <w:rPr>
@@ -5338,10 +5151,19 @@
                   <w:pPr>
                     <w:suppressAutoHyphens/>
                     <w:autoSpaceDN w:val="0"/>
-                    <w:spacing w:after="0" w:line="360" w:lineRule="auto"/>
-                    <w:ind w:right="317"/>
-                    <w:jc w:val="both"/>
-                    <w:textAlignment w:val="baseline"/>
+                    <w:spacing w:after="0" w:line="276" w:lineRule="auto"/>
+                    <w:ind w:right="317"/>
+                    <w:textAlignment w:val="baseline"/>
+                    <w:rPr>
+                      <w:rFonts w:ascii="Times New Roman" w:hAnsi="Times New Roman"/>
+                      <w:bCs/>
+                      <w:color w:val="000000" w:themeColor="text1"/>
+                      <w:sz w:val="24"/>
+                      <w:szCs w:val="24"/>
+                      <w:lang w:val="en-US"/>
+                    </w:rPr>
+                  </w:pPr>
+                  <w:r>
                     <w:rPr>
                       <w:rFonts w:ascii="Times New Roman" w:hAnsi="Times New Roman"/>
                       <w:b/>
@@ -5351,51 +5173,15 @@
                       <w:szCs w:val="24"/>
                       <w:lang w:val="en-US"/>
                     </w:rPr>
-                  </w:pPr>
-                  <w:r>
-                    <w:rPr>
-                      <w:rFonts w:ascii="Times New Roman" w:hAnsi="Times New Roman"/>
-                      <w:b/>
-                      <w:bCs/>
-                      <w:color w:val="000000" w:themeColor="text1"/>
-                      <w:sz w:val="24"/>
-                      <w:szCs w:val="24"/>
-                      <w:lang w:val="en-US"/>
-                    </w:rPr>
-                    <w:t>{d.agendas[i].</w:t>
-                  </w:r>
-                  <w:r>
-                    <w:rPr>
-                      <w:rFonts w:ascii="Times New Roman" w:hAnsi="Times New Roman"/>
-                      <w:b/>
-                      <w:bCs/>
-                      <w:color w:val="000000" w:themeColor="text1"/>
-                      <w:sz w:val="24"/>
-                      <w:szCs w:val="24"/>
-                      <w:lang w:val="en-US"/>
-                    </w:rPr>
-                    <w:t>rejectedApplications</w:t>
-                  </w:r>
-                  <w:r>
-                    <w:rPr>
-                      <w:rFonts w:ascii="Times New Roman" w:hAnsi="Times New Roman"/>
-                      <w:b/>
-                      <w:bCs/>
-                      <w:color w:val="000000" w:themeColor="text1"/>
-                      <w:sz w:val="24"/>
-                      <w:szCs w:val="24"/>
-                      <w:lang w:val="en-US"/>
-                    </w:rPr>
-                    <w:t>[i].decision}</w:t>
-                  </w:r>
-                </w:p>
-                <w:p>
-                  <w:pPr>
-                    <w:suppressAutoHyphens/>
-                    <w:autoSpaceDN w:val="0"/>
-                    <w:spacing w:after="0" w:line="360" w:lineRule="auto"/>
-                    <w:ind w:right="317"/>
-                    <w:jc w:val="both"/>
+                    <w:t>{d.agendas[i].rejectedApplications[i].decision}</w:t>
+                  </w:r>
+                </w:p>
+                <w:p>
+                  <w:pPr>
+                    <w:suppressAutoHyphens/>
+                    <w:autoSpaceDN w:val="0"/>
+                    <w:spacing w:after="0" w:line="276" w:lineRule="auto"/>
+                    <w:ind w:right="317"/>
                     <w:textAlignment w:val="baseline"/>
                     <w:rPr>
                       <w:rFonts w:ascii="Times New Roman" w:hAnsi="Times New Roman"/>
@@ -5426,29 +5212,7 @@
                       <w:szCs w:val="24"/>
                       <w:lang w:val="en-US"/>
                     </w:rPr>
-                    <w:t>d.agendas[i].</w:t>
-                  </w:r>
-                  <w:r>
-                    <w:rPr>
-                      <w:rFonts w:ascii="Times New Roman" w:hAnsi="Times New Roman"/>
-                      <w:bCs/>
-                      <w:color w:val="000000" w:themeColor="text1"/>
-                      <w:sz w:val="24"/>
-                      <w:szCs w:val="24"/>
-                      <w:lang w:val="en-US"/>
-                    </w:rPr>
-                    <w:t>rejectedApplications</w:t>
-                  </w:r>
-                  <w:r>
-                    <w:rPr>
-                      <w:rFonts w:ascii="Times New Roman" w:hAnsi="Times New Roman"/>
-                      <w:bCs/>
-                      <w:color w:val="000000" w:themeColor="text1"/>
-                      <w:sz w:val="24"/>
-                      <w:szCs w:val="24"/>
-                      <w:lang w:val="en-US"/>
-                    </w:rPr>
-                    <w:t>[i</w:t>
+                    <w:t>d.agendas[i].rejectedApplications[i</w:t>
                   </w:r>
                   <w:r>
                     <w:rPr>
@@ -5467,15 +5231,15 @@
             <w:tr>
               <w:tc>
                 <w:tcPr>
-                  <w:tcW w:w="1075" w:type="dxa"/>
+                  <w:tcW w:w="985" w:type="dxa"/>
                 </w:tcPr>
                 <w:p>
                   <w:pPr>
                     <w:suppressAutoHyphens/>
                     <w:autoSpaceDN w:val="0"/>
-                    <w:spacing w:after="0" w:line="360" w:lineRule="auto"/>
-                    <w:ind w:right="317"/>
-                    <w:jc w:val="both"/>
+                    <w:spacing w:after="0" w:line="276" w:lineRule="auto"/>
+                    <w:ind w:right="317"/>
+                    <w:jc w:val="center"/>
                     <w:textAlignment w:val="baseline"/>
                     <w:rPr>
                       <w:rFonts w:ascii="Times New Roman" w:hAnsi="Times New Roman"/>
@@ -5506,55 +5270,31 @@
                       <w:szCs w:val="24"/>
                       <w:lang w:val="en-US"/>
                     </w:rPr>
-                    <w:t>d.agendas[i].</w:t>
-                  </w:r>
-                  <w:r>
-                    <w:rPr>
-                      <w:rFonts w:ascii="Times New Roman" w:hAnsi="Times New Roman"/>
-                      <w:bCs/>
-                      <w:color w:val="000000" w:themeColor="text1"/>
-                      <w:sz w:val="24"/>
-                      <w:szCs w:val="24"/>
-                      <w:lang w:val="en-US"/>
-                    </w:rPr>
-                    <w:t>rejectedApplications</w:t>
-                  </w:r>
-                  <w:r>
-                    <w:rPr>
-                      <w:rFonts w:ascii="Times New Roman" w:hAnsi="Times New Roman"/>
-                      <w:bCs/>
-                      <w:color w:val="000000" w:themeColor="text1"/>
-                      <w:sz w:val="24"/>
-                      <w:szCs w:val="24"/>
-                      <w:lang w:val="en-US"/>
-                    </w:rPr>
-                    <w:t>[</w:t>
-                  </w:r>
-                  <w:r>
-                    <w:rPr>
-                      <w:rFonts w:ascii="Times New Roman" w:hAnsi="Times New Roman"/>
-                      <w:bCs/>
-                      <w:color w:val="000000" w:themeColor="text1"/>
-                      <w:sz w:val="24"/>
-                      <w:szCs w:val="24"/>
-                      <w:lang w:val="en-US"/>
-                    </w:rPr>
-                    <w:lastRenderedPageBreak/>
-                    <w:t>i+1]}</w:t>
+                    <w:t>d.agendas[i].rejectedApplications</w:t>
+                  </w:r>
+                  <w:r>
+                    <w:rPr>
+                      <w:rFonts w:ascii="Times New Roman" w:hAnsi="Times New Roman"/>
+                      <w:bCs/>
+                      <w:color w:val="000000" w:themeColor="text1"/>
+                      <w:sz w:val="24"/>
+                      <w:szCs w:val="24"/>
+                      <w:lang w:val="en-US"/>
+                    </w:rPr>
+                    <w:t>[i+1]}</w:t>
                   </w:r>
                 </w:p>
               </w:tc>
               <w:tc>
                 <w:tcPr>
-                  <w:tcW w:w="1890" w:type="dxa"/>
+                  <w:tcW w:w="2160" w:type="dxa"/>
                 </w:tcPr>
                 <w:p>
                   <w:pPr>
                     <w:suppressAutoHyphens/>
                     <w:autoSpaceDN w:val="0"/>
-                    <w:spacing w:after="0" w:line="360" w:lineRule="auto"/>
-                    <w:ind w:right="317"/>
-                    <w:jc w:val="both"/>
+                    <w:spacing w:after="0" w:line="276" w:lineRule="auto"/>
+                    <w:ind w:right="317"/>
                     <w:textAlignment w:val="baseline"/>
                     <w:rPr>
                       <w:rFonts w:ascii="Times New Roman" w:hAnsi="Times New Roman"/>
@@ -5570,15 +5310,14 @@
               </w:tc>
               <w:tc>
                 <w:tcPr>
-                  <w:tcW w:w="1886" w:type="dxa"/>
+                  <w:tcW w:w="1706" w:type="dxa"/>
                 </w:tcPr>
                 <w:p>
                   <w:pPr>
                     <w:suppressAutoHyphens/>
                     <w:autoSpaceDN w:val="0"/>
-                    <w:spacing w:after="0" w:line="360" w:lineRule="auto"/>
-                    <w:ind w:right="317"/>
-                    <w:jc w:val="both"/>
+                    <w:spacing w:after="0" w:line="276" w:lineRule="auto"/>
+                    <w:ind w:right="317"/>
                     <w:textAlignment w:val="baseline"/>
                     <w:rPr>
                       <w:rFonts w:ascii="Times New Roman" w:hAnsi="Times New Roman"/>
@@ -5600,9 +5339,8 @@
                   <w:pPr>
                     <w:suppressAutoHyphens/>
                     <w:autoSpaceDN w:val="0"/>
-                    <w:spacing w:after="0" w:line="360" w:lineRule="auto"/>
-                    <w:ind w:right="317"/>
-                    <w:jc w:val="both"/>
+                    <w:spacing w:after="0" w:line="276" w:lineRule="auto"/>
+                    <w:ind w:right="317"/>
                     <w:textAlignment w:val="baseline"/>
                     <w:rPr>
                       <w:rFonts w:ascii="Times New Roman" w:hAnsi="Times New Roman"/>
@@ -5624,9 +5362,8 @@
                   <w:pPr>
                     <w:suppressAutoHyphens/>
                     <w:autoSpaceDN w:val="0"/>
-                    <w:spacing w:after="0" w:line="360" w:lineRule="auto"/>
-                    <w:ind w:right="317"/>
-                    <w:jc w:val="both"/>
+                    <w:spacing w:after="0" w:line="276" w:lineRule="auto"/>
+                    <w:ind w:right="317"/>
                     <w:textAlignment w:val="baseline"/>
                     <w:rPr>
                       <w:rFonts w:ascii="Times New Roman" w:hAnsi="Times New Roman"/>
@@ -5648,9 +5385,8 @@
                   <w:pPr>
                     <w:suppressAutoHyphens/>
                     <w:autoSpaceDN w:val="0"/>
-                    <w:spacing w:after="0" w:line="360" w:lineRule="auto"/>
-                    <w:ind w:right="317"/>
-                    <w:jc w:val="both"/>
+                    <w:spacing w:after="0" w:line="276" w:lineRule="auto"/>
+                    <w:ind w:right="317"/>
                     <w:textAlignment w:val="baseline"/>
                     <w:rPr>
                       <w:rFonts w:ascii="Times New Roman" w:hAnsi="Times New Roman"/>
@@ -5672,9 +5408,8 @@
                   <w:pPr>
                     <w:suppressAutoHyphens/>
                     <w:autoSpaceDN w:val="0"/>
-                    <w:spacing w:after="0" w:line="360" w:lineRule="auto"/>
-                    <w:ind w:right="317"/>
-                    <w:jc w:val="both"/>
+                    <w:spacing w:after="0" w:line="276" w:lineRule="auto"/>
+                    <w:ind w:right="317"/>
                     <w:textAlignment w:val="baseline"/>
                     <w:rPr>
                       <w:rFonts w:ascii="Times New Roman" w:hAnsi="Times New Roman"/>
@@ -5699,7 +5434,7 @@
                   <w:pPr>
                     <w:suppressAutoHyphens/>
                     <w:autoSpaceDN w:val="0"/>
-                    <w:spacing w:after="0" w:line="360" w:lineRule="auto"/>
+                    <w:spacing w:after="0" w:line="276" w:lineRule="auto"/>
                     <w:ind w:right="317"/>
                     <w:jc w:val="center"/>
                     <w:textAlignment w:val="baseline"/>
@@ -5721,7 +5456,6 @@
                       <w:szCs w:val="24"/>
                       <w:lang w:val="en-US"/>
                     </w:rPr>
-                    <w:lastRenderedPageBreak/>
                     <w:t>REJECTED</w:t>
                   </w:r>
                   <w:r>
@@ -5804,7 +5538,7 @@
             <w:pPr>
               <w:suppressAutoHyphens/>
               <w:autoSpaceDN w:val="0"/>
-              <w:spacing w:after="0" w:line="360" w:lineRule="auto"/>
+              <w:spacing w:after="0" w:line="276" w:lineRule="auto"/>
               <w:ind w:right="317"/>
               <w:textAlignment w:val="baseline"/>
               <w:rPr>
@@ -6188,22 +5922,25 @@
               <w:tblLook w:val="04A0"/>
             </w:tblPr>
             <w:tblGrid>
-              <w:gridCol w:w="895"/>
-              <w:gridCol w:w="2700"/>
-              <w:gridCol w:w="2970"/>
-              <w:gridCol w:w="224"/>
-              <w:gridCol w:w="1846"/>
-              <w:gridCol w:w="2681"/>
+              <w:gridCol w:w="985"/>
+              <w:gridCol w:w="2880"/>
+              <w:gridCol w:w="2924"/>
+              <w:gridCol w:w="136"/>
+              <w:gridCol w:w="1710"/>
+              <w:gridCol w:w="630"/>
+              <w:gridCol w:w="2051"/>
             </w:tblGrid>
             <w:tr>
               <w:tc>
                 <w:tcPr>
-                  <w:tcW w:w="895" w:type="dxa"/>
+                  <w:tcW w:w="985" w:type="dxa"/>
                 </w:tcPr>
                 <w:bookmarkEnd w:id="39"/>
                 <w:bookmarkEnd w:id="40"/>
                 <w:p>
                   <w:pPr>
+                    <w:spacing w:line="276" w:lineRule="auto"/>
+                    <w:jc w:val="center"/>
                     <w:rPr>
                       <w:rFonts w:ascii="Times New Roman" w:hAnsi="Times New Roman"/>
                       <w:b/>
@@ -6226,10 +5963,11 @@
               </w:tc>
               <w:tc>
                 <w:tcPr>
-                  <w:tcW w:w="2700" w:type="dxa"/>
+                  <w:tcW w:w="2880" w:type="dxa"/>
                 </w:tcPr>
                 <w:p>
                   <w:pPr>
+                    <w:spacing w:line="276" w:lineRule="auto"/>
                     <w:rPr>
                       <w:rFonts w:ascii="Times New Roman" w:hAnsi="Times New Roman"/>
                       <w:b/>
@@ -6252,10 +5990,12 @@
               </w:tc>
               <w:tc>
                 <w:tcPr>
-                  <w:tcW w:w="2970" w:type="dxa"/>
+                  <w:tcW w:w="3060" w:type="dxa"/>
+                  <w:gridSpan w:val="2"/>
                 </w:tcPr>
                 <w:p>
                   <w:pPr>
+                    <w:spacing w:line="276" w:lineRule="auto"/>
                     <w:rPr>
                       <w:rFonts w:ascii="Times New Roman" w:hAnsi="Times New Roman"/>
                       <w:b/>
@@ -6278,11 +6018,12 @@
               </w:tc>
               <w:tc>
                 <w:tcPr>
-                  <w:tcW w:w="2070" w:type="dxa"/>
+                  <w:tcW w:w="2340" w:type="dxa"/>
                   <w:gridSpan w:val="2"/>
                 </w:tcPr>
                 <w:p>
                   <w:pPr>
+                    <w:spacing w:line="276" w:lineRule="auto"/>
                     <w:rPr>
                       <w:rFonts w:ascii="Times New Roman" w:hAnsi="Times New Roman"/>
                       <w:b/>
@@ -6305,10 +6046,11 @@
               </w:tc>
               <w:tc>
                 <w:tcPr>
-                  <w:tcW w:w="2681" w:type="dxa"/>
+                  <w:tcW w:w="2051" w:type="dxa"/>
                 </w:tcPr>
                 <w:p>
                   <w:pPr>
+                    <w:spacing w:line="276" w:lineRule="auto"/>
                     <w:rPr>
                       <w:rFonts w:ascii="Times New Roman" w:hAnsi="Times New Roman"/>
                       <w:b/>
@@ -6333,15 +6075,15 @@
             <w:tr>
               <w:tc>
                 <w:tcPr>
-                  <w:tcW w:w="895" w:type="dxa"/>
+                  <w:tcW w:w="985" w:type="dxa"/>
                 </w:tcPr>
                 <w:p>
                   <w:pPr>
                     <w:suppressAutoHyphens/>
                     <w:autoSpaceDN w:val="0"/>
-                    <w:spacing w:after="0" w:line="360" w:lineRule="auto"/>
-                    <w:ind w:right="317"/>
-                    <w:jc w:val="both"/>
+                    <w:spacing w:after="0" w:line="276" w:lineRule="auto"/>
+                    <w:ind w:right="317"/>
+                    <w:jc w:val="center"/>
                     <w:textAlignment w:val="baseline"/>
                     <w:rPr>
                       <w:rFonts w:ascii="Times New Roman" w:hAnsi="Times New Roman"/>
@@ -6363,6 +6105,7 @@
                       <w:szCs w:val="24"/>
                       <w:lang w:val="en-US"/>
                     </w:rPr>
+                    <w:lastRenderedPageBreak/>
                     <w:t>{</w:t>
                   </w:r>
                   <w:r>
@@ -6481,29 +6224,28 @@
               </w:tc>
               <w:tc>
                 <w:tcPr>
-                  <w:tcW w:w="2700" w:type="dxa"/>
+                  <w:tcW w:w="2880" w:type="dxa"/>
                 </w:tcPr>
                 <w:p>
                   <w:pPr>
                     <w:suppressAutoHyphens/>
                     <w:autoSpaceDN w:val="0"/>
-                    <w:spacing w:after="0" w:line="360" w:lineRule="auto"/>
-                    <w:ind w:right="317"/>
-                    <w:jc w:val="both"/>
-                    <w:textAlignment w:val="baseline"/>
-                    <w:rPr>
-                      <w:rFonts w:ascii="Times New Roman" w:hAnsi="Times New Roman"/>
-                      <w:bCs/>
-                      <w:color w:val="000000" w:themeColor="text1"/>
-                      <w:sz w:val="24"/>
-                      <w:szCs w:val="24"/>
-                      <w:lang w:val="en-US"/>
-                    </w:rPr>
-                  </w:pPr>
-                  <w:bookmarkStart w:id="43" w:name="OLE_LINK33"/>
-                  <w:bookmarkStart w:id="44" w:name="OLE_LINK34"/>
-                  <w:bookmarkStart w:id="45" w:name="OLE_LINK69"/>
-                  <w:bookmarkStart w:id="46" w:name="OLE_LINK70"/>
+                    <w:spacing w:after="0" w:line="276" w:lineRule="auto"/>
+                    <w:ind w:right="317"/>
+                    <w:textAlignment w:val="baseline"/>
+                    <w:rPr>
+                      <w:rFonts w:ascii="Times New Roman" w:hAnsi="Times New Roman"/>
+                      <w:bCs/>
+                      <w:color w:val="0070C0"/>
+                      <w:sz w:val="24"/>
+                      <w:szCs w:val="24"/>
+                      <w:lang w:val="en-US"/>
+                    </w:rPr>
+                  </w:pPr>
+                  <w:bookmarkStart w:id="43" w:name="OLE_LINK69"/>
+                  <w:bookmarkStart w:id="44" w:name="OLE_LINK70"/>
+                  <w:bookmarkStart w:id="45" w:name="OLE_LINK33"/>
+                  <w:bookmarkStart w:id="46" w:name="OLE_LINK34"/>
                   <w:r>
                     <w:rPr>
                       <w:rFonts w:ascii="Times New Roman" w:hAnsi="Times New Roman"/>
@@ -6569,30 +6311,29 @@
                       <w:lang w:val="en-US"/>
                     </w:rPr>
                     <w:t>].</w:t>
+                  </w:r>
+                  <w:bookmarkEnd w:id="43"/>
+                  <w:bookmarkEnd w:id="44"/>
+                  <w:r>
+                    <w:rPr>
+                      <w:rFonts w:ascii="Times New Roman" w:hAnsi="Times New Roman"/>
+                      <w:bCs/>
+                      <w:color w:val="000000" w:themeColor="text1"/>
+                      <w:sz w:val="24"/>
+                      <w:szCs w:val="24"/>
+                      <w:lang w:val="en-US"/>
+                    </w:rPr>
+                    <w:t>owners}</w:t>
                   </w:r>
                   <w:bookmarkEnd w:id="45"/>
                   <w:bookmarkEnd w:id="46"/>
-                  <w:r>
-                    <w:rPr>
-                      <w:rFonts w:ascii="Times New Roman" w:hAnsi="Times New Roman"/>
-                      <w:bCs/>
-                      <w:color w:val="000000" w:themeColor="text1"/>
-                      <w:sz w:val="24"/>
-                      <w:szCs w:val="24"/>
-                      <w:lang w:val="en-US"/>
-                    </w:rPr>
-                    <w:t>owners}</w:t>
-                  </w:r>
-                  <w:bookmarkEnd w:id="43"/>
-                  <w:bookmarkEnd w:id="44"/>
-                </w:p>
-                <w:p>
-                  <w:pPr>
-                    <w:suppressAutoHyphens/>
-                    <w:autoSpaceDN w:val="0"/>
-                    <w:spacing w:after="0" w:line="360" w:lineRule="auto"/>
-                    <w:ind w:right="317"/>
-                    <w:jc w:val="both"/>
+                </w:p>
+                <w:p>
+                  <w:pPr>
+                    <w:suppressAutoHyphens/>
+                    <w:autoSpaceDN w:val="0"/>
+                    <w:spacing w:after="0" w:line="276" w:lineRule="auto"/>
+                    <w:ind w:right="317"/>
                     <w:textAlignment w:val="baseline"/>
                     <w:rPr>
                       <w:rFonts w:ascii="Times New Roman" w:hAnsi="Times New Roman"/>
@@ -6619,9 +6360,8 @@
                   <w:pPr>
                     <w:suppressAutoHyphens/>
                     <w:autoSpaceDN w:val="0"/>
-                    <w:spacing w:after="0" w:line="360" w:lineRule="auto"/>
-                    <w:ind w:right="317"/>
-                    <w:jc w:val="both"/>
+                    <w:spacing w:after="0" w:line="276" w:lineRule="auto"/>
+                    <w:ind w:right="317"/>
                     <w:textAlignment w:val="baseline"/>
                     <w:rPr>
                       <w:rFonts w:ascii="Times New Roman" w:hAnsi="Times New Roman"/>
@@ -6636,15 +6376,15 @@
               </w:tc>
               <w:tc>
                 <w:tcPr>
-                  <w:tcW w:w="2970" w:type="dxa"/>
+                  <w:tcW w:w="3060" w:type="dxa"/>
+                  <w:gridSpan w:val="2"/>
                 </w:tcPr>
                 <w:p>
                   <w:pPr>
                     <w:suppressAutoHyphens/>
                     <w:autoSpaceDN w:val="0"/>
-                    <w:spacing w:after="0" w:line="360" w:lineRule="auto"/>
-                    <w:ind w:right="317"/>
-                    <w:jc w:val="both"/>
+                    <w:spacing w:after="0" w:line="276" w:lineRule="auto"/>
+                    <w:ind w:right="317"/>
                     <w:textAlignment w:val="baseline"/>
                     <w:rPr>
                       <w:rFonts w:ascii="Times New Roman" w:hAnsi="Times New Roman"/>
@@ -6715,9 +6455,25 @@
                   <w:pPr>
                     <w:suppressAutoHyphens/>
                     <w:autoSpaceDN w:val="0"/>
-                    <w:spacing w:after="0" w:line="360" w:lineRule="auto"/>
-                    <w:ind w:right="317"/>
-                    <w:jc w:val="both"/>
+                    <w:spacing w:after="0" w:line="276" w:lineRule="auto"/>
+                    <w:ind w:right="317"/>
+                    <w:textAlignment w:val="baseline"/>
+                    <w:rPr>
+                      <w:rFonts w:ascii="Times New Roman" w:hAnsi="Times New Roman"/>
+                      <w:bCs/>
+                      <w:color w:val="000000" w:themeColor="text1"/>
+                      <w:sz w:val="24"/>
+                      <w:szCs w:val="24"/>
+                      <w:lang w:val="en-US"/>
+                    </w:rPr>
+                  </w:pPr>
+                </w:p>
+                <w:p>
+                  <w:pPr>
+                    <w:suppressAutoHyphens/>
+                    <w:autoSpaceDN w:val="0"/>
+                    <w:spacing w:after="0" w:line="276" w:lineRule="auto"/>
+                    <w:ind w:right="317"/>
                     <w:textAlignment w:val="baseline"/>
                     <w:rPr>
                       <w:rFonts w:ascii="Times New Roman" w:hAnsi="Times New Roman"/>
@@ -6776,16 +6532,15 @@
               </w:tc>
               <w:tc>
                 <w:tcPr>
-                  <w:tcW w:w="2070" w:type="dxa"/>
+                  <w:tcW w:w="2340" w:type="dxa"/>
                   <w:gridSpan w:val="2"/>
                 </w:tcPr>
                 <w:p>
                   <w:pPr>
                     <w:suppressAutoHyphens/>
                     <w:autoSpaceDN w:val="0"/>
-                    <w:spacing w:after="0" w:line="360" w:lineRule="auto"/>
-                    <w:ind w:right="317"/>
-                    <w:jc w:val="both"/>
+                    <w:spacing w:after="0" w:line="276" w:lineRule="auto"/>
+                    <w:ind w:right="317"/>
                     <w:textAlignment w:val="baseline"/>
                     <w:rPr>
                       <w:rFonts w:ascii="Times New Roman" w:hAnsi="Times New Roman"/>
@@ -6866,16 +6621,25 @@
               </w:tc>
               <w:tc>
                 <w:tcPr>
-                  <w:tcW w:w="2681" w:type="dxa"/>
+                  <w:tcW w:w="2051" w:type="dxa"/>
                 </w:tcPr>
                 <w:p>
                   <w:pPr>
                     <w:suppressAutoHyphens/>
                     <w:autoSpaceDN w:val="0"/>
-                    <w:spacing w:after="0" w:line="360" w:lineRule="auto"/>
-                    <w:ind w:right="317"/>
-                    <w:jc w:val="both"/>
-                    <w:textAlignment w:val="baseline"/>
+                    <w:spacing w:after="0" w:line="276" w:lineRule="auto"/>
+                    <w:ind w:right="317"/>
+                    <w:textAlignment w:val="baseline"/>
+                    <w:rPr>
+                      <w:rFonts w:ascii="Times New Roman" w:hAnsi="Times New Roman"/>
+                      <w:bCs/>
+                      <w:color w:val="000000" w:themeColor="text1"/>
+                      <w:sz w:val="24"/>
+                      <w:szCs w:val="24"/>
+                      <w:lang w:val="en-US"/>
+                    </w:rPr>
+                  </w:pPr>
+                  <w:r>
                     <w:rPr>
                       <w:rFonts w:ascii="Times New Roman" w:hAnsi="Times New Roman"/>
                       <w:b/>
@@ -6885,7 +6649,8 @@
                       <w:szCs w:val="24"/>
                       <w:lang w:val="en-US"/>
                     </w:rPr>
-                  </w:pPr>
+                    <w:t>{</w:t>
+                  </w:r>
                   <w:r>
                     <w:rPr>
                       <w:rFonts w:ascii="Times New Roman" w:hAnsi="Times New Roman"/>
@@ -6896,7 +6661,7 @@
                       <w:szCs w:val="24"/>
                       <w:lang w:val="en-US"/>
                     </w:rPr>
-                    <w:t>{</w:t>
+                    <w:t>d.agendas[i].</w:t>
                   </w:r>
                   <w:r>
                     <w:rPr>
@@ -6908,7 +6673,7 @@
                       <w:szCs w:val="24"/>
                       <w:lang w:val="en-US"/>
                     </w:rPr>
-                    <w:t>d.agendas[i].</w:t>
+                    <w:t>approvedApplications</w:t>
                   </w:r>
                   <w:r>
                     <w:rPr>
@@ -6920,18 +6685,6 @@
                       <w:szCs w:val="24"/>
                       <w:lang w:val="en-US"/>
                     </w:rPr>
-                    <w:t>approvedApplications</w:t>
-                  </w:r>
-                  <w:r>
-                    <w:rPr>
-                      <w:rFonts w:ascii="Times New Roman" w:hAnsi="Times New Roman"/>
-                      <w:b/>
-                      <w:bCs/>
-                      <w:color w:val="000000" w:themeColor="text1"/>
-                      <w:sz w:val="24"/>
-                      <w:szCs w:val="24"/>
-                      <w:lang w:val="en-US"/>
-                    </w:rPr>
                     <w:t>[i].recommendation}</w:t>
                   </w:r>
                 </w:p>
@@ -6939,9 +6692,8 @@
                   <w:pPr>
                     <w:suppressAutoHyphens/>
                     <w:autoSpaceDN w:val="0"/>
-                    <w:spacing w:after="0" w:line="360" w:lineRule="auto"/>
-                    <w:ind w:right="317"/>
-                    <w:jc w:val="both"/>
+                    <w:spacing w:after="0" w:line="276" w:lineRule="auto"/>
+                    <w:ind w:right="317"/>
                     <w:textAlignment w:val="baseline"/>
                     <w:rPr>
                       <w:rFonts w:ascii="Times New Roman" w:hAnsi="Times New Roman"/>
@@ -7003,61 +6755,48 @@
             <w:tr>
               <w:tc>
                 <w:tcPr>
-                  <w:tcW w:w="895" w:type="dxa"/>
+                  <w:tcW w:w="985" w:type="dxa"/>
                 </w:tcPr>
                 <w:p>
                   <w:pPr>
                     <w:suppressAutoHyphens/>
                     <w:autoSpaceDN w:val="0"/>
-                    <w:spacing w:after="0" w:line="360" w:lineRule="auto"/>
-                    <w:ind w:right="317"/>
-                    <w:jc w:val="both"/>
-                    <w:textAlignment w:val="baseline"/>
-                    <w:rPr>
-                      <w:rFonts w:ascii="Times New Roman" w:hAnsi="Times New Roman"/>
-                      <w:bCs/>
-                      <w:color w:val="000000" w:themeColor="text1"/>
-                      <w:sz w:val="24"/>
-                      <w:szCs w:val="24"/>
-                      <w:lang w:val="en-US"/>
-                    </w:rPr>
-                  </w:pPr>
-                  <w:r>
-                    <w:rPr>
-                      <w:rFonts w:ascii="Times New Roman" w:hAnsi="Times New Roman"/>
-                      <w:bCs/>
-                      <w:color w:val="000000" w:themeColor="text1"/>
-                      <w:sz w:val="24"/>
-                      <w:szCs w:val="24"/>
-                      <w:lang w:val="en-US"/>
-                    </w:rPr>
-                    <w:t>{d.agendas[i].ap</w:t>
-                  </w:r>
-                  <w:r>
-                    <w:rPr>
-                      <w:rFonts w:ascii="Times New Roman" w:hAnsi="Times New Roman"/>
-                      <w:bCs/>
-                      <w:color w:val="000000" w:themeColor="text1"/>
-                      <w:sz w:val="24"/>
-                      <w:szCs w:val="24"/>
-                      <w:lang w:val="en-US"/>
-                    </w:rPr>
-                    <w:lastRenderedPageBreak/>
-                    <w:t>provedApplications[i+1]}</w:t>
+                    <w:spacing w:after="0" w:line="276" w:lineRule="auto"/>
+                    <w:ind w:right="317"/>
+                    <w:jc w:val="center"/>
+                    <w:textAlignment w:val="baseline"/>
+                    <w:rPr>
+                      <w:rFonts w:ascii="Times New Roman" w:hAnsi="Times New Roman"/>
+                      <w:bCs/>
+                      <w:color w:val="000000" w:themeColor="text1"/>
+                      <w:sz w:val="24"/>
+                      <w:szCs w:val="24"/>
+                      <w:lang w:val="en-US"/>
+                    </w:rPr>
+                  </w:pPr>
+                  <w:r>
+                    <w:rPr>
+                      <w:rFonts w:ascii="Times New Roman" w:hAnsi="Times New Roman"/>
+                      <w:bCs/>
+                      <w:color w:val="000000" w:themeColor="text1"/>
+                      <w:sz w:val="24"/>
+                      <w:szCs w:val="24"/>
+                      <w:lang w:val="en-US"/>
+                    </w:rPr>
+                    <w:t>{d.agendas[i].approvedApplications[i+1]}</w:t>
                   </w:r>
                 </w:p>
               </w:tc>
               <w:tc>
                 <w:tcPr>
-                  <w:tcW w:w="2700" w:type="dxa"/>
+                  <w:tcW w:w="2880" w:type="dxa"/>
                 </w:tcPr>
                 <w:p>
                   <w:pPr>
                     <w:suppressAutoHyphens/>
                     <w:autoSpaceDN w:val="0"/>
-                    <w:spacing w:after="0" w:line="360" w:lineRule="auto"/>
-                    <w:ind w:right="317"/>
-                    <w:jc w:val="both"/>
+                    <w:spacing w:after="0" w:line="276" w:lineRule="auto"/>
+                    <w:ind w:right="317"/>
                     <w:textAlignment w:val="baseline"/>
                     <w:rPr>
                       <w:rFonts w:ascii="Times New Roman" w:hAnsi="Times New Roman"/>
@@ -7072,15 +6811,15 @@
               </w:tc>
               <w:tc>
                 <w:tcPr>
-                  <w:tcW w:w="2970" w:type="dxa"/>
+                  <w:tcW w:w="3060" w:type="dxa"/>
+                  <w:gridSpan w:val="2"/>
                 </w:tcPr>
                 <w:p>
                   <w:pPr>
                     <w:suppressAutoHyphens/>
                     <w:autoSpaceDN w:val="0"/>
-                    <w:spacing w:after="0" w:line="360" w:lineRule="auto"/>
-                    <w:ind w:right="317"/>
-                    <w:jc w:val="both"/>
+                    <w:spacing w:after="0" w:line="276" w:lineRule="auto"/>
+                    <w:ind w:right="317"/>
                     <w:textAlignment w:val="baseline"/>
                     <w:rPr>
                       <w:rFonts w:ascii="Times New Roman" w:hAnsi="Times New Roman"/>
@@ -7095,16 +6834,15 @@
               </w:tc>
               <w:tc>
                 <w:tcPr>
-                  <w:tcW w:w="2070" w:type="dxa"/>
+                  <w:tcW w:w="2340" w:type="dxa"/>
                   <w:gridSpan w:val="2"/>
                 </w:tcPr>
                 <w:p>
                   <w:pPr>
                     <w:suppressAutoHyphens/>
                     <w:autoSpaceDN w:val="0"/>
-                    <w:spacing w:after="0" w:line="360" w:lineRule="auto"/>
-                    <w:ind w:right="317"/>
-                    <w:jc w:val="both"/>
+                    <w:spacing w:after="0" w:line="276" w:lineRule="auto"/>
+                    <w:ind w:right="317"/>
                     <w:textAlignment w:val="baseline"/>
                     <w:rPr>
                       <w:rFonts w:ascii="Times New Roman" w:hAnsi="Times New Roman"/>
@@ -7119,15 +6857,14 @@
               </w:tc>
               <w:tc>
                 <w:tcPr>
-                  <w:tcW w:w="2681" w:type="dxa"/>
+                  <w:tcW w:w="2051" w:type="dxa"/>
                 </w:tcPr>
                 <w:p>
                   <w:pPr>
                     <w:suppressAutoHyphens/>
                     <w:autoSpaceDN w:val="0"/>
-                    <w:spacing w:after="0" w:line="360" w:lineRule="auto"/>
-                    <w:ind w:right="317"/>
-                    <w:jc w:val="both"/>
+                    <w:spacing w:after="0" w:line="276" w:lineRule="auto"/>
+                    <w:ind w:right="317"/>
                     <w:textAlignment w:val="baseline"/>
                     <w:rPr>
                       <w:rFonts w:ascii="Times New Roman" w:hAnsi="Times New Roman"/>
@@ -7146,14 +6883,14 @@
               <w:tc>
                 <w:tcPr>
                   <w:tcW w:w="11316" w:type="dxa"/>
-                  <w:gridSpan w:val="6"/>
+                  <w:gridSpan w:val="7"/>
                   <w:vAlign w:val="center"/>
                 </w:tcPr>
                 <w:p>
                   <w:pPr>
                     <w:suppressAutoHyphens/>
                     <w:autoSpaceDN w:val="0"/>
-                    <w:spacing w:after="0" w:line="360" w:lineRule="auto"/>
+                    <w:spacing w:after="0" w:line="276" w:lineRule="auto"/>
                     <w:ind w:right="317"/>
                     <w:jc w:val="center"/>
                     <w:textAlignment w:val="baseline"/>
@@ -7177,7 +6914,6 @@
                       <w:szCs w:val="24"/>
                       <w:lang w:val="en-US"/>
                     </w:rPr>
-                    <w:lastRenderedPageBreak/>
                     <w:t>APPROVED</w:t>
                   </w:r>
                   <w:r>
@@ -7221,15 +6957,15 @@
             <w:tr>
               <w:tc>
                 <w:tcPr>
-                  <w:tcW w:w="895" w:type="dxa"/>
+                  <w:tcW w:w="985" w:type="dxa"/>
                 </w:tcPr>
                 <w:p>
                   <w:pPr>
                     <w:suppressAutoHyphens/>
                     <w:autoSpaceDN w:val="0"/>
-                    <w:spacing w:after="0" w:line="360" w:lineRule="auto"/>
-                    <w:ind w:right="317"/>
-                    <w:jc w:val="both"/>
+                    <w:spacing w:after="0" w:line="276" w:lineRule="auto"/>
+                    <w:ind w:right="317"/>
+                    <w:jc w:val="center"/>
                     <w:textAlignment w:val="baseline"/>
                     <w:rPr>
                       <w:rFonts w:ascii="Times New Roman" w:hAnsi="Times New Roman"/>
@@ -7250,29 +6986,7 @@
                       <w:szCs w:val="24"/>
                       <w:lang w:val="en-US"/>
                     </w:rPr>
-                    <w:t>{d.agendas[i].</w:t>
-                  </w:r>
-                  <w:r>
-                    <w:rPr>
-                      <w:rFonts w:ascii="Times New Roman" w:hAnsi="Times New Roman"/>
-                      <w:bCs/>
-                      <w:color w:val="000000" w:themeColor="text1"/>
-                      <w:sz w:val="24"/>
-                      <w:szCs w:val="24"/>
-                      <w:lang w:val="en-US"/>
-                    </w:rPr>
-                    <w:t>deferred</w:t>
-                  </w:r>
-                  <w:r>
-                    <w:rPr>
-                      <w:rFonts w:ascii="Times New Roman" w:hAnsi="Times New Roman"/>
-                      <w:bCs/>
-                      <w:color w:val="000000" w:themeColor="text1"/>
-                      <w:sz w:val="24"/>
-                      <w:szCs w:val="24"/>
-                      <w:lang w:val="en-US"/>
-                    </w:rPr>
-                    <w:t>Applications[i]}{d.agendas[i].</w:t>
+                    <w:t>{d.agendas[i].deferredApplications[i]}{d.agendas[i].</w:t>
                   </w:r>
                   <w:r>
                     <w:rPr>
@@ -7294,18 +7008,19 @@
                       <w:szCs w:val="24"/>
                       <w:lang w:val="en-US"/>
                     </w:rPr>
-                    <w:t>eferred</w:t>
-                  </w:r>
-                  <w:r>
-                    <w:rPr>
-                      <w:rFonts w:ascii="Times New Roman" w:hAnsi="Times New Roman"/>
-                      <w:bCs/>
-                      <w:color w:val="000000" w:themeColor="text1"/>
-                      <w:sz w:val="24"/>
-                      <w:szCs w:val="24"/>
-                      <w:lang w:val="en-US"/>
-                    </w:rPr>
-                    <w:t>Applications[i</w:t>
+                    <w:t>eferre</w:t>
+                  </w:r>
+                  <w:r>
+                    <w:rPr>
+                      <w:rFonts w:ascii="Times New Roman" w:hAnsi="Times New Roman"/>
+                      <w:bCs/>
+                      <w:color w:val="000000" w:themeColor="text1"/>
+                      <w:sz w:val="24"/>
+                      <w:szCs w:val="24"/>
+                      <w:lang w:val="en-US"/>
+                    </w:rPr>
+                    <w:lastRenderedPageBreak/>
+                    <w:t>dApplications[i</w:t>
                   </w:r>
                   <w:r>
                     <w:rPr>
@@ -7322,34 +7037,34 @@
               </w:tc>
               <w:tc>
                 <w:tcPr>
-                  <w:tcW w:w="2700" w:type="dxa"/>
+                  <w:tcW w:w="2880" w:type="dxa"/>
                 </w:tcPr>
                 <w:p>
                   <w:pPr>
                     <w:suppressAutoHyphens/>
                     <w:autoSpaceDN w:val="0"/>
-                    <w:spacing w:after="0" w:line="360" w:lineRule="auto"/>
-                    <w:ind w:right="317"/>
-                    <w:jc w:val="both"/>
-                    <w:textAlignment w:val="baseline"/>
-                    <w:rPr>
-                      <w:rFonts w:ascii="Times New Roman" w:hAnsi="Times New Roman"/>
-                      <w:bCs/>
-                      <w:color w:val="000000" w:themeColor="text1"/>
-                      <w:sz w:val="24"/>
-                      <w:szCs w:val="24"/>
-                      <w:lang w:val="en-US"/>
-                    </w:rPr>
-                  </w:pPr>
-                  <w:r>
-                    <w:rPr>
-                      <w:rFonts w:ascii="Times New Roman" w:hAnsi="Times New Roman"/>
-                      <w:bCs/>
-                      <w:color w:val="000000" w:themeColor="text1"/>
-                      <w:sz w:val="24"/>
-                      <w:szCs w:val="24"/>
-                      <w:lang w:val="en-US"/>
-                    </w:rPr>
+                    <w:spacing w:after="0" w:line="276" w:lineRule="auto"/>
+                    <w:ind w:right="317"/>
+                    <w:textAlignment w:val="baseline"/>
+                    <w:rPr>
+                      <w:rFonts w:ascii="Times New Roman" w:hAnsi="Times New Roman"/>
+                      <w:bCs/>
+                      <w:color w:val="000000" w:themeColor="text1"/>
+                      <w:sz w:val="24"/>
+                      <w:szCs w:val="24"/>
+                      <w:lang w:val="en-US"/>
+                    </w:rPr>
+                  </w:pPr>
+                  <w:r>
+                    <w:rPr>
+                      <w:rFonts w:ascii="Times New Roman" w:hAnsi="Times New Roman"/>
+                      <w:bCs/>
+                      <w:color w:val="000000" w:themeColor="text1"/>
+                      <w:sz w:val="24"/>
+                      <w:szCs w:val="24"/>
+                      <w:lang w:val="en-US"/>
+                    </w:rPr>
+                    <w:lastRenderedPageBreak/>
                     <w:t>{</w:t>
                   </w:r>
                   <w:r>
@@ -7361,29 +7076,7 @@
                       <w:szCs w:val="24"/>
                       <w:lang w:val="en-US"/>
                     </w:rPr>
-                    <w:t>d.agendas[i].</w:t>
-                  </w:r>
-                  <w:r>
-                    <w:rPr>
-                      <w:rFonts w:ascii="Times New Roman" w:hAnsi="Times New Roman"/>
-                      <w:bCs/>
-                      <w:color w:val="000000" w:themeColor="text1"/>
-                      <w:sz w:val="24"/>
-                      <w:szCs w:val="24"/>
-                      <w:lang w:val="en-US"/>
-                    </w:rPr>
-                    <w:t>deferred</w:t>
-                  </w:r>
-                  <w:r>
-                    <w:rPr>
-                      <w:rFonts w:ascii="Times New Roman" w:hAnsi="Times New Roman"/>
-                      <w:bCs/>
-                      <w:color w:val="000000" w:themeColor="text1"/>
-                      <w:sz w:val="24"/>
-                      <w:szCs w:val="24"/>
-                      <w:lang w:val="en-US"/>
-                    </w:rPr>
-                    <w:t>Applications[i</w:t>
+                    <w:t>d.agendas[i].deferredApplications[i</w:t>
                   </w:r>
                   <w:r>
                     <w:rPr>
@@ -7401,9 +7094,8 @@
                   <w:pPr>
                     <w:suppressAutoHyphens/>
                     <w:autoSpaceDN w:val="0"/>
-                    <w:spacing w:after="0" w:line="360" w:lineRule="auto"/>
-                    <w:ind w:right="317"/>
-                    <w:jc w:val="both"/>
+                    <w:spacing w:after="0" w:line="276" w:lineRule="auto"/>
+                    <w:ind w:right="317"/>
                     <w:textAlignment w:val="baseline"/>
                     <w:rPr>
                       <w:rFonts w:ascii="Times New Roman" w:hAnsi="Times New Roman"/>
@@ -7451,16 +7143,14 @@
               </w:tc>
               <w:tc>
                 <w:tcPr>
-                  <w:tcW w:w="3194" w:type="dxa"/>
-                  <w:gridSpan w:val="2"/>
+                  <w:tcW w:w="2924" w:type="dxa"/>
                 </w:tcPr>
                 <w:p>
                   <w:pPr>
                     <w:suppressAutoHyphens/>
                     <w:autoSpaceDN w:val="0"/>
-                    <w:spacing w:after="0" w:line="360" w:lineRule="auto"/>
-                    <w:ind w:right="317"/>
-                    <w:jc w:val="both"/>
+                    <w:spacing w:after="0" w:line="276" w:lineRule="auto"/>
+                    <w:ind w:right="317"/>
                     <w:textAlignment w:val="baseline"/>
                     <w:rPr>
                       <w:rFonts w:ascii="Times New Roman" w:hAnsi="Times New Roman"/>
@@ -7491,29 +7181,7 @@
                       <w:szCs w:val="24"/>
                       <w:lang w:val="en-US"/>
                     </w:rPr>
-                    <w:t>d.agendas[i].</w:t>
-                  </w:r>
-                  <w:r>
-                    <w:rPr>
-                      <w:rFonts w:ascii="Times New Roman" w:hAnsi="Times New Roman"/>
-                      <w:bCs/>
-                      <w:color w:val="000000" w:themeColor="text1"/>
-                      <w:sz w:val="24"/>
-                      <w:szCs w:val="24"/>
-                      <w:lang w:val="en-US"/>
-                    </w:rPr>
-                    <w:t>deferred</w:t>
-                  </w:r>
-                  <w:r>
-                    <w:rPr>
-                      <w:rFonts w:ascii="Times New Roman" w:hAnsi="Times New Roman"/>
-                      <w:bCs/>
-                      <w:color w:val="000000" w:themeColor="text1"/>
-                      <w:sz w:val="24"/>
-                      <w:szCs w:val="24"/>
-                      <w:lang w:val="en-US"/>
-                    </w:rPr>
-                    <w:t>Applications[i</w:t>
+                    <w:t>d.agendas[i].deferredApplications[i</w:t>
                   </w:r>
                   <w:r>
                     <w:rPr>
@@ -7531,9 +7199,25 @@
                   <w:pPr>
                     <w:suppressAutoHyphens/>
                     <w:autoSpaceDN w:val="0"/>
-                    <w:spacing w:after="0" w:line="360" w:lineRule="auto"/>
-                    <w:ind w:right="317"/>
-                    <w:jc w:val="both"/>
+                    <w:spacing w:after="0" w:line="276" w:lineRule="auto"/>
+                    <w:ind w:right="317"/>
+                    <w:textAlignment w:val="baseline"/>
+                    <w:rPr>
+                      <w:rFonts w:ascii="Times New Roman" w:hAnsi="Times New Roman"/>
+                      <w:bCs/>
+                      <w:color w:val="000000" w:themeColor="text1"/>
+                      <w:sz w:val="24"/>
+                      <w:szCs w:val="24"/>
+                      <w:lang w:val="en-US"/>
+                    </w:rPr>
+                  </w:pPr>
+                </w:p>
+                <w:p>
+                  <w:pPr>
+                    <w:suppressAutoHyphens/>
+                    <w:autoSpaceDN w:val="0"/>
+                    <w:spacing w:after="0" w:line="276" w:lineRule="auto"/>
+                    <w:ind w:right="317"/>
                     <w:textAlignment w:val="baseline"/>
                     <w:rPr>
                       <w:rFonts w:ascii="Times New Roman" w:hAnsi="Times New Roman"/>
@@ -7564,29 +7248,7 @@
                       <w:szCs w:val="24"/>
                       <w:lang w:val="en-US"/>
                     </w:rPr>
-                    <w:t>d.agendas[i].</w:t>
-                  </w:r>
-                  <w:r>
-                    <w:rPr>
-                      <w:rFonts w:ascii="Times New Roman" w:hAnsi="Times New Roman"/>
-                      <w:bCs/>
-                      <w:color w:val="000000" w:themeColor="text1"/>
-                      <w:sz w:val="24"/>
-                      <w:szCs w:val="24"/>
-                      <w:lang w:val="en-US"/>
-                    </w:rPr>
-                    <w:t>deferred</w:t>
-                  </w:r>
-                  <w:r>
-                    <w:rPr>
-                      <w:rFonts w:ascii="Times New Roman" w:hAnsi="Times New Roman"/>
-                      <w:bCs/>
-                      <w:color w:val="000000" w:themeColor="text1"/>
-                      <w:sz w:val="24"/>
-                      <w:szCs w:val="24"/>
-                      <w:lang w:val="en-US"/>
-                    </w:rPr>
-                    <w:t>Applications</w:t>
+                    <w:t>d.agendas[i].deferredApplications</w:t>
                   </w:r>
                   <w:r>
                     <w:rPr>
@@ -7604,56 +7266,34 @@
               <w:tc>
                 <w:tcPr>
                   <w:tcW w:w="1846" w:type="dxa"/>
+                  <w:gridSpan w:val="2"/>
                 </w:tcPr>
                 <w:p>
                   <w:pPr>
                     <w:suppressAutoHyphens/>
                     <w:autoSpaceDN w:val="0"/>
-                    <w:spacing w:after="0" w:line="360" w:lineRule="auto"/>
-                    <w:ind w:right="317"/>
-                    <w:jc w:val="both"/>
-                    <w:textAlignment w:val="baseline"/>
-                    <w:rPr>
-                      <w:rFonts w:ascii="Times New Roman" w:hAnsi="Times New Roman"/>
-                      <w:bCs/>
-                      <w:color w:val="000000" w:themeColor="text1"/>
-                      <w:sz w:val="24"/>
-                      <w:szCs w:val="24"/>
-                      <w:lang w:val="en-US"/>
-                    </w:rPr>
-                  </w:pPr>
-                  <w:r>
-                    <w:rPr>
-                      <w:rFonts w:ascii="Times New Roman" w:hAnsi="Times New Roman"/>
-                      <w:bCs/>
-                      <w:color w:val="000000" w:themeColor="text1"/>
-                      <w:sz w:val="24"/>
-                      <w:szCs w:val="24"/>
-                      <w:lang w:val="en-US"/>
-                    </w:rPr>
-                    <w:t>{d.agendas[i].</w:t>
-                  </w:r>
-                  <w:r>
-                    <w:rPr>
-                      <w:rFonts w:ascii="Times New Roman" w:hAnsi="Times New Roman"/>
-                      <w:bCs/>
-                      <w:color w:val="000000" w:themeColor="text1"/>
-                      <w:sz w:val="24"/>
-                      <w:szCs w:val="24"/>
-                      <w:lang w:val="en-US"/>
-                    </w:rPr>
-                    <w:t>deferred</w:t>
-                  </w:r>
-                  <w:r>
-                    <w:rPr>
-                      <w:rFonts w:ascii="Times New Roman" w:hAnsi="Times New Roman"/>
-                      <w:bCs/>
-                      <w:color w:val="000000" w:themeColor="text1"/>
-                      <w:sz w:val="24"/>
-                      <w:szCs w:val="24"/>
-                      <w:lang w:val="en-US"/>
-                    </w:rPr>
-                    <w:t>Applications</w:t>
+                    <w:spacing w:after="0" w:line="276" w:lineRule="auto"/>
+                    <w:ind w:right="317"/>
+                    <w:textAlignment w:val="baseline"/>
+                    <w:rPr>
+                      <w:rFonts w:ascii="Times New Roman" w:hAnsi="Times New Roman"/>
+                      <w:bCs/>
+                      <w:color w:val="000000" w:themeColor="text1"/>
+                      <w:sz w:val="24"/>
+                      <w:szCs w:val="24"/>
+                      <w:lang w:val="en-US"/>
+                    </w:rPr>
+                  </w:pPr>
+                  <w:r>
+                    <w:rPr>
+                      <w:rFonts w:ascii="Times New Roman" w:hAnsi="Times New Roman"/>
+                      <w:bCs/>
+                      <w:color w:val="000000" w:themeColor="text1"/>
+                      <w:sz w:val="24"/>
+                      <w:szCs w:val="24"/>
+                      <w:lang w:val="en-US"/>
+                    </w:rPr>
+                    <w:t>{d.agendas[i].deferredApplications</w:t>
                   </w:r>
                   <w:r>
                     <w:rPr>
@@ -7693,14 +7333,14 @@
               <w:tc>
                 <w:tcPr>
                   <w:tcW w:w="2681" w:type="dxa"/>
+                  <w:gridSpan w:val="2"/>
                 </w:tcPr>
                 <w:p>
                   <w:pPr>
                     <w:suppressAutoHyphens/>
                     <w:autoSpaceDN w:val="0"/>
-                    <w:spacing w:after="0" w:line="360" w:lineRule="auto"/>
-                    <w:ind w:right="317"/>
-                    <w:jc w:val="both"/>
+                    <w:spacing w:after="0" w:line="276" w:lineRule="auto"/>
+                    <w:ind w:right="317"/>
                     <w:textAlignment w:val="baseline"/>
                     <w:rPr>
                       <w:rFonts w:ascii="Times New Roman" w:hAnsi="Times New Roman"/>
@@ -7722,9 +7362,16 @@
                       <w:szCs w:val="24"/>
                       <w:lang w:val="en-US"/>
                     </w:rPr>
-                    <w:t>{d.agendas[i].</w:t>
-                  </w:r>
-                  <w:r>
+                    <w:t>{d.agendas[i].deferredApplications[i].recommendation}</w:t>
+                  </w:r>
+                </w:p>
+                <w:p>
+                  <w:pPr>
+                    <w:suppressAutoHyphens/>
+                    <w:autoSpaceDN w:val="0"/>
+                    <w:spacing w:after="0" w:line="276" w:lineRule="auto"/>
+                    <w:ind w:right="317"/>
+                    <w:textAlignment w:val="baseline"/>
                     <w:rPr>
                       <w:rFonts w:ascii="Times New Roman" w:hAnsi="Times New Roman"/>
                       <w:b/>
@@ -7734,71 +7381,17 @@
                       <w:szCs w:val="24"/>
                       <w:lang w:val="en-US"/>
                     </w:rPr>
-                    <w:t>deferred</w:t>
-                  </w:r>
-                  <w:r>
-                    <w:rPr>
-                      <w:rFonts w:ascii="Times New Roman" w:hAnsi="Times New Roman"/>
-                      <w:b/>
-                      <w:bCs/>
-                      <w:color w:val="000000" w:themeColor="text1"/>
-                      <w:sz w:val="24"/>
-                      <w:szCs w:val="24"/>
-                      <w:lang w:val="en-US"/>
-                    </w:rPr>
-                    <w:t>Applications[i].recommendation}</w:t>
-                  </w:r>
-                </w:p>
-                <w:p>
-                  <w:pPr>
-                    <w:suppressAutoHyphens/>
-                    <w:autoSpaceDN w:val="0"/>
-                    <w:spacing w:after="0" w:line="360" w:lineRule="auto"/>
-                    <w:ind w:right="317"/>
-                    <w:jc w:val="both"/>
-                    <w:textAlignment w:val="baseline"/>
-                    <w:rPr>
-                      <w:rFonts w:ascii="Times New Roman" w:hAnsi="Times New Roman"/>
-                      <w:b/>
-                      <w:bCs/>
-                      <w:color w:val="000000" w:themeColor="text1"/>
-                      <w:sz w:val="24"/>
-                      <w:szCs w:val="24"/>
-                      <w:lang w:val="en-US"/>
-                    </w:rPr>
-                  </w:pPr>
-                  <w:r>
-                    <w:rPr>
-                      <w:rFonts w:ascii="Times New Roman" w:hAnsi="Times New Roman"/>
-                      <w:bCs/>
-                      <w:color w:val="000000" w:themeColor="text1"/>
-                      <w:sz w:val="24"/>
-                      <w:szCs w:val="24"/>
-                      <w:lang w:val="en-US"/>
-                    </w:rPr>
-                    <w:t>{d.agendas[i].</w:t>
-                  </w:r>
-                  <w:r>
-                    <w:rPr>
-                      <w:rFonts w:ascii="Times New Roman" w:hAnsi="Times New Roman"/>
-                      <w:bCs/>
-                      <w:color w:val="000000" w:themeColor="text1"/>
-                      <w:sz w:val="24"/>
-                      <w:szCs w:val="24"/>
-                      <w:lang w:val="en-US"/>
-                    </w:rPr>
-                    <w:t>deferred</w:t>
-                  </w:r>
-                  <w:r>
-                    <w:rPr>
-                      <w:rFonts w:ascii="Times New Roman" w:hAnsi="Times New Roman"/>
-                      <w:bCs/>
-                      <w:color w:val="000000" w:themeColor="text1"/>
-                      <w:sz w:val="24"/>
-                      <w:szCs w:val="24"/>
-                      <w:lang w:val="en-US"/>
-                    </w:rPr>
-                    <w:t>Applications[i].report}</w:t>
+                  </w:pPr>
+                  <w:r>
+                    <w:rPr>
+                      <w:rFonts w:ascii="Times New Roman" w:hAnsi="Times New Roman"/>
+                      <w:bCs/>
+                      <w:color w:val="000000" w:themeColor="text1"/>
+                      <w:sz w:val="24"/>
+                      <w:szCs w:val="24"/>
+                      <w:lang w:val="en-US"/>
+                    </w:rPr>
+                    <w:t>{d.agendas[i].deferredApplications[i].report}</w:t>
                   </w:r>
                 </w:p>
               </w:tc>
@@ -7806,36 +7399,25 @@
             <w:tr>
               <w:tc>
                 <w:tcPr>
-                  <w:tcW w:w="895" w:type="dxa"/>
+                  <w:tcW w:w="985" w:type="dxa"/>
                 </w:tcPr>
                 <w:p>
                   <w:pPr>
                     <w:suppressAutoHyphens/>
                     <w:autoSpaceDN w:val="0"/>
-                    <w:spacing w:after="0" w:line="360" w:lineRule="auto"/>
-                    <w:ind w:right="317"/>
-                    <w:jc w:val="both"/>
-                    <w:textAlignment w:val="baseline"/>
-                    <w:rPr>
-                      <w:rFonts w:ascii="Times New Roman" w:hAnsi="Times New Roman"/>
-                      <w:bCs/>
-                      <w:color w:val="000000" w:themeColor="text1"/>
-                      <w:sz w:val="24"/>
-                      <w:szCs w:val="24"/>
-                      <w:lang w:val="en-US"/>
-                    </w:rPr>
-                  </w:pPr>
-                  <w:r>
-                    <w:rPr>
-                      <w:rFonts w:ascii="Times New Roman" w:hAnsi="Times New Roman"/>
-                      <w:bCs/>
-                      <w:color w:val="000000" w:themeColor="text1"/>
-                      <w:sz w:val="24"/>
-                      <w:szCs w:val="24"/>
-                      <w:lang w:val="en-US"/>
-                    </w:rPr>
-                    <w:t>{d.age</w:t>
-                  </w:r>
+                    <w:spacing w:after="0" w:line="276" w:lineRule="auto"/>
+                    <w:ind w:right="317"/>
+                    <w:jc w:val="center"/>
+                    <w:textAlignment w:val="baseline"/>
+                    <w:rPr>
+                      <w:rFonts w:ascii="Times New Roman" w:hAnsi="Times New Roman"/>
+                      <w:bCs/>
+                      <w:color w:val="000000" w:themeColor="text1"/>
+                      <w:sz w:val="24"/>
+                      <w:szCs w:val="24"/>
+                      <w:lang w:val="en-US"/>
+                    </w:rPr>
+                  </w:pPr>
                   <w:r>
                     <w:rPr>
                       <w:rFonts w:ascii="Times New Roman" w:hAnsi="Times New Roman"/>
@@ -7846,7 +7428,7 @@
                       <w:lang w:val="en-US"/>
                     </w:rPr>
                     <w:lastRenderedPageBreak/>
-                    <w:t>ndas[i].</w:t>
+                    <w:t>{d.agendas[i].</w:t>
                   </w:r>
                   <w:bookmarkStart w:id="50" w:name="OLE_LINK79"/>
                   <w:bookmarkStart w:id="51" w:name="OLE_LINK80"/>
@@ -7859,18 +7441,7 @@
                       <w:szCs w:val="24"/>
                       <w:lang w:val="en-US"/>
                     </w:rPr>
-                    <w:t>deferred</w:t>
-                  </w:r>
-                  <w:r>
-                    <w:rPr>
-                      <w:rFonts w:ascii="Times New Roman" w:hAnsi="Times New Roman"/>
-                      <w:bCs/>
-                      <w:color w:val="000000" w:themeColor="text1"/>
-                      <w:sz w:val="24"/>
-                      <w:szCs w:val="24"/>
-                      <w:lang w:val="en-US"/>
-                    </w:rPr>
-                    <w:t>Applications</w:t>
+                    <w:t>deferredApplications</w:t>
                   </w:r>
                   <w:bookmarkEnd w:id="50"/>
                   <w:bookmarkEnd w:id="51"/>
@@ -7889,15 +7460,14 @@
               </w:tc>
               <w:tc>
                 <w:tcPr>
-                  <w:tcW w:w="2700" w:type="dxa"/>
+                  <w:tcW w:w="2880" w:type="dxa"/>
                 </w:tcPr>
                 <w:p>
                   <w:pPr>
                     <w:suppressAutoHyphens/>
                     <w:autoSpaceDN w:val="0"/>
-                    <w:spacing w:after="0" w:line="360" w:lineRule="auto"/>
-                    <w:ind w:right="317"/>
-                    <w:jc w:val="both"/>
+                    <w:spacing w:after="0" w:line="276" w:lineRule="auto"/>
+                    <w:ind w:right="317"/>
                     <w:textAlignment w:val="baseline"/>
                     <w:rPr>
                       <w:rFonts w:ascii="Times New Roman" w:hAnsi="Times New Roman"/>
@@ -7912,16 +7482,14 @@
               </w:tc>
               <w:tc>
                 <w:tcPr>
-                  <w:tcW w:w="3194" w:type="dxa"/>
-                  <w:gridSpan w:val="2"/>
+                  <w:tcW w:w="2924" w:type="dxa"/>
                 </w:tcPr>
                 <w:p>
                   <w:pPr>
                     <w:suppressAutoHyphens/>
                     <w:autoSpaceDN w:val="0"/>
-                    <w:spacing w:after="0" w:line="360" w:lineRule="auto"/>
-                    <w:ind w:right="317"/>
-                    <w:jc w:val="both"/>
+                    <w:spacing w:after="0" w:line="276" w:lineRule="auto"/>
+                    <w:ind w:right="317"/>
                     <w:textAlignment w:val="baseline"/>
                     <w:rPr>
                       <w:rFonts w:ascii="Times New Roman" w:hAnsi="Times New Roman"/>
@@ -7937,14 +7505,14 @@
               <w:tc>
                 <w:tcPr>
                   <w:tcW w:w="1846" w:type="dxa"/>
+                  <w:gridSpan w:val="2"/>
                 </w:tcPr>
                 <w:p>
                   <w:pPr>
                     <w:suppressAutoHyphens/>
                     <w:autoSpaceDN w:val="0"/>
-                    <w:spacing w:after="0" w:line="360" w:lineRule="auto"/>
-                    <w:ind w:right="317"/>
-                    <w:jc w:val="both"/>
+                    <w:spacing w:after="0" w:line="276" w:lineRule="auto"/>
+                    <w:ind w:right="317"/>
                     <w:textAlignment w:val="baseline"/>
                     <w:rPr>
                       <w:rFonts w:ascii="Times New Roman" w:hAnsi="Times New Roman"/>
@@ -7960,14 +7528,14 @@
               <w:tc>
                 <w:tcPr>
                   <w:tcW w:w="2681" w:type="dxa"/>
+                  <w:gridSpan w:val="2"/>
                 </w:tcPr>
                 <w:p>
                   <w:pPr>
                     <w:suppressAutoHyphens/>
                     <w:autoSpaceDN w:val="0"/>
-                    <w:spacing w:after="0" w:line="360" w:lineRule="auto"/>
-                    <w:ind w:right="317"/>
-                    <w:jc w:val="both"/>
+                    <w:spacing w:after="0" w:line="276" w:lineRule="auto"/>
+                    <w:ind w:right="317"/>
                     <w:textAlignment w:val="baseline"/>
                     <w:rPr>
                       <w:rFonts w:ascii="Times New Roman" w:hAnsi="Times New Roman"/>
@@ -7987,14 +7555,14 @@
               <w:tc>
                 <w:tcPr>
                   <w:tcW w:w="11316" w:type="dxa"/>
-                  <w:gridSpan w:val="6"/>
+                  <w:gridSpan w:val="7"/>
                   <w:vAlign w:val="center"/>
                 </w:tcPr>
                 <w:p>
                   <w:pPr>
                     <w:suppressAutoHyphens/>
                     <w:autoSpaceDN w:val="0"/>
-                    <w:spacing w:after="0" w:line="360" w:lineRule="auto"/>
+                    <w:spacing w:after="0" w:line="276" w:lineRule="auto"/>
                     <w:ind w:right="317"/>
                     <w:jc w:val="center"/>
                     <w:textAlignment w:val="baseline"/>
@@ -8016,7 +7584,6 @@
                       <w:szCs w:val="24"/>
                       <w:lang w:val="en-US"/>
                     </w:rPr>
-                    <w:lastRenderedPageBreak/>
                     <w:t>DEFERRED BUILDING APPLICATIONS(</w:t>
                   </w:r>
                   <w:r>
@@ -8036,136 +7603,78 @@
             <w:tr>
               <w:tc>
                 <w:tcPr>
-                  <w:tcW w:w="895" w:type="dxa"/>
+                  <w:tcW w:w="985" w:type="dxa"/>
                 </w:tcPr>
                 <w:p>
                   <w:pPr>
                     <w:suppressAutoHyphens/>
                     <w:autoSpaceDN w:val="0"/>
-                    <w:spacing w:after="0" w:line="360" w:lineRule="auto"/>
-                    <w:ind w:right="317"/>
-                    <w:jc w:val="both"/>
-                    <w:textAlignment w:val="baseline"/>
-                    <w:rPr>
-                      <w:rFonts w:ascii="Times New Roman" w:hAnsi="Times New Roman"/>
-                      <w:bCs/>
-                      <w:color w:val="000000" w:themeColor="text1"/>
-                      <w:sz w:val="24"/>
-                      <w:szCs w:val="24"/>
-                      <w:lang w:val="en-US"/>
-                    </w:rPr>
-                  </w:pPr>
-                  <w:r>
-                    <w:rPr>
-                      <w:rFonts w:ascii="Times New Roman" w:hAnsi="Times New Roman"/>
-                      <w:bCs/>
-                      <w:color w:val="000000" w:themeColor="text1"/>
-                      <w:sz w:val="24"/>
-                      <w:szCs w:val="24"/>
-                      <w:lang w:val="en-US"/>
-                    </w:rPr>
-                    <w:t>{d.agendas[i].</w:t>
-                  </w:r>
-                  <w:r>
-                    <w:rPr>
-                      <w:rFonts w:ascii="Times New Roman" w:hAnsi="Times New Roman"/>
-                      <w:bCs/>
-                      <w:color w:val="000000" w:themeColor="text1"/>
-                      <w:sz w:val="24"/>
-                      <w:szCs w:val="24"/>
-                      <w:lang w:val="en-US"/>
-                    </w:rPr>
-                    <w:t>rejected</w:t>
-                  </w:r>
-                  <w:r>
-                    <w:rPr>
-                      <w:rFonts w:ascii="Times New Roman" w:hAnsi="Times New Roman"/>
-                      <w:bCs/>
-                      <w:color w:val="000000" w:themeColor="text1"/>
-                      <w:sz w:val="24"/>
-                      <w:szCs w:val="24"/>
-                      <w:lang w:val="en-US"/>
-                    </w:rPr>
-                    <w:t>Applications[i]}{d.agendas[i].</w:t>
-                  </w:r>
-                  <w:r>
-                    <w:rPr>
-                      <w:rFonts w:ascii="Times New Roman" w:hAnsi="Times New Roman"/>
-                      <w:bCs/>
-                      <w:color w:val="000000" w:themeColor="text1"/>
-                      <w:sz w:val="24"/>
-                      <w:szCs w:val="24"/>
-                      <w:lang w:val="en-US"/>
-                    </w:rPr>
-                    <w:t>rejected</w:t>
-                  </w:r>
-                  <w:r>
-                    <w:rPr>
-                      <w:rFonts w:ascii="Times New Roman" w:hAnsi="Times New Roman"/>
-                      <w:bCs/>
-                      <w:color w:val="000000" w:themeColor="text1"/>
-                      <w:sz w:val="24"/>
-                      <w:szCs w:val="24"/>
-                      <w:lang w:val="en-US"/>
-                    </w:rPr>
-                    <w:t>Applications[i</w:t>
-                  </w:r>
-                  <w:r>
-                    <w:rPr>
-                      <w:rFonts w:ascii="Times New Roman" w:hAnsi="Times New Roman"/>
-                      <w:bCs/>
-                      <w:color w:val="000000" w:themeColor="text1"/>
-                      <w:sz w:val="24"/>
-                      <w:szCs w:val="24"/>
-                      <w:lang w:val="en-US"/>
-                    </w:rPr>
-                    <w:t>].sn</w:t>
-                  </w:r>
-                  <w:r>
-                    <w:rPr>
-                      <w:rFonts w:ascii="Times New Roman" w:hAnsi="Times New Roman"/>
-                      <w:bCs/>
-                      <w:color w:val="000000" w:themeColor="text1"/>
-                      <w:sz w:val="24"/>
-                      <w:szCs w:val="24"/>
-                      <w:lang w:val="en-US"/>
-                    </w:rPr>
-                    <w:lastRenderedPageBreak/>
-                    <w:t>}</w:t>
+                    <w:spacing w:after="0" w:line="276" w:lineRule="auto"/>
+                    <w:ind w:right="317"/>
+                    <w:jc w:val="center"/>
+                    <w:textAlignment w:val="baseline"/>
+                    <w:rPr>
+                      <w:rFonts w:ascii="Times New Roman" w:hAnsi="Times New Roman"/>
+                      <w:bCs/>
+                      <w:color w:val="000000" w:themeColor="text1"/>
+                      <w:sz w:val="24"/>
+                      <w:szCs w:val="24"/>
+                      <w:lang w:val="en-US"/>
+                    </w:rPr>
+                  </w:pPr>
+                  <w:r>
+                    <w:rPr>
+                      <w:rFonts w:ascii="Times New Roman" w:hAnsi="Times New Roman"/>
+                      <w:bCs/>
+                      <w:color w:val="000000" w:themeColor="text1"/>
+                      <w:sz w:val="24"/>
+                      <w:szCs w:val="24"/>
+                      <w:lang w:val="en-US"/>
+                    </w:rPr>
+                    <w:t>{d.agendas[i].rejectedApplications[i]}{d.agendas[i].rejectedApplications[i</w:t>
+                  </w:r>
+                  <w:r>
+                    <w:rPr>
+                      <w:rFonts w:ascii="Times New Roman" w:hAnsi="Times New Roman"/>
+                      <w:bCs/>
+                      <w:color w:val="000000" w:themeColor="text1"/>
+                      <w:sz w:val="24"/>
+                      <w:szCs w:val="24"/>
+                      <w:lang w:val="en-US"/>
+                    </w:rPr>
+                    <w:t>].sn}</w:t>
                   </w:r>
                 </w:p>
               </w:tc>
               <w:tc>
                 <w:tcPr>
-                  <w:tcW w:w="2700" w:type="dxa"/>
+                  <w:tcW w:w="2880" w:type="dxa"/>
                 </w:tcPr>
                 <w:p>
                   <w:pPr>
                     <w:suppressAutoHyphens/>
                     <w:autoSpaceDN w:val="0"/>
-                    <w:spacing w:after="0" w:line="360" w:lineRule="auto"/>
-                    <w:ind w:right="317"/>
-                    <w:jc w:val="both"/>
-                    <w:textAlignment w:val="baseline"/>
-                    <w:rPr>
-                      <w:rFonts w:ascii="Times New Roman" w:hAnsi="Times New Roman"/>
-                      <w:bCs/>
-                      <w:color w:val="000000" w:themeColor="text1"/>
-                      <w:sz w:val="24"/>
-                      <w:szCs w:val="24"/>
-                      <w:lang w:val="en-US"/>
-                    </w:rPr>
-                  </w:pPr>
-                  <w:r>
-                    <w:rPr>
-                      <w:rFonts w:ascii="Times New Roman" w:hAnsi="Times New Roman"/>
-                      <w:bCs/>
-                      <w:color w:val="000000" w:themeColor="text1"/>
-                      <w:sz w:val="24"/>
-                      <w:szCs w:val="24"/>
-                      <w:lang w:val="en-US"/>
-                    </w:rPr>
-                    <w:lastRenderedPageBreak/>
+                    <w:spacing w:after="0" w:line="276" w:lineRule="auto"/>
+                    <w:ind w:right="317"/>
+                    <w:textAlignment w:val="baseline"/>
+                    <w:rPr>
+                      <w:rFonts w:ascii="Times New Roman" w:hAnsi="Times New Roman"/>
+                      <w:bCs/>
+                      <w:color w:val="000000" w:themeColor="text1"/>
+                      <w:sz w:val="24"/>
+                      <w:szCs w:val="24"/>
+                      <w:lang w:val="en-US"/>
+                    </w:rPr>
+                  </w:pPr>
+                  <w:r>
+                    <w:rPr>
+                      <w:rFonts w:ascii="Times New Roman" w:hAnsi="Times New Roman"/>
+                      <w:bCs/>
+                      <w:color w:val="000000" w:themeColor="text1"/>
+                      <w:sz w:val="24"/>
+                      <w:szCs w:val="24"/>
+                      <w:lang w:val="en-US"/>
+                    </w:rPr>
                     <w:t>{</w:t>
                   </w:r>
                   <w:r>
@@ -8217,9 +7726,8 @@
                   <w:pPr>
                     <w:suppressAutoHyphens/>
                     <w:autoSpaceDN w:val="0"/>
-                    <w:spacing w:after="0" w:line="360" w:lineRule="auto"/>
-                    <w:ind w:right="317"/>
-                    <w:jc w:val="both"/>
+                    <w:spacing w:after="0" w:line="276" w:lineRule="auto"/>
+                    <w:ind w:right="317"/>
                     <w:textAlignment w:val="baseline"/>
                     <w:rPr>
                       <w:rFonts w:ascii="Times New Roman" w:hAnsi="Times New Roman"/>
@@ -8267,16 +7775,14 @@
               </w:tc>
               <w:tc>
                 <w:tcPr>
-                  <w:tcW w:w="3194" w:type="dxa"/>
-                  <w:gridSpan w:val="2"/>
+                  <w:tcW w:w="2924" w:type="dxa"/>
                 </w:tcPr>
                 <w:p>
                   <w:pPr>
                     <w:suppressAutoHyphens/>
                     <w:autoSpaceDN w:val="0"/>
-                    <w:spacing w:after="0" w:line="360" w:lineRule="auto"/>
-                    <w:ind w:right="317"/>
-                    <w:jc w:val="both"/>
+                    <w:spacing w:after="0" w:line="276" w:lineRule="auto"/>
+                    <w:ind w:right="317"/>
                     <w:textAlignment w:val="baseline"/>
                     <w:rPr>
                       <w:rFonts w:ascii="Times New Roman" w:hAnsi="Times New Roman"/>
@@ -8307,29 +7813,7 @@
                       <w:szCs w:val="24"/>
                       <w:lang w:val="en-US"/>
                     </w:rPr>
-                    <w:t>d.agendas[i].</w:t>
-                  </w:r>
-                  <w:r>
-                    <w:rPr>
-                      <w:rFonts w:ascii="Times New Roman" w:hAnsi="Times New Roman"/>
-                      <w:bCs/>
-                      <w:color w:val="000000" w:themeColor="text1"/>
-                      <w:sz w:val="24"/>
-                      <w:szCs w:val="24"/>
-                      <w:lang w:val="en-US"/>
-                    </w:rPr>
-                    <w:t>rejected</w:t>
-                  </w:r>
-                  <w:r>
-                    <w:rPr>
-                      <w:rFonts w:ascii="Times New Roman" w:hAnsi="Times New Roman"/>
-                      <w:bCs/>
-                      <w:color w:val="000000" w:themeColor="text1"/>
-                      <w:sz w:val="24"/>
-                      <w:szCs w:val="24"/>
-                      <w:lang w:val="en-US"/>
-                    </w:rPr>
-                    <w:t>Applications[i</w:t>
+                    <w:t>d.agendas[i].rejectedApplications[i</w:t>
                   </w:r>
                   <w:r>
                     <w:rPr>
@@ -8347,9 +7831,25 @@
                   <w:pPr>
                     <w:suppressAutoHyphens/>
                     <w:autoSpaceDN w:val="0"/>
-                    <w:spacing w:after="0" w:line="360" w:lineRule="auto"/>
-                    <w:ind w:right="317"/>
-                    <w:jc w:val="both"/>
+                    <w:spacing w:after="0" w:line="276" w:lineRule="auto"/>
+                    <w:ind w:right="317"/>
+                    <w:textAlignment w:val="baseline"/>
+                    <w:rPr>
+                      <w:rFonts w:ascii="Times New Roman" w:hAnsi="Times New Roman"/>
+                      <w:bCs/>
+                      <w:color w:val="000000" w:themeColor="text1"/>
+                      <w:sz w:val="24"/>
+                      <w:szCs w:val="24"/>
+                      <w:lang w:val="en-US"/>
+                    </w:rPr>
+                  </w:pPr>
+                </w:p>
+                <w:p>
+                  <w:pPr>
+                    <w:suppressAutoHyphens/>
+                    <w:autoSpaceDN w:val="0"/>
+                    <w:spacing w:after="0" w:line="276" w:lineRule="auto"/>
+                    <w:ind w:right="317"/>
                     <w:textAlignment w:val="baseline"/>
                     <w:rPr>
                       <w:rFonts w:ascii="Times New Roman" w:hAnsi="Times New Roman"/>
@@ -8380,29 +7880,7 @@
                       <w:szCs w:val="24"/>
                       <w:lang w:val="en-US"/>
                     </w:rPr>
-                    <w:t>d.agendas[i].</w:t>
-                  </w:r>
-                  <w:r>
-                    <w:rPr>
-                      <w:rFonts w:ascii="Times New Roman" w:hAnsi="Times New Roman"/>
-                      <w:bCs/>
-                      <w:color w:val="000000" w:themeColor="text1"/>
-                      <w:sz w:val="24"/>
-                      <w:szCs w:val="24"/>
-                      <w:lang w:val="en-US"/>
-                    </w:rPr>
-                    <w:t>rejected</w:t>
-                  </w:r>
-                  <w:r>
-                    <w:rPr>
-                      <w:rFonts w:ascii="Times New Roman" w:hAnsi="Times New Roman"/>
-                      <w:bCs/>
-                      <w:color w:val="000000" w:themeColor="text1"/>
-                      <w:sz w:val="24"/>
-                      <w:szCs w:val="24"/>
-                      <w:lang w:val="en-US"/>
-                    </w:rPr>
-                    <w:t>Applications</w:t>
+                    <w:t>d.agendas[i].rejectedApplications</w:t>
                   </w:r>
                   <w:r>
                     <w:rPr>
@@ -8420,56 +7898,34 @@
               <w:tc>
                 <w:tcPr>
                   <w:tcW w:w="1846" w:type="dxa"/>
+                  <w:gridSpan w:val="2"/>
                 </w:tcPr>
                 <w:p>
                   <w:pPr>
                     <w:suppressAutoHyphens/>
                     <w:autoSpaceDN w:val="0"/>
-                    <w:spacing w:after="0" w:line="360" w:lineRule="auto"/>
-                    <w:ind w:right="317"/>
-                    <w:jc w:val="both"/>
-                    <w:textAlignment w:val="baseline"/>
-                    <w:rPr>
-                      <w:rFonts w:ascii="Times New Roman" w:hAnsi="Times New Roman"/>
-                      <w:bCs/>
-                      <w:color w:val="000000" w:themeColor="text1"/>
-                      <w:sz w:val="24"/>
-                      <w:szCs w:val="24"/>
-                      <w:lang w:val="en-US"/>
-                    </w:rPr>
-                  </w:pPr>
-                  <w:r>
-                    <w:rPr>
-                      <w:rFonts w:ascii="Times New Roman" w:hAnsi="Times New Roman"/>
-                      <w:bCs/>
-                      <w:color w:val="000000" w:themeColor="text1"/>
-                      <w:sz w:val="24"/>
-                      <w:szCs w:val="24"/>
-                      <w:lang w:val="en-US"/>
-                    </w:rPr>
-                    <w:t>{d.agendas[i].</w:t>
-                  </w:r>
-                  <w:r>
-                    <w:rPr>
-                      <w:rFonts w:ascii="Times New Roman" w:hAnsi="Times New Roman"/>
-                      <w:bCs/>
-                      <w:color w:val="000000" w:themeColor="text1"/>
-                      <w:sz w:val="24"/>
-                      <w:szCs w:val="24"/>
-                      <w:lang w:val="en-US"/>
-                    </w:rPr>
-                    <w:t>rejected</w:t>
-                  </w:r>
-                  <w:r>
-                    <w:rPr>
-                      <w:rFonts w:ascii="Times New Roman" w:hAnsi="Times New Roman"/>
-                      <w:bCs/>
-                      <w:color w:val="000000" w:themeColor="text1"/>
-                      <w:sz w:val="24"/>
-                      <w:szCs w:val="24"/>
-                      <w:lang w:val="en-US"/>
-                    </w:rPr>
-                    <w:t>Applications</w:t>
+                    <w:spacing w:after="0" w:line="276" w:lineRule="auto"/>
+                    <w:ind w:right="317"/>
+                    <w:textAlignment w:val="baseline"/>
+                    <w:rPr>
+                      <w:rFonts w:ascii="Times New Roman" w:hAnsi="Times New Roman"/>
+                      <w:bCs/>
+                      <w:color w:val="000000" w:themeColor="text1"/>
+                      <w:sz w:val="24"/>
+                      <w:szCs w:val="24"/>
+                      <w:lang w:val="en-US"/>
+                    </w:rPr>
+                  </w:pPr>
+                  <w:r>
+                    <w:rPr>
+                      <w:rFonts w:ascii="Times New Roman" w:hAnsi="Times New Roman"/>
+                      <w:bCs/>
+                      <w:color w:val="000000" w:themeColor="text1"/>
+                      <w:sz w:val="24"/>
+                      <w:szCs w:val="24"/>
+                      <w:lang w:val="en-US"/>
+                    </w:rPr>
+                    <w:t>{d.agendas[i].rejectedApplications</w:t>
                   </w:r>
                   <w:r>
                     <w:rPr>
@@ -8509,14 +7965,14 @@
               <w:tc>
                 <w:tcPr>
                   <w:tcW w:w="2681" w:type="dxa"/>
+                  <w:gridSpan w:val="2"/>
                 </w:tcPr>
                 <w:p>
                   <w:pPr>
                     <w:suppressAutoHyphens/>
                     <w:autoSpaceDN w:val="0"/>
-                    <w:spacing w:after="0" w:line="360" w:lineRule="auto"/>
-                    <w:ind w:right="317"/>
-                    <w:jc w:val="both"/>
+                    <w:spacing w:after="0" w:line="276" w:lineRule="auto"/>
+                    <w:ind w:right="317"/>
                     <w:textAlignment w:val="baseline"/>
                     <w:rPr>
                       <w:rFonts w:ascii="Times New Roman" w:hAnsi="Times New Roman"/>
@@ -8538,9 +7994,16 @@
                       <w:szCs w:val="24"/>
                       <w:lang w:val="en-US"/>
                     </w:rPr>
-                    <w:t>{d.agendas[i].</w:t>
-                  </w:r>
-                  <w:r>
+                    <w:t>{d.agendas[i].rejectedApplications[i].recommendation}</w:t>
+                  </w:r>
+                </w:p>
+                <w:p>
+                  <w:pPr>
+                    <w:suppressAutoHyphens/>
+                    <w:autoSpaceDN w:val="0"/>
+                    <w:spacing w:after="0" w:line="276" w:lineRule="auto"/>
+                    <w:ind w:right="317"/>
+                    <w:textAlignment w:val="baseline"/>
                     <w:rPr>
                       <w:rFonts w:ascii="Times New Roman" w:hAnsi="Times New Roman"/>
                       <w:b/>
@@ -8550,71 +8013,17 @@
                       <w:szCs w:val="24"/>
                       <w:lang w:val="en-US"/>
                     </w:rPr>
-                    <w:t>rejected</w:t>
-                  </w:r>
-                  <w:r>
-                    <w:rPr>
-                      <w:rFonts w:ascii="Times New Roman" w:hAnsi="Times New Roman"/>
-                      <w:b/>
-                      <w:bCs/>
-                      <w:color w:val="000000" w:themeColor="text1"/>
-                      <w:sz w:val="24"/>
-                      <w:szCs w:val="24"/>
-                      <w:lang w:val="en-US"/>
-                    </w:rPr>
-                    <w:t>Applications[i].recommendation}</w:t>
-                  </w:r>
-                </w:p>
-                <w:p>
-                  <w:pPr>
-                    <w:suppressAutoHyphens/>
-                    <w:autoSpaceDN w:val="0"/>
-                    <w:spacing w:after="0" w:line="360" w:lineRule="auto"/>
-                    <w:ind w:right="317"/>
-                    <w:jc w:val="both"/>
-                    <w:textAlignment w:val="baseline"/>
-                    <w:rPr>
-                      <w:rFonts w:ascii="Times New Roman" w:hAnsi="Times New Roman"/>
-                      <w:b/>
-                      <w:bCs/>
-                      <w:color w:val="000000" w:themeColor="text1"/>
-                      <w:sz w:val="24"/>
-                      <w:szCs w:val="24"/>
-                      <w:lang w:val="en-US"/>
-                    </w:rPr>
-                  </w:pPr>
-                  <w:r>
-                    <w:rPr>
-                      <w:rFonts w:ascii="Times New Roman" w:hAnsi="Times New Roman"/>
-                      <w:bCs/>
-                      <w:color w:val="000000" w:themeColor="text1"/>
-                      <w:sz w:val="24"/>
-                      <w:szCs w:val="24"/>
-                      <w:lang w:val="en-US"/>
-                    </w:rPr>
-                    <w:t>{d.agendas[i].</w:t>
-                  </w:r>
-                  <w:r>
-                    <w:rPr>
-                      <w:rFonts w:ascii="Times New Roman" w:hAnsi="Times New Roman"/>
-                      <w:bCs/>
-                      <w:color w:val="000000" w:themeColor="text1"/>
-                      <w:sz w:val="24"/>
-                      <w:szCs w:val="24"/>
-                      <w:lang w:val="en-US"/>
-                    </w:rPr>
-                    <w:t>rejected</w:t>
-                  </w:r>
-                  <w:r>
-                    <w:rPr>
-                      <w:rFonts w:ascii="Times New Roman" w:hAnsi="Times New Roman"/>
-                      <w:bCs/>
-                      <w:color w:val="000000" w:themeColor="text1"/>
-                      <w:sz w:val="24"/>
-                      <w:szCs w:val="24"/>
-                      <w:lang w:val="en-US"/>
-                    </w:rPr>
-                    <w:t>Applications[i].report}</w:t>
+                  </w:pPr>
+                  <w:r>
+                    <w:rPr>
+                      <w:rFonts w:ascii="Times New Roman" w:hAnsi="Times New Roman"/>
+                      <w:bCs/>
+                      <w:color w:val="000000" w:themeColor="text1"/>
+                      <w:sz w:val="24"/>
+                      <w:szCs w:val="24"/>
+                      <w:lang w:val="en-US"/>
+                    </w:rPr>
+                    <w:t>{d.agendas[i].rejectedApplications[i].report}</w:t>
                   </w:r>
                 </w:p>
               </w:tc>
@@ -8622,25 +8031,36 @@
             <w:tr>
               <w:tc>
                 <w:tcPr>
-                  <w:tcW w:w="895" w:type="dxa"/>
+                  <w:tcW w:w="985" w:type="dxa"/>
                 </w:tcPr>
                 <w:p>
                   <w:pPr>
                     <w:suppressAutoHyphens/>
                     <w:autoSpaceDN w:val="0"/>
-                    <w:spacing w:after="0" w:line="360" w:lineRule="auto"/>
-                    <w:ind w:right="317"/>
-                    <w:jc w:val="both"/>
-                    <w:textAlignment w:val="baseline"/>
-                    <w:rPr>
-                      <w:rFonts w:ascii="Times New Roman" w:hAnsi="Times New Roman"/>
-                      <w:bCs/>
-                      <w:color w:val="000000" w:themeColor="text1"/>
-                      <w:sz w:val="24"/>
-                      <w:szCs w:val="24"/>
-                      <w:lang w:val="en-US"/>
-                    </w:rPr>
-                  </w:pPr>
+                    <w:spacing w:after="0" w:line="276" w:lineRule="auto"/>
+                    <w:ind w:right="317"/>
+                    <w:jc w:val="center"/>
+                    <w:textAlignment w:val="baseline"/>
+                    <w:rPr>
+                      <w:rFonts w:ascii="Times New Roman" w:hAnsi="Times New Roman"/>
+                      <w:bCs/>
+                      <w:color w:val="000000" w:themeColor="text1"/>
+                      <w:sz w:val="24"/>
+                      <w:szCs w:val="24"/>
+                      <w:lang w:val="en-US"/>
+                    </w:rPr>
+                  </w:pPr>
+                  <w:r>
+                    <w:rPr>
+                      <w:rFonts w:ascii="Times New Roman" w:hAnsi="Times New Roman"/>
+                      <w:bCs/>
+                      <w:color w:val="000000" w:themeColor="text1"/>
+                      <w:sz w:val="24"/>
+                      <w:szCs w:val="24"/>
+                      <w:lang w:val="en-US"/>
+                    </w:rPr>
+                    <w:t>{d.agendas[i].rejectedApplications[i+1]</w:t>
+                  </w:r>
                   <w:r>
                     <w:rPr>
                       <w:rFonts w:ascii="Times New Roman" w:hAnsi="Times New Roman"/>
@@ -8651,43 +8071,20 @@
                       <w:lang w:val="en-US"/>
                     </w:rPr>
                     <w:lastRenderedPageBreak/>
-                    <w:t>{d.agendas[i].</w:t>
-                  </w:r>
-                  <w:r>
-                    <w:rPr>
-                      <w:rFonts w:ascii="Times New Roman" w:hAnsi="Times New Roman"/>
-                      <w:bCs/>
-                      <w:color w:val="000000" w:themeColor="text1"/>
-                      <w:sz w:val="24"/>
-                      <w:szCs w:val="24"/>
-                      <w:lang w:val="en-US"/>
-                    </w:rPr>
-                    <w:t>rejected</w:t>
-                  </w:r>
-                  <w:r>
-                    <w:rPr>
-                      <w:rFonts w:ascii="Times New Roman" w:hAnsi="Times New Roman"/>
-                      <w:bCs/>
-                      <w:color w:val="000000" w:themeColor="text1"/>
-                      <w:sz w:val="24"/>
-                      <w:szCs w:val="24"/>
-                      <w:lang w:val="en-US"/>
-                    </w:rPr>
-                    <w:t>Applications[i+1]}</w:t>
+                    <w:t>}</w:t>
                   </w:r>
                 </w:p>
               </w:tc>
               <w:tc>
                 <w:tcPr>
-                  <w:tcW w:w="2700" w:type="dxa"/>
+                  <w:tcW w:w="2880" w:type="dxa"/>
                 </w:tcPr>
                 <w:p>
                   <w:pPr>
                     <w:suppressAutoHyphens/>
                     <w:autoSpaceDN w:val="0"/>
-                    <w:spacing w:after="0" w:line="360" w:lineRule="auto"/>
-                    <w:ind w:right="317"/>
-                    <w:jc w:val="both"/>
+                    <w:spacing w:after="0" w:line="276" w:lineRule="auto"/>
+                    <w:ind w:right="317"/>
                     <w:textAlignment w:val="baseline"/>
                     <w:rPr>
                       <w:rFonts w:ascii="Times New Roman" w:hAnsi="Times New Roman"/>
@@ -8702,16 +8099,14 @@
               </w:tc>
               <w:tc>
                 <w:tcPr>
-                  <w:tcW w:w="3194" w:type="dxa"/>
-                  <w:gridSpan w:val="2"/>
+                  <w:tcW w:w="2924" w:type="dxa"/>
                 </w:tcPr>
                 <w:p>
                   <w:pPr>
                     <w:suppressAutoHyphens/>
                     <w:autoSpaceDN w:val="0"/>
-                    <w:spacing w:after="0" w:line="360" w:lineRule="auto"/>
-                    <w:ind w:right="317"/>
-                    <w:jc w:val="both"/>
+                    <w:spacing w:after="0" w:line="276" w:lineRule="auto"/>
+                    <w:ind w:right="317"/>
                     <w:textAlignment w:val="baseline"/>
                     <w:rPr>
                       <w:rFonts w:ascii="Times New Roman" w:hAnsi="Times New Roman"/>
@@ -8727,14 +8122,14 @@
               <w:tc>
                 <w:tcPr>
                   <w:tcW w:w="1846" w:type="dxa"/>
+                  <w:gridSpan w:val="2"/>
                 </w:tcPr>
                 <w:p>
                   <w:pPr>
                     <w:suppressAutoHyphens/>
                     <w:autoSpaceDN w:val="0"/>
-                    <w:spacing w:after="0" w:line="360" w:lineRule="auto"/>
-                    <w:ind w:right="317"/>
-                    <w:jc w:val="both"/>
+                    <w:spacing w:after="0" w:line="276" w:lineRule="auto"/>
+                    <w:ind w:right="317"/>
                     <w:textAlignment w:val="baseline"/>
                     <w:rPr>
                       <w:rFonts w:ascii="Times New Roman" w:hAnsi="Times New Roman"/>
@@ -8750,14 +8145,14 @@
               <w:tc>
                 <w:tcPr>
                   <w:tcW w:w="2681" w:type="dxa"/>
+                  <w:gridSpan w:val="2"/>
                 </w:tcPr>
                 <w:p>
                   <w:pPr>
                     <w:suppressAutoHyphens/>
                     <w:autoSpaceDN w:val="0"/>
-                    <w:spacing w:after="0" w:line="360" w:lineRule="auto"/>
-                    <w:ind w:right="317"/>
-                    <w:jc w:val="both"/>
+                    <w:spacing w:after="0" w:line="276" w:lineRule="auto"/>
+                    <w:ind w:right="317"/>
                     <w:textAlignment w:val="baseline"/>
                     <w:rPr>
                       <w:rFonts w:ascii="Times New Roman" w:hAnsi="Times New Roman"/>
@@ -8776,14 +8171,14 @@
               <w:tc>
                 <w:tcPr>
                   <w:tcW w:w="11316" w:type="dxa"/>
-                  <w:gridSpan w:val="6"/>
+                  <w:gridSpan w:val="7"/>
                   <w:vAlign w:val="center"/>
                 </w:tcPr>
                 <w:p>
                   <w:pPr>
                     <w:suppressAutoHyphens/>
                     <w:autoSpaceDN w:val="0"/>
-                    <w:spacing w:after="0" w:line="360" w:lineRule="auto"/>
+                    <w:spacing w:after="0" w:line="276" w:lineRule="auto"/>
                     <w:ind w:right="317"/>
                     <w:jc w:val="center"/>
                     <w:textAlignment w:val="baseline"/>
@@ -8805,6 +8200,7 @@
                       <w:szCs w:val="24"/>
                       <w:lang w:val="en-US"/>
                     </w:rPr>
+                    <w:lastRenderedPageBreak/>
                     <w:t>REJECTED BUILDING APPLICATIONS(</w:t>
                   </w:r>
                   <w:r>
@@ -8837,7 +8233,7 @@
             <w:pPr>
               <w:suppressAutoHyphens/>
               <w:autoSpaceDN w:val="0"/>
-              <w:spacing w:after="0" w:line="360" w:lineRule="auto"/>
+              <w:spacing w:after="0" w:line="276" w:lineRule="auto"/>
               <w:ind w:right="317"/>
               <w:textAlignment w:val="baseline"/>
               <w:rPr>
@@ -8850,10 +8246,10 @@
                 <w:lang w:val="en-US"/>
               </w:rPr>
             </w:pPr>
-            <w:bookmarkStart w:id="52" w:name="OLE_LINK47"/>
-            <w:bookmarkStart w:id="53" w:name="OLE_LINK48"/>
-            <w:bookmarkStart w:id="54" w:name="OLE_LINK91"/>
-            <w:bookmarkStart w:id="55" w:name="OLE_LINK92"/>
+            <w:bookmarkStart w:id="52" w:name="OLE_LINK91"/>
+            <w:bookmarkStart w:id="53" w:name="OLE_LINK92"/>
+            <w:bookmarkStart w:id="54" w:name="OLE_LINK47"/>
+            <w:bookmarkStart w:id="55" w:name="OLE_LINK48"/>
             <w:r>
               <w:rPr>
                 <w:rFonts w:ascii="Times New Roman" w:hAnsi="Times New Roman"/>
@@ -8890,8 +8286,8 @@
               </w:rPr>
               <w:t xml:space="preserve"> </w:t>
             </w:r>
-            <w:bookmarkEnd w:id="54"/>
-            <w:bookmarkEnd w:id="55"/>
+            <w:bookmarkEnd w:id="52"/>
+            <w:bookmarkEnd w:id="53"/>
             <w:r>
               <w:rPr>
                 <w:rFonts w:ascii="Times New Roman" w:hAnsi="Times New Roman"/>
@@ -8947,8 +8343,8 @@
               </w:rPr>
               <w:t>:</w:t>
             </w:r>
-            <w:bookmarkEnd w:id="52"/>
-            <w:bookmarkEnd w:id="53"/>
+            <w:bookmarkEnd w:id="54"/>
+            <w:bookmarkEnd w:id="55"/>
             <w:r>
               <w:rPr>
                 <w:rFonts w:ascii="Times New Roman" w:hAnsi="Times New Roman"/>
@@ -8984,9 +8380,8 @@
             <w:pPr>
               <w:suppressAutoHyphens/>
               <w:autoSpaceDN w:val="0"/>
-              <w:spacing w:after="0" w:line="360" w:lineRule="auto"/>
+              <w:spacing w:after="0" w:line="276" w:lineRule="auto"/>
               <w:ind w:right="317"/>
-              <w:jc w:val="both"/>
               <w:textAlignment w:val="baseline"/>
               <w:rPr>
                 <w:rFonts w:ascii="Times New Roman" w:eastAsia="SimSun" w:hAnsi="Times New Roman"/>
@@ -9067,7 +8462,7 @@
             <w:pPr>
               <w:suppressAutoHyphens/>
               <w:autoSpaceDN w:val="0"/>
-              <w:spacing w:after="0" w:line="360" w:lineRule="auto"/>
+              <w:spacing w:after="0" w:line="276" w:lineRule="auto"/>
               <w:ind w:right="317"/>
               <w:jc w:val="both"/>
               <w:textAlignment w:val="baseline"/>
@@ -9091,7 +8486,7 @@
             <w:pPr>
               <w:suppressAutoHyphens/>
               <w:autoSpaceDN w:val="0"/>
-              <w:spacing w:after="0" w:line="360" w:lineRule="auto"/>
+              <w:spacing w:after="0" w:line="276" w:lineRule="auto"/>
               <w:ind w:right="317"/>
               <w:jc w:val="both"/>
               <w:textAlignment w:val="baseline"/>
@@ -9307,6 +8702,7 @@
       <w:pPr>
         <w:rPr>
           <w:sz w:val="16"/>
+          <w:lang w:val="en-US"/>
         </w:rPr>
       </w:pPr>
     </w:p>
@@ -9356,29 +8752,109 @@
 <w:ftr xmlns:ve="http://schemas.openxmlformats.org/markup-compatibility/2006" xmlns:o="urn:schemas-microsoft-com:office:office" xmlns:r="http://schemas.openxmlformats.org/officeDocument/2006/relationships" xmlns:m="http://schemas.openxmlformats.org/officeDocument/2006/math" xmlns:v="urn:schemas-microsoft-com:vml" xmlns:wp="http://schemas.openxmlformats.org/drawingml/2006/wordprocessingDrawing" xmlns:w10="urn:schemas-microsoft-com:office:word" xmlns:w="http://schemas.openxmlformats.org/wordprocessingml/2006/main" xmlns:wne="http://schemas.microsoft.com/office/word/2006/wordml">
   <w:sdt>
     <w:sdtPr>
-      <w:id w:val="12074599"/>
+      <w:id w:val="4096232"/>
       <w:docPartObj>
         <w:docPartGallery w:val="Page Numbers (Bottom of Page)"/>
         <w:docPartUnique/>
       </w:docPartObj>
     </w:sdtPr>
     <w:sdtContent>
-      <w:p>
-        <w:pPr>
-          <w:pStyle w:val="Footer"/>
-        </w:pPr>
-        <w:r>
-          <w:t xml:space="preserve">Page | </w:t>
-        </w:r>
-        <w:fldSimple w:instr=" PAGE   \* MERGEFORMAT ">
-          <w:r>
-            <w:rPr>
-              <w:noProof/>
-            </w:rPr>
-            <w:t>1</w:t>
-          </w:r>
-        </w:fldSimple>
-      </w:p>
+      <w:sdt>
+        <w:sdtPr>
+          <w:id w:val="98381352"/>
+          <w:docPartObj>
+            <w:docPartGallery w:val="Page Numbers (Top of Page)"/>
+            <w:docPartUnique/>
+          </w:docPartObj>
+        </w:sdtPr>
+        <w:sdtContent>
+          <w:p>
+            <w:pPr>
+              <w:pStyle w:val="Footer"/>
+            </w:pPr>
+            <w:r>
+              <w:t xml:space="preserve">Page </w:t>
+            </w:r>
+            <w:r>
+              <w:rPr>
+                <w:b/>
+                <w:sz w:val="24"/>
+                <w:szCs w:val="24"/>
+              </w:rPr>
+              <w:fldChar w:fldCharType="begin"/>
+            </w:r>
+            <w:r>
+              <w:rPr>
+                <w:b/>
+              </w:rPr>
+              <w:instrText xml:space="preserve"> PAGE </w:instrText>
+            </w:r>
+            <w:r>
+              <w:rPr>
+                <w:b/>
+                <w:sz w:val="24"/>
+                <w:szCs w:val="24"/>
+              </w:rPr>
+              <w:fldChar w:fldCharType="separate"/>
+            </w:r>
+            <w:r>
+              <w:rPr>
+                <w:b/>
+                <w:noProof/>
+              </w:rPr>
+              <w:t>3</w:t>
+            </w:r>
+            <w:r>
+              <w:rPr>
+                <w:b/>
+                <w:sz w:val="24"/>
+                <w:szCs w:val="24"/>
+              </w:rPr>
+              <w:fldChar w:fldCharType="end"/>
+            </w:r>
+            <w:r>
+              <w:t xml:space="preserve"> of </w:t>
+            </w:r>
+            <w:r>
+              <w:rPr>
+                <w:b/>
+                <w:sz w:val="24"/>
+                <w:szCs w:val="24"/>
+              </w:rPr>
+              <w:fldChar w:fldCharType="begin"/>
+            </w:r>
+            <w:r>
+              <w:rPr>
+                <w:b/>
+              </w:rPr>
+              <w:instrText xml:space="preserve"> NUMPAGES  </w:instrText>
+            </w:r>
+            <w:r>
+              <w:rPr>
+                <w:b/>
+                <w:sz w:val="24"/>
+                <w:szCs w:val="24"/>
+              </w:rPr>
+              <w:fldChar w:fldCharType="separate"/>
+            </w:r>
+            <w:r>
+              <w:rPr>
+                <w:b/>
+                <w:noProof/>
+              </w:rPr>
+              <w:t>6</w:t>
+            </w:r>
+            <w:r>
+              <w:rPr>
+                <w:b/>
+                <w:sz w:val="24"/>
+                <w:szCs w:val="24"/>
+              </w:rPr>
+              <w:fldChar w:fldCharType="end"/>
+            </w:r>
+          </w:p>
+        </w:sdtContent>
+      </w:sdt>
     </w:sdtContent>
   </w:sdt>
   <w:p>
@@ -9976,6 +9452,7 @@
   <w:style w:type="character" w:default="1" w:styleId="DefaultParagraphFont">
     <w:name w:val="Default Paragraph Font"/>
     <w:uiPriority w:val="1"/>
+    <w:semiHidden/>
     <w:unhideWhenUsed/>
   </w:style>
   <w:style w:type="table" w:default="1" w:styleId="TableNormal">

</xml_diff>